<commit_message>
Add my information and task1
</commit_message>
<xml_diff>
--- a/Introduction to DB-Course Project v3.docx
+++ b/Introduction to DB-Course Project v3.docx
@@ -1,6 +1,6 @@
 
 <file path=word/document.xml><?xml version="1.0" encoding="utf-8"?>
-<w:document xmlns:wpc="http://schemas.microsoft.com/office/word/2010/wordprocessingCanvas" xmlns:cx="http://schemas.microsoft.com/office/drawing/2014/chartex" xmlns:cx1="http://schemas.microsoft.com/office/drawing/2015/9/8/chartex" xmlns:cx2="http://schemas.microsoft.com/office/drawing/2015/10/21/chartex" xmlns:cx3="http://schemas.microsoft.com/office/drawing/2016/5/9/chartex" xmlns:cx4="http://schemas.microsoft.com/office/drawing/2016/5/10/chartex" xmlns:cx5="http://schemas.microsoft.com/office/drawing/2016/5/11/chartex" xmlns:cx6="http://schemas.microsoft.com/office/drawing/2016/5/12/chartex" xmlns:cx7="http://schemas.microsoft.com/office/drawing/2016/5/13/chartex" xmlns:cx8="http://schemas.microsoft.com/office/drawing/2016/5/14/chartex" xmlns:mc="http://schemas.openxmlformats.org/markup-compatibility/2006" xmlns:aink="http://schemas.microsoft.com/office/drawing/2016/ink" xmlns:am3d="http://schemas.microsoft.com/office/drawing/2017/model3d" xmlns:o="urn:schemas-microsoft-com:office:office" xmlns:oel="http://schemas.microsoft.com/office/2019/extlst" xmlns:r="http://schemas.openxmlformats.org/officeDocument/2006/relationships" xmlns:m="http://schemas.openxmlformats.org/officeDocument/2006/math" xmlns:v="urn:schemas-microsoft-com:vml" xmlns:wp14="http://schemas.microsoft.com/office/word/2010/wordprocessingDrawing" xmlns:wp="http://schemas.openxmlformats.org/drawingml/2006/wordprocessingDrawing" xmlns:w10="urn:schemas-microsoft-com:office:word" xmlns:w="http://schemas.openxmlformats.org/wordprocessingml/2006/main" xmlns:w14="http://schemas.microsoft.com/office/word/2010/wordml" xmlns:w15="http://schemas.microsoft.com/office/word/2012/wordml" xmlns:w16cei="http://schemas.microsoft.com/office/word/2026/wordml/cei" xmlns:w16cex="http://schemas.microsoft.com/office/word/2018/wordml/cex" xmlns:w16cid="http://schemas.microsoft.com/office/word/2016/wordml/cid" xmlns:w16="http://schemas.microsoft.com/office/word/2018/wordml" xmlns:w16du="http://schemas.microsoft.com/office/word/2023/wordml/word16du" xmlns:w16sdtdh="http://schemas.microsoft.com/office/word/2020/wordml/sdtdatahash" xmlns:w16sdtfl="http://schemas.microsoft.com/office/word/2024/wordml/sdtformatlock" xmlns:w16se="http://schemas.microsoft.com/office/word/2015/wordml/symex" xmlns:wpg="http://schemas.microsoft.com/office/word/2010/wordprocessingGroup" xmlns:wpi="http://schemas.microsoft.com/office/word/2010/wordprocessingInk" xmlns:wne="http://schemas.microsoft.com/office/word/2006/wordml" xmlns:wps="http://schemas.microsoft.com/office/word/2010/wordprocessingShape" mc:Ignorable="w14 w15 w16se w16cid w16 w16cex w16sdtdh w16sdtfl w16du wp14">
+<w:document xmlns:wpc="http://schemas.microsoft.com/office/word/2010/wordprocessingCanvas" xmlns:cx="http://schemas.microsoft.com/office/drawing/2014/chartex" xmlns:cx1="http://schemas.microsoft.com/office/drawing/2015/9/8/chartex" xmlns:cx2="http://schemas.microsoft.com/office/drawing/2015/10/21/chartex" xmlns:cx3="http://schemas.microsoft.com/office/drawing/2016/5/9/chartex" xmlns:cx4="http://schemas.microsoft.com/office/drawing/2016/5/10/chartex" xmlns:cx5="http://schemas.microsoft.com/office/drawing/2016/5/11/chartex" xmlns:cx6="http://schemas.microsoft.com/office/drawing/2016/5/12/chartex" xmlns:cx7="http://schemas.microsoft.com/office/drawing/2016/5/13/chartex" xmlns:cx8="http://schemas.microsoft.com/office/drawing/2016/5/14/chartex" xmlns:mc="http://schemas.openxmlformats.org/markup-compatibility/2006" xmlns:m="http://schemas.openxmlformats.org/officeDocument/2006/math" xmlns:aink="http://schemas.microsoft.com/office/drawing/2016/ink" xmlns:am3d="http://schemas.microsoft.com/office/drawing/2017/model3d" xmlns:oel="http://schemas.microsoft.com/office/2019/extlst" xmlns:r="http://schemas.openxmlformats.org/officeDocument/2006/relationships" xmlns:wp14="http://schemas.microsoft.com/office/word/2010/wordprocessingDrawing" xmlns:wp="http://schemas.openxmlformats.org/drawingml/2006/wordprocessingDrawing" xmlns:wpg="http://schemas.microsoft.com/office/word/2010/wordprocessingGroup" xmlns:wpi="http://schemas.microsoft.com/office/word/2010/wordprocessingInk" xmlns:wps="http://schemas.microsoft.com/office/word/2010/wordprocessingShape" xmlns:o="urn:schemas-microsoft-com:office:office" xmlns:v="urn:schemas-microsoft-com:vml" xmlns:w10="urn:schemas-microsoft-com:office:word" xmlns:w="http://schemas.openxmlformats.org/wordprocessingml/2006/main" xmlns:w14="http://schemas.microsoft.com/office/word/2010/wordml" xmlns:w15="http://schemas.microsoft.com/office/word/2012/wordml" xmlns:w16cex="http://schemas.microsoft.com/office/word/2018/wordml/cex" xmlns:w16cid="http://schemas.microsoft.com/office/word/2016/wordml/cid" xmlns:w16="http://schemas.microsoft.com/office/word/2018/wordml" xmlns:w16sdtdh="http://schemas.microsoft.com/office/word/2020/wordml/sdtdatahash" xmlns:w16sdtfl="http://schemas.microsoft.com/office/word/2024/wordml/sdtformatlock" xmlns:w16se="http://schemas.microsoft.com/office/word/2015/wordml/symex" xmlns:w16du="http://schemas.microsoft.com/office/word/2023/wordml/word16du" xmlns:wne="http://schemas.microsoft.com/office/word/2006/wordml" mc:Ignorable="w14 w15 w16se w16cid w16 w16cex w16sdtdh w16sdtfl w16du wp14">
   <w:body>
     <w:p>
       <w:pPr>
@@ -80,6 +80,7 @@
                               <w:dataBinding w:prefixMappings="xmlns:ns0='http://purl.org/dc/elements/1.1/' xmlns:ns1='http://schemas.openxmlformats.org/package/2006/metadata/core-properties' " w:xpath="/ns1:coreProperties[1]/ns0:title[1]" w:storeItemID="{6C3C8BC8-F283-45AE-878A-BAB7291924A1}"/>
                               <w:text/>
                             </w:sdtPr>
+                            <w:sdtEndPr/>
                             <w:sdtContent>
                               <w:p>
                                 <w:pPr>
@@ -137,6 +138,7 @@
                                 <w:dataBinding w:prefixMappings="xmlns:ns0='http://purl.org/dc/elements/1.1/' xmlns:ns1='http://schemas.openxmlformats.org/package/2006/metadata/core-properties' " w:xpath="/ns1:coreProperties[1]/ns0:subject[1]" w:storeItemID="{6C3C8BC8-F283-45AE-878A-BAB7291924A1}"/>
                                 <w:text/>
                               </w:sdtPr>
+                              <w:sdtEndPr/>
                               <w:sdtContent>
                                 <w:r>
                                   <w:rPr>
@@ -379,6 +381,7 @@
                               <w:dataBinding w:prefixMappings="xmlns:ns0='http://schemas.microsoft.com/office/2006/coverPageProps'" w:xpath="/ns0:CoverPageProperties[1]/ns0:Abstract[1]" w:storeItemID="{55AF091B-3C7A-41E3-B477-F2FDAA23CFDA}"/>
                               <w:text/>
                             </w:sdtPr>
+                            <w:sdtEndPr/>
                             <w:sdtContent>
                               <w:p>
                                 <w:pPr>
@@ -453,7 +456,7 @@
                 <v:stroke joinstyle="miter"/>
                 <v:path gradientshapeok="t" o:connecttype="rect"/>
               </v:shapetype>
-              <v:shape id="Text Box 14" o:spid="_x0000_s1026" type="#_x0000_t202" alt="Report title" style="position:absolute;margin-left:36pt;margin-top:85.4pt;width:540pt;height:148.1pt;z-index:-251641856;visibility:visible;mso-wrap-style:square;mso-width-percent:0;mso-height-percent:0;mso-wrap-distance-left:9pt;mso-wrap-distance-top:0;mso-wrap-distance-right:9pt;mso-wrap-distance-bottom:0;mso-position-horizontal:absolute;mso-position-horizontal-relative:page;mso-position-vertical:absolute;mso-position-vertical-relative:margin;mso-width-percent:0;mso-height-percent:0;mso-width-relative:margin;mso-height-relative:margin;v-text-anchor:bottom" o:gfxdata="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" o:allowoverlap="f" filled="f" stroked="f">
+              <v:shape id="Text Box 14" o:spid="_x0000_s1026" type="#_x0000_t202" alt="Report title" style="position:absolute;margin-left:36pt;margin-top:85.4pt;width:540pt;height:148.1pt;z-index:-251641856;visibility:visible;mso-wrap-style:square;mso-width-percent:0;mso-height-percent:0;mso-wrap-distance-left:9pt;mso-wrap-distance-top:0;mso-wrap-distance-right:9pt;mso-wrap-distance-bottom:0;mso-position-horizontal:absolute;mso-position-horizontal-relative:page;mso-position-vertical:absolute;mso-position-vertical-relative:margin;mso-width-percent:0;mso-height-percent:0;mso-width-relative:margin;mso-height-relative:margin;v-text-anchor:bottom" o:gfxdata="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" o:allowoverlap="f" filled="f" stroked="f">
                 <v:textbox inset="0,0,0,0">
                   <w:txbxContent>
                     <w:sdt>
@@ -471,6 +474,7 @@
                         <w:dataBinding w:prefixMappings="xmlns:ns0='http://purl.org/dc/elements/1.1/' xmlns:ns1='http://schemas.openxmlformats.org/package/2006/metadata/core-properties' " w:xpath="/ns1:coreProperties[1]/ns0:title[1]" w:storeItemID="{6C3C8BC8-F283-45AE-878A-BAB7291924A1}"/>
                         <w:text/>
                       </w:sdtPr>
+                      <w:sdtEndPr/>
                       <w:sdtContent>
                         <w:p>
                           <w:pPr>
@@ -528,6 +532,7 @@
                           <w:dataBinding w:prefixMappings="xmlns:ns0='http://purl.org/dc/elements/1.1/' xmlns:ns1='http://schemas.openxmlformats.org/package/2006/metadata/core-properties' " w:xpath="/ns1:coreProperties[1]/ns0:subject[1]" w:storeItemID="{6C3C8BC8-F283-45AE-878A-BAB7291924A1}"/>
                           <w:text/>
                         </w:sdtPr>
+                        <w:sdtEndPr/>
                         <w:sdtContent>
                           <w:r>
                             <w:rPr>
@@ -770,6 +775,7 @@
                         <w:dataBinding w:prefixMappings="xmlns:ns0='http://schemas.microsoft.com/office/2006/coverPageProps'" w:xpath="/ns0:CoverPageProperties[1]/ns0:Abstract[1]" w:storeItemID="{55AF091B-3C7A-41E3-B477-F2FDAA23CFDA}"/>
                         <w:text/>
                       </w:sdtPr>
+                      <w:sdtEndPr/>
                       <w:sdtContent>
                         <w:p>
                           <w:pPr>
@@ -987,7 +993,7 @@
           </mc:Choice>
           <mc:Fallback>
             <w:pict>
-              <v:shape w14:anchorId="6466823C" id="Text Box 2" o:spid="_x0000_s1027" type="#_x0000_t202" style="position:absolute;margin-left:40.3pt;margin-top:.05pt;width:545.45pt;height:87.55pt;z-index:251679744;visibility:visible;mso-wrap-style:square;mso-width-percent:0;mso-height-percent:0;mso-wrap-distance-left:9pt;mso-wrap-distance-top:7.2pt;mso-wrap-distance-right:9pt;mso-wrap-distance-bottom:7.2pt;mso-position-horizontal:absolute;mso-position-horizontal-relative:page;mso-position-vertical:absolute;mso-position-vertical-relative:text;mso-width-percent:0;mso-height-percent:0;mso-width-relative:margin;mso-height-relative:margin;v-text-anchor:top" o:gfxdata="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" filled="f" stroked="f">
+              <v:shape w14:anchorId="6466823C" id="Text Box 2" o:spid="_x0000_s1027" type="#_x0000_t202" style="position:absolute;margin-left:40.3pt;margin-top:.05pt;width:545.45pt;height:87.55pt;z-index:251679744;visibility:visible;mso-wrap-style:square;mso-width-percent:0;mso-height-percent:0;mso-wrap-distance-left:9pt;mso-wrap-distance-top:7.2pt;mso-wrap-distance-right:9pt;mso-wrap-distance-bottom:7.2pt;mso-position-horizontal:absolute;mso-position-horizontal-relative:page;mso-position-vertical:absolute;mso-position-vertical-relative:text;mso-width-percent:0;mso-height-percent:0;mso-width-relative:margin;mso-height-relative:margin;v-text-anchor:top" o:gfxdata="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" filled="f" stroked="f">
                 <v:textbox>
                   <w:txbxContent>
                     <w:p>
@@ -1104,6 +1110,7 @@
           <w:docPartUnique/>
         </w:docPartObj>
       </w:sdtPr>
+      <w:sdtEndPr/>
       <w:sdtContent>
         <w:p>
           <w:pPr>
@@ -1699,8 +1706,8 @@
               </mc:Choice>
               <mc:Fallback>
                 <w:pict>
-                  <v:group w14:anchorId="31857F9A" id="Group 198" o:spid="_x0000_s1028" style="position:absolute;margin-left:-105.75pt;margin-top:341.4pt;width:518.25pt;height:318.6pt;z-index:251677696;mso-wrap-distance-left:14.4pt;mso-wrap-distance-top:3.6pt;mso-wrap-distance-right:14.4pt;mso-wrap-distance-bottom:3.6pt;mso-position-horizontal-relative:margin;mso-position-vertical-relative:margin;mso-width-relative:margin;mso-height-relative:margin" coordorigin=",228" coordsize="35784,22576" o:gfxdata="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">
-                    <v:rect id="Rectangle 199" o:spid="_x0000_s1029" style="position:absolute;top:228;width:35674;height:2448;visibility:visible;mso-wrap-style:square;v-text-anchor:middle" o:gfxdata="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" fillcolor="#ef4623 [3204]" stroked="f" strokeweight="2pt">
+                  <v:group w14:anchorId="31857F9A" id="Group 198" o:spid="_x0000_s1028" style="position:absolute;margin-left:-105.75pt;margin-top:341.4pt;width:518.25pt;height:318.6pt;z-index:251677696;mso-wrap-distance-left:14.4pt;mso-wrap-distance-top:3.6pt;mso-wrap-distance-right:14.4pt;mso-wrap-distance-bottom:3.6pt;mso-position-horizontal-relative:margin;mso-position-vertical-relative:margin;mso-width-relative:margin;mso-height-relative:margin" coordorigin=",228" coordsize="35784,22576" o:gfxdata="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">
+                    <v:rect id="Rectangle 199" o:spid="_x0000_s1029" style="position:absolute;top:228;width:35674;height:2448;visibility:visible;mso-wrap-style:square;v-text-anchor:middle" o:gfxdata="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" fillcolor="#ef4623 [3204]" stroked="f" strokeweight="2pt">
                       <v:textbox>
                         <w:txbxContent>
                           <w:p>
@@ -1729,7 +1736,7 @@
                         </w:txbxContent>
                       </v:textbox>
                     </v:rect>
-                    <v:shape id="Text Box 200" o:spid="_x0000_s1030" type="#_x0000_t202" style="position:absolute;top:2896;width:35784;height:19908;visibility:visible;mso-wrap-style:square;v-text-anchor:top" o:gfxdata="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" filled="f" stroked="f" strokeweight=".5pt">
+                    <v:shape id="Text Box 200" o:spid="_x0000_s1030" type="#_x0000_t202" style="position:absolute;top:2896;width:35784;height:19908;visibility:visible;mso-wrap-style:square;v-text-anchor:top" o:gfxdata="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" filled="f" stroked="f" strokeweight=".5pt">
                       <v:textbox inset=",7.2pt,,0">
                         <w:txbxContent>
                           <w:p>
@@ -2176,7 +2183,7 @@
             <mc:AlternateContent>
               <mc:Choice Requires="wps">
                 <w:drawing>
-                  <wp:anchor distT="0" distB="0" distL="114300" distR="114300" simplePos="0" relativeHeight="251675648" behindDoc="0" locked="0" layoutInCell="1" allowOverlap="0" wp14:anchorId="7CBAAF0B" wp14:editId="7EB80533">
+                  <wp:anchor distT="0" distB="0" distL="114300" distR="114300" simplePos="0" relativeHeight="251675648" behindDoc="0" locked="0" layoutInCell="1" allowOverlap="0" wp14:anchorId="7CBAAF0B" wp14:editId="1D15D515">
                     <wp:simplePos x="0" y="0"/>
                     <wp:positionH relativeFrom="page">
                       <wp:posOffset>457200</wp:posOffset>
@@ -2185,7 +2192,7 @@
                       <wp:posOffset>2905125</wp:posOffset>
                     </wp:positionV>
                     <wp:extent cx="6858000" cy="1266825"/>
-                    <wp:effectExtent l="0" t="0" r="0" b="9525"/>
+                    <wp:effectExtent l="0" t="0" r="0" b="3175"/>
                     <wp:wrapSquare wrapText="bothSides"/>
                     <wp:docPr id="15" name="Text Box 15" descr="contact info"/>
                     <wp:cNvGraphicFramePr/>
@@ -2235,6 +2242,7 @@
                                     <w:dataBinding w:prefixMappings="xmlns:ns0='http://schemas.openxmlformats.org/officeDocument/2006/extended-properties' " w:xpath="/ns0:Properties[1]/ns0:Company[1]" w:storeItemID="{6668398D-A668-4E3E-A5EB-62B293D839F1}"/>
                                     <w:text/>
                                   </w:sdtPr>
+                                  <w:sdtEndPr/>
                                   <w:sdtContent>
                                     <w:r>
                                       <w:t>Student Details:                                            CRN:</w:t>
@@ -2256,9 +2264,9 @@
                                   <w:tblLook w:val="04A0" w:firstRow="1" w:lastRow="0" w:firstColumn="1" w:lastColumn="0" w:noHBand="0" w:noVBand="1"/>
                                 </w:tblPr>
                                 <w:tblGrid>
-                                  <w:gridCol w:w="5760"/>
-                                  <w:gridCol w:w="1433"/>
-                                  <w:gridCol w:w="3597"/>
+                                  <w:gridCol w:w="5752"/>
+                                  <w:gridCol w:w="1431"/>
+                                  <w:gridCol w:w="3592"/>
                                 </w:tblGrid>
                                 <w:tr>
                                   <w:trPr>
@@ -2324,6 +2332,7 @@
                                         </w:rPr>
                                         <w:t xml:space="preserve"> </w:t>
                                       </w:r>
+                                      <w:proofErr w:type="spellStart"/>
                                       <w:r>
                                         <w:rPr>
                                           <w:b/>
@@ -2331,8 +2340,29 @@
                                           <w:sz w:val="28"/>
                                           <w:szCs w:val="28"/>
                                         </w:rPr>
-                                        <w:t>Ghadi Alotaibi</w:t>
+                                        <w:t>Ghadi</w:t>
                                       </w:r>
+                                      <w:proofErr w:type="spellEnd"/>
+                                      <w:r>
+                                        <w:rPr>
+                                          <w:b/>
+                                          <w:bCs/>
+                                          <w:sz w:val="28"/>
+                                          <w:szCs w:val="28"/>
+                                        </w:rPr>
+                                        <w:t xml:space="preserve"> </w:t>
+                                      </w:r>
+                                      <w:proofErr w:type="spellStart"/>
+                                      <w:r>
+                                        <w:rPr>
+                                          <w:b/>
+                                          <w:bCs/>
+                                          <w:sz w:val="28"/>
+                                          <w:szCs w:val="28"/>
+                                        </w:rPr>
+                                        <w:t>Alotaibi</w:t>
+                                      </w:r>
+                                      <w:proofErr w:type="spellEnd"/>
                                     </w:p>
                                     <w:p>
                                       <w:pPr>
@@ -2342,6 +2372,7 @@
                                           <w:bCs/>
                                           <w:sz w:val="28"/>
                                           <w:szCs w:val="28"/>
+                                          <w:lang w:val="en-GB"/>
                                         </w:rPr>
                                       </w:pPr>
                                       <w:r>
@@ -2352,6 +2383,16 @@
                                           <w:szCs w:val="28"/>
                                         </w:rPr>
                                         <w:t xml:space="preserve">Name: </w:t>
+                                      </w:r>
+                                      <w:r>
+                                        <w:rPr>
+                                          <w:b/>
+                                          <w:bCs/>
+                                          <w:sz w:val="28"/>
+                                          <w:szCs w:val="28"/>
+                                          <w:lang w:val="en-GB"/>
+                                        </w:rPr>
+                                        <w:t xml:space="preserve">Bushra Alshayeb </w:t>
                                       </w:r>
                                     </w:p>
                                     <w:p>
@@ -2507,6 +2548,15 @@
                                         </w:rPr>
                                         <w:t xml:space="preserve"> </w:t>
                                       </w:r>
+                                      <w:r>
+                                        <w:rPr>
+                                          <w:b/>
+                                          <w:bCs/>
+                                          <w:sz w:val="28"/>
+                                          <w:szCs w:val="28"/>
+                                        </w:rPr>
+                                        <w:t>S240057076</w:t>
+                                      </w:r>
                                     </w:p>
                                     <w:p>
                                       <w:pPr>
@@ -2636,7 +2686,7 @@
               </mc:Choice>
               <mc:Fallback>
                 <w:pict>
-                  <v:shape w14:anchorId="7CBAAF0B" id="Text Box 15" o:spid="_x0000_s1031" type="#_x0000_t202" alt="contact info" style="position:absolute;margin-left:36pt;margin-top:228.75pt;width:540pt;height:99.75pt;z-index:251675648;visibility:visible;mso-wrap-style:square;mso-width-percent:1282;mso-height-percent:0;mso-wrap-distance-left:9pt;mso-wrap-distance-top:0;mso-wrap-distance-right:9pt;mso-wrap-distance-bottom:0;mso-position-horizontal:absolute;mso-position-horizontal-relative:page;mso-position-vertical:absolute;mso-position-vertical-relative:margin;mso-width-percent:1282;mso-height-percent:0;mso-width-relative:margin;mso-height-relative:margin;v-text-anchor:bottom" o:gfxdata="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" o:allowoverlap="f" filled="f" stroked="f" strokeweight=".5pt">
+                  <v:shape w14:anchorId="7CBAAF0B" id="Text Box 15" o:spid="_x0000_s1031" type="#_x0000_t202" alt="contact info" style="position:absolute;margin-left:36pt;margin-top:228.75pt;width:540pt;height:99.75pt;z-index:251675648;visibility:visible;mso-wrap-style:square;mso-width-percent:1282;mso-height-percent:0;mso-wrap-distance-left:9pt;mso-wrap-distance-top:0;mso-wrap-distance-right:9pt;mso-wrap-distance-bottom:0;mso-position-horizontal:absolute;mso-position-horizontal-relative:page;mso-position-vertical:absolute;mso-position-vertical-relative:margin;mso-width-percent:1282;mso-height-percent:0;mso-width-relative:margin;mso-height-relative:margin;v-text-anchor:bottom" o:gfxdata="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" o:allowoverlap="f" filled="f" stroked="f" strokeweight=".5pt">
                     <v:textbox inset="0,0,0,0">
                       <w:txbxContent>
                         <w:p>
@@ -2651,6 +2701,7 @@
                               <w:dataBinding w:prefixMappings="xmlns:ns0='http://schemas.openxmlformats.org/officeDocument/2006/extended-properties' " w:xpath="/ns0:Properties[1]/ns0:Company[1]" w:storeItemID="{6668398D-A668-4E3E-A5EB-62B293D839F1}"/>
                               <w:text/>
                             </w:sdtPr>
+                            <w:sdtEndPr/>
                             <w:sdtContent>
                               <w:r>
                                 <w:t>Student Details:                                            CRN:</w:t>
@@ -2672,9 +2723,9 @@
                             <w:tblLook w:val="04A0" w:firstRow="1" w:lastRow="0" w:firstColumn="1" w:lastColumn="0" w:noHBand="0" w:noVBand="1"/>
                           </w:tblPr>
                           <w:tblGrid>
-                            <w:gridCol w:w="5760"/>
-                            <w:gridCol w:w="1433"/>
-                            <w:gridCol w:w="3597"/>
+                            <w:gridCol w:w="5752"/>
+                            <w:gridCol w:w="1431"/>
+                            <w:gridCol w:w="3592"/>
                           </w:tblGrid>
                           <w:tr>
                             <w:trPr>
@@ -2740,6 +2791,7 @@
                                   </w:rPr>
                                   <w:t xml:space="preserve"> </w:t>
                                 </w:r>
+                                <w:proofErr w:type="spellStart"/>
                                 <w:r>
                                   <w:rPr>
                                     <w:b/>
@@ -2747,8 +2799,29 @@
                                     <w:sz w:val="28"/>
                                     <w:szCs w:val="28"/>
                                   </w:rPr>
-                                  <w:t>Ghadi Alotaibi</w:t>
+                                  <w:t>Ghadi</w:t>
                                 </w:r>
+                                <w:proofErr w:type="spellEnd"/>
+                                <w:r>
+                                  <w:rPr>
+                                    <w:b/>
+                                    <w:bCs/>
+                                    <w:sz w:val="28"/>
+                                    <w:szCs w:val="28"/>
+                                  </w:rPr>
+                                  <w:t xml:space="preserve"> </w:t>
+                                </w:r>
+                                <w:proofErr w:type="spellStart"/>
+                                <w:r>
+                                  <w:rPr>
+                                    <w:b/>
+                                    <w:bCs/>
+                                    <w:sz w:val="28"/>
+                                    <w:szCs w:val="28"/>
+                                  </w:rPr>
+                                  <w:t>Alotaibi</w:t>
+                                </w:r>
+                                <w:proofErr w:type="spellEnd"/>
                               </w:p>
                               <w:p>
                                 <w:pPr>
@@ -2758,6 +2831,7 @@
                                     <w:bCs/>
                                     <w:sz w:val="28"/>
                                     <w:szCs w:val="28"/>
+                                    <w:lang w:val="en-GB"/>
                                   </w:rPr>
                                 </w:pPr>
                                 <w:r>
@@ -2768,6 +2842,16 @@
                                     <w:szCs w:val="28"/>
                                   </w:rPr>
                                   <w:t xml:space="preserve">Name: </w:t>
+                                </w:r>
+                                <w:r>
+                                  <w:rPr>
+                                    <w:b/>
+                                    <w:bCs/>
+                                    <w:sz w:val="28"/>
+                                    <w:szCs w:val="28"/>
+                                    <w:lang w:val="en-GB"/>
+                                  </w:rPr>
+                                  <w:t xml:space="preserve">Bushra Alshayeb </w:t>
                                 </w:r>
                               </w:p>
                               <w:p>
@@ -2923,6 +3007,15 @@
                                   </w:rPr>
                                   <w:t xml:space="preserve"> </w:t>
                                 </w:r>
+                                <w:r>
+                                  <w:rPr>
+                                    <w:b/>
+                                    <w:bCs/>
+                                    <w:sz w:val="28"/>
+                                    <w:szCs w:val="28"/>
+                                  </w:rPr>
+                                  <w:t>S240057076</w:t>
+                                </w:r>
                               </w:p>
                               <w:p>
                                 <w:pPr>
@@ -4056,7 +4149,25 @@
           <w:sz w:val="24"/>
           <w:szCs w:val="24"/>
         </w:rPr>
-        <w:t xml:space="preserve"> to the live report document, GitHub/GitLab repository, and Google Colab notebook (if applicable) in the </w:t>
+        <w:t xml:space="preserve"> to the live report document, GitHub/GitLab repository, and Google </w:t>
+      </w:r>
+      <w:proofErr w:type="spellStart"/>
+      <w:r>
+        <w:rPr>
+          <w:rFonts w:ascii="Times New Roman" w:hAnsi="Times New Roman" w:cs="Times New Roman"/>
+          <w:sz w:val="24"/>
+          <w:szCs w:val="24"/>
+        </w:rPr>
+        <w:t>Colab</w:t>
+      </w:r>
+      <w:proofErr w:type="spellEnd"/>
+      <w:r>
+        <w:rPr>
+          <w:rFonts w:ascii="Times New Roman" w:hAnsi="Times New Roman" w:cs="Times New Roman"/>
+          <w:sz w:val="24"/>
+          <w:szCs w:val="24"/>
+        </w:rPr>
+        <w:t xml:space="preserve"> notebook (if applicable) in the </w:t>
       </w:r>
       <w:r>
         <w:rPr>
@@ -4608,7 +4719,7 @@
           </mc:Choice>
           <mc:Fallback>
             <w:pict>
-              <v:shape w14:anchorId="2E8B6DDD" id="Text Box 1" o:spid="_x0000_s1032" type="#_x0000_t202" alt="Sidebar" style="position:absolute;left:0;text-align:left;margin-left:32.5pt;margin-top:6.6pt;width:95.9pt;height:181.45pt;z-index:251681792;visibility:visible;mso-wrap-style:square;mso-width-percent:250;mso-height-percent:950;mso-wrap-distance-left:14.4pt;mso-wrap-distance-top:0;mso-wrap-distance-right:14.4pt;mso-wrap-distance-bottom:3in;mso-position-horizontal:absolute;mso-position-horizontal-relative:page;mso-position-vertical:absolute;mso-position-vertical-relative:margin;mso-width-percent:250;mso-height-percent:950;mso-width-relative:margin;mso-height-relative:margin;v-text-anchor:top" o:gfxdata="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" filled="f" stroked="f" strokeweight=".5pt">
+              <v:shape w14:anchorId="2E8B6DDD" id="Text Box 1" o:spid="_x0000_s1032" type="#_x0000_t202" alt="Sidebar" style="position:absolute;left:0;text-align:left;margin-left:32.5pt;margin-top:6.6pt;width:95.9pt;height:181.45pt;z-index:251681792;visibility:visible;mso-wrap-style:square;mso-width-percent:250;mso-height-percent:950;mso-wrap-distance-left:14.4pt;mso-wrap-distance-top:0;mso-wrap-distance-right:14.4pt;mso-wrap-distance-bottom:3in;mso-position-horizontal:absolute;mso-position-horizontal-relative:page;mso-position-vertical:absolute;mso-position-vertical-relative:margin;mso-width-percent:250;mso-height-percent:950;mso-width-relative:margin;mso-height-relative:margin;v-text-anchor:top" o:gfxdata="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" filled="f" stroked="f" strokeweight=".5pt">
                 <v:textbox inset="3.6pt,0,3.6pt,0">
                   <w:txbxContent>
                     <w:p>
@@ -4812,7 +4923,27 @@
           <w:szCs w:val="24"/>
           <w:lang w:val="es-ES"/>
         </w:rPr>
-        <w:t>A complete ER/EER diagram.</w:t>
+        <w:t xml:space="preserve">A complete ER/EER </w:t>
+      </w:r>
+      <w:proofErr w:type="spellStart"/>
+      <w:r>
+        <w:rPr>
+          <w:rFonts w:ascii="Times New Roman" w:hAnsi="Times New Roman" w:cs="Times New Roman"/>
+          <w:sz w:val="24"/>
+          <w:szCs w:val="24"/>
+          <w:lang w:val="es-ES"/>
+        </w:rPr>
+        <w:t>diagram</w:t>
+      </w:r>
+      <w:proofErr w:type="spellEnd"/>
+      <w:r>
+        <w:rPr>
+          <w:rFonts w:ascii="Times New Roman" w:hAnsi="Times New Roman" w:cs="Times New Roman"/>
+          <w:sz w:val="24"/>
+          <w:szCs w:val="24"/>
+          <w:lang w:val="es-ES"/>
+        </w:rPr>
+        <w:t>.</w:t>
       </w:r>
     </w:p>
     <w:p>
@@ -4886,6 +5017,1743 @@
         </w:rPr>
         <w:t>Any assumptions made during the design process.</w:t>
       </w:r>
+    </w:p>
+    <w:p>
+      <w:pPr>
+        <w:pStyle w:val="a"/>
+        <w:numPr>
+          <w:ilvl w:val="0"/>
+          <w:numId w:val="0"/>
+        </w:numPr>
+        <w:ind w:left="576" w:hanging="288"/>
+        <w:rPr>
+          <w:rFonts w:ascii="Times New Roman" w:hAnsi="Times New Roman" w:cs="Times New Roman"/>
+          <w:sz w:val="24"/>
+          <w:szCs w:val="24"/>
+        </w:rPr>
+      </w:pPr>
+    </w:p>
+    <w:p>
+      <w:pPr>
+        <w:pStyle w:val="p1"/>
+        <w:rPr>
+          <w:b/>
+          <w:bCs/>
+          <w:sz w:val="30"/>
+          <w:szCs w:val="30"/>
+        </w:rPr>
+      </w:pPr>
+      <w:r>
+        <w:rPr>
+          <w:rStyle w:val="s1"/>
+          <w:b/>
+          <w:bCs/>
+          <w:sz w:val="30"/>
+          <w:szCs w:val="30"/>
+        </w:rPr>
+        <w:t>1.1 Complete ER/EER Diagram</w:t>
+      </w:r>
+    </w:p>
+    <w:p>
+      <w:pPr>
+        <w:pStyle w:val="p3"/>
+        <w:rPr>
+          <w:rStyle w:val="s2"/>
+        </w:rPr>
+      </w:pPr>
+    </w:p>
+    <w:p>
+      <w:pPr>
+        <w:pStyle w:val="p3"/>
+      </w:pPr>
+      <w:r>
+        <w:rPr>
+          <w:rStyle w:val="s2"/>
+        </w:rPr>
+        <w:t>The database is designed with six main entities: Patients, Doctors,</w:t>
+      </w:r>
+    </w:p>
+    <w:p>
+      <w:pPr>
+        <w:pStyle w:val="p3"/>
+      </w:pPr>
+      <w:r>
+        <w:rPr>
+          <w:rStyle w:val="s2"/>
+        </w:rPr>
+        <w:t>Appointments, Treatments, Medicines, and Payments. It includes a</w:t>
+      </w:r>
+    </w:p>
+    <w:p>
+      <w:pPr>
+        <w:pStyle w:val="p3"/>
+      </w:pPr>
+      <w:r>
+        <w:rPr>
+          <w:rStyle w:val="s2"/>
+        </w:rPr>
+        <w:t>specialization/generalization feature where Doctor and Nurse are</w:t>
+      </w:r>
+    </w:p>
+    <w:p>
+      <w:pPr>
+        <w:pStyle w:val="p3"/>
+      </w:pPr>
+      <w:r>
+        <w:rPr>
+          <w:rStyle w:val="s2"/>
+        </w:rPr>
+        <w:t>subtypes of the Staff entity.</w:t>
+      </w:r>
+    </w:p>
+    <w:p>
+      <w:pPr>
+        <w:pStyle w:val="a"/>
+        <w:numPr>
+          <w:ilvl w:val="0"/>
+          <w:numId w:val="0"/>
+        </w:numPr>
+        <w:ind w:left="576" w:hanging="288"/>
+        <w:rPr>
+          <w:rFonts w:ascii="Times New Roman" w:hAnsi="Times New Roman" w:cs="Times New Roman"/>
+          <w:sz w:val="24"/>
+          <w:szCs w:val="24"/>
+          <w:rtl/>
+        </w:rPr>
+      </w:pPr>
+      <w:r>
+        <w:rPr>
+          <w:noProof/>
+        </w:rPr>
+        <w:drawing>
+          <wp:anchor distT="0" distB="0" distL="114300" distR="114300" simplePos="0" relativeHeight="251683840" behindDoc="0" locked="0" layoutInCell="1" allowOverlap="1" wp14:anchorId="1834CE31" wp14:editId="3CD6EB2B">
+            <wp:simplePos x="0" y="0"/>
+            <wp:positionH relativeFrom="column">
+              <wp:posOffset>0</wp:posOffset>
+            </wp:positionH>
+            <wp:positionV relativeFrom="paragraph">
+              <wp:posOffset>257810</wp:posOffset>
+            </wp:positionV>
+            <wp:extent cx="4185139" cy="3333107"/>
+            <wp:effectExtent l="0" t="0" r="0" b="0"/>
+            <wp:wrapTopAndBottom/>
+            <wp:docPr id="965254020" name="صورة 1"/>
+            <wp:cNvGraphicFramePr>
+              <a:graphicFrameLocks xmlns:a="http://schemas.openxmlformats.org/drawingml/2006/main" noChangeAspect="1"/>
+            </wp:cNvGraphicFramePr>
+            <a:graphic xmlns:a="http://schemas.openxmlformats.org/drawingml/2006/main">
+              <a:graphicData uri="http://schemas.openxmlformats.org/drawingml/2006/picture">
+                <pic:pic xmlns:pic="http://schemas.openxmlformats.org/drawingml/2006/picture">
+                  <pic:nvPicPr>
+                    <pic:cNvPr id="965254020" name="صورة 965254020"/>
+                    <pic:cNvPicPr/>
+                  </pic:nvPicPr>
+                  <pic:blipFill>
+                    <a:blip r:embed="rId15"/>
+                    <a:stretch>
+                      <a:fillRect/>
+                    </a:stretch>
+                  </pic:blipFill>
+                  <pic:spPr>
+                    <a:xfrm>
+                      <a:off x="0" y="0"/>
+                      <a:ext cx="4185139" cy="3333107"/>
+                    </a:xfrm>
+                    <a:prstGeom prst="rect">
+                      <a:avLst/>
+                    </a:prstGeom>
+                  </pic:spPr>
+                </pic:pic>
+              </a:graphicData>
+            </a:graphic>
+            <wp14:sizeRelH relativeFrom="margin">
+              <wp14:pctWidth>0</wp14:pctWidth>
+            </wp14:sizeRelH>
+            <wp14:sizeRelV relativeFrom="margin">
+              <wp14:pctHeight>0</wp14:pctHeight>
+            </wp14:sizeRelV>
+          </wp:anchor>
+        </w:drawing>
+      </w:r>
+    </w:p>
+    <w:p>
+      <w:pPr>
+        <w:spacing w:after="0" w:line="240" w:lineRule="auto"/>
+        <w:rPr>
+          <w:rFonts w:ascii="Helvetica" w:eastAsiaTheme="minorEastAsia" w:hAnsi="Helvetica" w:cs="Times New Roman"/>
+          <w:color w:val="FF0000"/>
+          <w:sz w:val="23"/>
+          <w:szCs w:val="23"/>
+          <w:rtl/>
+          <w:lang w:eastAsia="en-US"/>
+        </w:rPr>
+      </w:pPr>
+    </w:p>
+    <w:p>
+      <w:pPr>
+        <w:spacing w:after="0" w:line="240" w:lineRule="auto"/>
+        <w:rPr>
+          <w:rFonts w:ascii="Helvetica" w:eastAsiaTheme="minorEastAsia" w:hAnsi="Helvetica" w:cs="Times New Roman"/>
+          <w:color w:val="FF0000"/>
+          <w:sz w:val="23"/>
+          <w:szCs w:val="23"/>
+          <w:rtl/>
+          <w:lang w:eastAsia="en-US"/>
+        </w:rPr>
+      </w:pPr>
+    </w:p>
+    <w:p>
+      <w:pPr>
+        <w:spacing w:after="0" w:line="240" w:lineRule="auto"/>
+        <w:rPr>
+          <w:rFonts w:ascii="Helvetica" w:eastAsiaTheme="minorEastAsia" w:hAnsi="Helvetica" w:cs="Times New Roman"/>
+          <w:b/>
+          <w:bCs/>
+          <w:color w:val="FF0000"/>
+          <w:sz w:val="30"/>
+          <w:szCs w:val="30"/>
+          <w:lang w:eastAsia="en-US"/>
+        </w:rPr>
+      </w:pPr>
+      <w:r>
+        <w:rPr>
+          <w:rFonts w:ascii="Helvetica" w:eastAsiaTheme="minorEastAsia" w:hAnsi="Helvetica" w:cs="Times New Roman"/>
+          <w:b/>
+          <w:bCs/>
+          <w:color w:val="FF0000"/>
+          <w:sz w:val="30"/>
+          <w:szCs w:val="30"/>
+          <w:lang w:eastAsia="en-US"/>
+        </w:rPr>
+        <w:lastRenderedPageBreak/>
+        <w:t>1.2</w:t>
+      </w:r>
+      <w:r>
+        <w:rPr>
+          <w:rFonts w:ascii="TimesNewRomanPS-BoldMT" w:eastAsiaTheme="minorEastAsia" w:hAnsi="TimesNewRomanPS-BoldMT" w:cs="Times New Roman"/>
+          <w:b/>
+          <w:bCs/>
+          <w:color w:val="000000"/>
+          <w:sz w:val="30"/>
+          <w:szCs w:val="30"/>
+          <w:lang w:eastAsia="en-US"/>
+        </w:rPr>
+        <w:t xml:space="preserve"> </w:t>
+      </w:r>
+      <w:r>
+        <w:rPr>
+          <w:rFonts w:ascii="Helvetica" w:eastAsiaTheme="minorEastAsia" w:hAnsi="Helvetica" w:cs="Times New Roman"/>
+          <w:b/>
+          <w:bCs/>
+          <w:color w:val="FF0000"/>
+          <w:sz w:val="30"/>
+          <w:szCs w:val="30"/>
+          <w:lang w:eastAsia="en-US"/>
+        </w:rPr>
+        <w:t>Relational Schema (Primary and Foreign Keys)</w:t>
+      </w:r>
+    </w:p>
+    <w:p>
+      <w:pPr>
+        <w:spacing w:after="0" w:line="240" w:lineRule="auto"/>
+        <w:rPr>
+          <w:rFonts w:ascii="Helvetica" w:eastAsiaTheme="minorEastAsia" w:hAnsi="Helvetica" w:cs="Times New Roman"/>
+          <w:color w:val="00B0F0"/>
+          <w:sz w:val="23"/>
+          <w:szCs w:val="23"/>
+          <w:rtl/>
+          <w:lang w:eastAsia="en-US"/>
+        </w:rPr>
+      </w:pPr>
+    </w:p>
+    <w:p>
+      <w:pPr>
+        <w:spacing w:after="0" w:line="240" w:lineRule="auto"/>
+        <w:rPr>
+          <w:rFonts w:ascii="Helvetica" w:eastAsiaTheme="minorEastAsia" w:hAnsi="Helvetica" w:cs="Times New Roman"/>
+          <w:color w:val="000000"/>
+          <w:lang w:eastAsia="en-US"/>
+        </w:rPr>
+      </w:pPr>
+      <w:r>
+        <w:rPr>
+          <w:rFonts w:ascii="Helvetica" w:eastAsiaTheme="minorEastAsia" w:hAnsi="Helvetica" w:cs="Times New Roman"/>
+          <w:color w:val="000000"/>
+          <w:lang w:eastAsia="en-US"/>
+        </w:rPr>
+        <w:t>Based on the ERD, the following relational schema was created:</w:t>
+      </w:r>
+    </w:p>
+    <w:p>
+      <w:pPr>
+        <w:spacing w:after="0" w:line="240" w:lineRule="auto"/>
+        <w:rPr>
+          <w:rFonts w:ascii="Times New Roman" w:eastAsiaTheme="minorEastAsia" w:hAnsi="Times New Roman" w:cs="Times New Roman"/>
+          <w:color w:val="000000"/>
+          <w:lang w:eastAsia="en-US"/>
+        </w:rPr>
+      </w:pPr>
+      <w:r>
+        <w:rPr>
+          <w:rFonts w:ascii="TimesNewRomanPS-BoldMT" w:eastAsiaTheme="minorEastAsia" w:hAnsi="TimesNewRomanPS-BoldMT" w:cs="Times New Roman"/>
+          <w:b/>
+          <w:bCs/>
+          <w:color w:val="000000"/>
+          <w:lang w:eastAsia="en-US"/>
+        </w:rPr>
+        <w:t>1. Staff Table</w:t>
+      </w:r>
+      <w:r>
+        <w:rPr>
+          <w:rFonts w:ascii="Times New Roman" w:eastAsiaTheme="minorEastAsia" w:hAnsi="Times New Roman" w:cs="Times New Roman"/>
+          <w:color w:val="000000"/>
+          <w:lang w:eastAsia="en-US"/>
+        </w:rPr>
+        <w:t xml:space="preserve"> - </w:t>
+      </w:r>
+      <w:r>
+        <w:rPr>
+          <w:rFonts w:ascii="Helvetica" w:eastAsiaTheme="minorEastAsia" w:hAnsi="Helvetica" w:cs="Times New Roman"/>
+          <w:color w:val="000000"/>
+          <w:lang w:eastAsia="en-US"/>
+        </w:rPr>
+        <w:t>StaffID</w:t>
+      </w:r>
+      <w:r>
+        <w:rPr>
+          <w:rFonts w:ascii="Times New Roman" w:eastAsiaTheme="minorEastAsia" w:hAnsi="Times New Roman" w:cs="Times New Roman"/>
+          <w:color w:val="000000"/>
+          <w:lang w:eastAsia="en-US"/>
+        </w:rPr>
+        <w:t xml:space="preserve"> (Primary Key, INT) - </w:t>
+      </w:r>
+      <w:r>
+        <w:rPr>
+          <w:rFonts w:ascii="Helvetica" w:eastAsiaTheme="minorEastAsia" w:hAnsi="Helvetica" w:cs="Times New Roman"/>
+          <w:color w:val="000000"/>
+          <w:lang w:eastAsia="en-US"/>
+        </w:rPr>
+        <w:t>Name</w:t>
+      </w:r>
+      <w:r>
+        <w:rPr>
+          <w:rFonts w:ascii="Times New Roman" w:eastAsiaTheme="minorEastAsia" w:hAnsi="Times New Roman" w:cs="Times New Roman"/>
+          <w:color w:val="000000"/>
+          <w:lang w:eastAsia="en-US"/>
+        </w:rPr>
+        <w:t xml:space="preserve"> (</w:t>
+      </w:r>
+      <w:proofErr w:type="spellStart"/>
+      <w:r>
+        <w:rPr>
+          <w:rFonts w:ascii="Times New Roman" w:eastAsiaTheme="minorEastAsia" w:hAnsi="Times New Roman" w:cs="Times New Roman"/>
+          <w:color w:val="000000"/>
+          <w:lang w:eastAsia="en-US"/>
+        </w:rPr>
+        <w:t>VARCHAR</w:t>
+      </w:r>
+      <w:proofErr w:type="spellEnd"/>
+      <w:r>
+        <w:rPr>
+          <w:rFonts w:ascii="Times New Roman" w:eastAsiaTheme="minorEastAsia" w:hAnsi="Times New Roman" w:cs="Times New Roman"/>
+          <w:color w:val="000000"/>
+          <w:lang w:eastAsia="en-US"/>
+        </w:rPr>
+        <w:t>) -</w:t>
+      </w:r>
+    </w:p>
+    <w:p>
+      <w:pPr>
+        <w:spacing w:after="0" w:line="240" w:lineRule="auto"/>
+        <w:rPr>
+          <w:rFonts w:ascii="Times New Roman" w:eastAsiaTheme="minorEastAsia" w:hAnsi="Times New Roman" w:cs="Times New Roman"/>
+          <w:color w:val="000000"/>
+          <w:lang w:eastAsia="en-US"/>
+        </w:rPr>
+      </w:pPr>
+      <w:r>
+        <w:rPr>
+          <w:rFonts w:ascii="Helvetica" w:eastAsiaTheme="minorEastAsia" w:hAnsi="Helvetica" w:cs="Times New Roman"/>
+          <w:color w:val="000000"/>
+          <w:lang w:eastAsia="en-US"/>
+        </w:rPr>
+        <w:t>PhoneNumber</w:t>
+      </w:r>
+      <w:r>
+        <w:rPr>
+          <w:rFonts w:ascii="Times New Roman" w:eastAsiaTheme="minorEastAsia" w:hAnsi="Times New Roman" w:cs="Times New Roman"/>
+          <w:color w:val="000000"/>
+          <w:lang w:eastAsia="en-US"/>
+        </w:rPr>
+        <w:t xml:space="preserve"> (</w:t>
+      </w:r>
+      <w:proofErr w:type="spellStart"/>
+      <w:r>
+        <w:rPr>
+          <w:rFonts w:ascii="Times New Roman" w:eastAsiaTheme="minorEastAsia" w:hAnsi="Times New Roman" w:cs="Times New Roman"/>
+          <w:color w:val="000000"/>
+          <w:lang w:eastAsia="en-US"/>
+        </w:rPr>
+        <w:t>VARCHAR</w:t>
+      </w:r>
+      <w:proofErr w:type="spellEnd"/>
+      <w:r>
+        <w:rPr>
+          <w:rFonts w:ascii="Times New Roman" w:eastAsiaTheme="minorEastAsia" w:hAnsi="Times New Roman" w:cs="Times New Roman"/>
+          <w:color w:val="000000"/>
+          <w:lang w:eastAsia="en-US"/>
+        </w:rPr>
+        <w:t xml:space="preserve">, UNIQUE) - </w:t>
+      </w:r>
+      <w:r>
+        <w:rPr>
+          <w:rFonts w:ascii="Helvetica" w:eastAsiaTheme="minorEastAsia" w:hAnsi="Helvetica" w:cs="Times New Roman"/>
+          <w:color w:val="000000"/>
+          <w:lang w:eastAsia="en-US"/>
+        </w:rPr>
+        <w:t>Email</w:t>
+      </w:r>
+      <w:r>
+        <w:rPr>
+          <w:rFonts w:ascii="Times New Roman" w:eastAsiaTheme="minorEastAsia" w:hAnsi="Times New Roman" w:cs="Times New Roman"/>
+          <w:color w:val="000000"/>
+          <w:lang w:eastAsia="en-US"/>
+        </w:rPr>
+        <w:t xml:space="preserve"> (</w:t>
+      </w:r>
+      <w:proofErr w:type="spellStart"/>
+      <w:r>
+        <w:rPr>
+          <w:rFonts w:ascii="Times New Roman" w:eastAsiaTheme="minorEastAsia" w:hAnsi="Times New Roman" w:cs="Times New Roman"/>
+          <w:color w:val="000000"/>
+          <w:lang w:eastAsia="en-US"/>
+        </w:rPr>
+        <w:t>VARCHAR</w:t>
+      </w:r>
+      <w:proofErr w:type="spellEnd"/>
+      <w:r>
+        <w:rPr>
+          <w:rFonts w:ascii="Times New Roman" w:eastAsiaTheme="minorEastAsia" w:hAnsi="Times New Roman" w:cs="Times New Roman"/>
+          <w:color w:val="000000"/>
+          <w:lang w:eastAsia="en-US"/>
+        </w:rPr>
+        <w:t>,</w:t>
+      </w:r>
+    </w:p>
+    <w:p>
+      <w:pPr>
+        <w:spacing w:after="0" w:line="240" w:lineRule="auto"/>
+        <w:rPr>
+          <w:rFonts w:ascii="Times New Roman" w:eastAsiaTheme="minorEastAsia" w:hAnsi="Times New Roman" w:cs="Times New Roman"/>
+          <w:color w:val="000000"/>
+          <w:lang w:eastAsia="en-US"/>
+        </w:rPr>
+      </w:pPr>
+      <w:r>
+        <w:rPr>
+          <w:rFonts w:ascii="Times New Roman" w:eastAsiaTheme="minorEastAsia" w:hAnsi="Times New Roman" w:cs="Times New Roman"/>
+          <w:color w:val="000000"/>
+          <w:lang w:eastAsia="en-US"/>
+        </w:rPr>
+        <w:t xml:space="preserve">UNIQUE) - </w:t>
+      </w:r>
+      <w:r>
+        <w:rPr>
+          <w:rFonts w:ascii="Helvetica" w:eastAsiaTheme="minorEastAsia" w:hAnsi="Helvetica" w:cs="Times New Roman"/>
+          <w:color w:val="000000"/>
+          <w:lang w:eastAsia="en-US"/>
+        </w:rPr>
+        <w:t>Address</w:t>
+      </w:r>
+      <w:r>
+        <w:rPr>
+          <w:rFonts w:ascii="Times New Roman" w:eastAsiaTheme="minorEastAsia" w:hAnsi="Times New Roman" w:cs="Times New Roman"/>
+          <w:color w:val="000000"/>
+          <w:lang w:eastAsia="en-US"/>
+        </w:rPr>
+        <w:t xml:space="preserve"> (TEXT) - </w:t>
+      </w:r>
+      <w:r>
+        <w:rPr>
+          <w:rFonts w:ascii="Helvetica" w:eastAsiaTheme="minorEastAsia" w:hAnsi="Helvetica" w:cs="Times New Roman"/>
+          <w:color w:val="000000"/>
+          <w:lang w:eastAsia="en-US"/>
+        </w:rPr>
+        <w:t>DateOfHire</w:t>
+      </w:r>
+      <w:r>
+        <w:rPr>
+          <w:rFonts w:ascii="Times New Roman" w:eastAsiaTheme="minorEastAsia" w:hAnsi="Times New Roman" w:cs="Times New Roman"/>
+          <w:color w:val="000000"/>
+          <w:lang w:eastAsia="en-US"/>
+        </w:rPr>
+        <w:t xml:space="preserve"> (DATE)</w:t>
+      </w:r>
+    </w:p>
+    <w:p>
+      <w:pPr>
+        <w:spacing w:after="0" w:line="240" w:lineRule="auto"/>
+        <w:rPr>
+          <w:rFonts w:ascii="Times New Roman" w:eastAsiaTheme="minorEastAsia" w:hAnsi="Times New Roman" w:cs="Times New Roman"/>
+          <w:color w:val="000000"/>
+          <w:lang w:eastAsia="en-US"/>
+        </w:rPr>
+      </w:pPr>
+      <w:r>
+        <w:rPr>
+          <w:rFonts w:ascii="TimesNewRomanPS-BoldMT" w:eastAsiaTheme="minorEastAsia" w:hAnsi="TimesNewRomanPS-BoldMT" w:cs="Times New Roman"/>
+          <w:b/>
+          <w:bCs/>
+          <w:color w:val="000000"/>
+          <w:lang w:eastAsia="en-US"/>
+        </w:rPr>
+        <w:t>2. Doctor Table</w:t>
+      </w:r>
+      <w:r>
+        <w:rPr>
+          <w:rFonts w:ascii="Times New Roman" w:eastAsiaTheme="minorEastAsia" w:hAnsi="Times New Roman" w:cs="Times New Roman"/>
+          <w:color w:val="000000"/>
+          <w:lang w:eastAsia="en-US"/>
+        </w:rPr>
+        <w:t xml:space="preserve"> - </w:t>
+      </w:r>
+      <w:r>
+        <w:rPr>
+          <w:rFonts w:ascii="Helvetica" w:eastAsiaTheme="minorEastAsia" w:hAnsi="Helvetica" w:cs="Times New Roman"/>
+          <w:color w:val="000000"/>
+          <w:lang w:eastAsia="en-US"/>
+        </w:rPr>
+        <w:t>StaffID</w:t>
+      </w:r>
+      <w:r>
+        <w:rPr>
+          <w:rFonts w:ascii="Times New Roman" w:eastAsiaTheme="minorEastAsia" w:hAnsi="Times New Roman" w:cs="Times New Roman"/>
+          <w:color w:val="000000"/>
+          <w:lang w:eastAsia="en-US"/>
+        </w:rPr>
+        <w:t xml:space="preserve"> (Primary Key, Foreign Key referencing</w:t>
+      </w:r>
+    </w:p>
+    <w:p>
+      <w:pPr>
+        <w:spacing w:after="0" w:line="240" w:lineRule="auto"/>
+        <w:rPr>
+          <w:rFonts w:ascii="Times New Roman" w:eastAsiaTheme="minorEastAsia" w:hAnsi="Times New Roman" w:cs="Times New Roman"/>
+          <w:color w:val="000000"/>
+          <w:lang w:eastAsia="en-US"/>
+        </w:rPr>
+      </w:pPr>
+      <w:r>
+        <w:rPr>
+          <w:rFonts w:ascii="Times New Roman" w:eastAsiaTheme="minorEastAsia" w:hAnsi="Times New Roman" w:cs="Times New Roman"/>
+          <w:color w:val="000000"/>
+          <w:lang w:eastAsia="en-US"/>
+        </w:rPr>
+        <w:t xml:space="preserve">Staff.StaffID) - </w:t>
+      </w:r>
+      <w:r>
+        <w:rPr>
+          <w:rFonts w:ascii="Helvetica" w:eastAsiaTheme="minorEastAsia" w:hAnsi="Helvetica" w:cs="Times New Roman"/>
+          <w:color w:val="000000"/>
+          <w:lang w:eastAsia="en-US"/>
+        </w:rPr>
+        <w:t>Specialization</w:t>
+      </w:r>
+      <w:r>
+        <w:rPr>
+          <w:rFonts w:ascii="Times New Roman" w:eastAsiaTheme="minorEastAsia" w:hAnsi="Times New Roman" w:cs="Times New Roman"/>
+          <w:color w:val="000000"/>
+          <w:lang w:eastAsia="en-US"/>
+        </w:rPr>
+        <w:t xml:space="preserve"> (</w:t>
+      </w:r>
+      <w:proofErr w:type="spellStart"/>
+      <w:r>
+        <w:rPr>
+          <w:rFonts w:ascii="Times New Roman" w:eastAsiaTheme="minorEastAsia" w:hAnsi="Times New Roman" w:cs="Times New Roman"/>
+          <w:color w:val="000000"/>
+          <w:lang w:eastAsia="en-US"/>
+        </w:rPr>
+        <w:t>VARCHAR</w:t>
+      </w:r>
+      <w:proofErr w:type="spellEnd"/>
+      <w:r>
+        <w:rPr>
+          <w:rFonts w:ascii="Times New Roman" w:eastAsiaTheme="minorEastAsia" w:hAnsi="Times New Roman" w:cs="Times New Roman"/>
+          <w:color w:val="000000"/>
+          <w:lang w:eastAsia="en-US"/>
+        </w:rPr>
+        <w:t>)</w:t>
+      </w:r>
+    </w:p>
+    <w:p>
+      <w:pPr>
+        <w:spacing w:after="0" w:line="240" w:lineRule="auto"/>
+        <w:rPr>
+          <w:rFonts w:ascii="Times New Roman" w:eastAsiaTheme="minorEastAsia" w:hAnsi="Times New Roman" w:cs="Times New Roman"/>
+          <w:color w:val="000000"/>
+          <w:lang w:eastAsia="en-US"/>
+        </w:rPr>
+      </w:pPr>
+      <w:r>
+        <w:rPr>
+          <w:rFonts w:ascii="TimesNewRomanPS-BoldMT" w:eastAsiaTheme="minorEastAsia" w:hAnsi="TimesNewRomanPS-BoldMT" w:cs="Times New Roman"/>
+          <w:b/>
+          <w:bCs/>
+          <w:color w:val="000000"/>
+          <w:lang w:eastAsia="en-US"/>
+        </w:rPr>
+        <w:t>3. Nurse Table</w:t>
+      </w:r>
+      <w:r>
+        <w:rPr>
+          <w:rFonts w:ascii="Times New Roman" w:eastAsiaTheme="minorEastAsia" w:hAnsi="Times New Roman" w:cs="Times New Roman"/>
+          <w:color w:val="000000"/>
+          <w:lang w:eastAsia="en-US"/>
+        </w:rPr>
+        <w:t xml:space="preserve"> - </w:t>
+      </w:r>
+      <w:r>
+        <w:rPr>
+          <w:rFonts w:ascii="Helvetica" w:eastAsiaTheme="minorEastAsia" w:hAnsi="Helvetica" w:cs="Times New Roman"/>
+          <w:color w:val="000000"/>
+          <w:lang w:eastAsia="en-US"/>
+        </w:rPr>
+        <w:t>StaffID</w:t>
+      </w:r>
+      <w:r>
+        <w:rPr>
+          <w:rFonts w:ascii="Times New Roman" w:eastAsiaTheme="minorEastAsia" w:hAnsi="Times New Roman" w:cs="Times New Roman"/>
+          <w:color w:val="000000"/>
+          <w:lang w:eastAsia="en-US"/>
+        </w:rPr>
+        <w:t xml:space="preserve"> (Primary Key, Foreign Key referencing</w:t>
+      </w:r>
+    </w:p>
+    <w:p>
+      <w:pPr>
+        <w:spacing w:after="0" w:line="240" w:lineRule="auto"/>
+        <w:rPr>
+          <w:rFonts w:ascii="Times New Roman" w:eastAsiaTheme="minorEastAsia" w:hAnsi="Times New Roman" w:cs="Times New Roman"/>
+          <w:color w:val="000000"/>
+          <w:lang w:eastAsia="en-US"/>
+        </w:rPr>
+      </w:pPr>
+      <w:r>
+        <w:rPr>
+          <w:rFonts w:ascii="Times New Roman" w:eastAsiaTheme="minorEastAsia" w:hAnsi="Times New Roman" w:cs="Times New Roman"/>
+          <w:color w:val="000000"/>
+          <w:lang w:eastAsia="en-US"/>
+        </w:rPr>
+        <w:t xml:space="preserve">Staff.StaffID) - </w:t>
+      </w:r>
+      <w:r>
+        <w:rPr>
+          <w:rFonts w:ascii="Helvetica" w:eastAsiaTheme="minorEastAsia" w:hAnsi="Helvetica" w:cs="Times New Roman"/>
+          <w:color w:val="000000"/>
+          <w:lang w:eastAsia="en-US"/>
+        </w:rPr>
+        <w:t>Shift</w:t>
+      </w:r>
+      <w:r>
+        <w:rPr>
+          <w:rFonts w:ascii="Times New Roman" w:eastAsiaTheme="minorEastAsia" w:hAnsi="Times New Roman" w:cs="Times New Roman"/>
+          <w:color w:val="000000"/>
+          <w:lang w:eastAsia="en-US"/>
+        </w:rPr>
+        <w:t xml:space="preserve"> (</w:t>
+      </w:r>
+      <w:proofErr w:type="spellStart"/>
+      <w:r>
+        <w:rPr>
+          <w:rFonts w:ascii="Times New Roman" w:eastAsiaTheme="minorEastAsia" w:hAnsi="Times New Roman" w:cs="Times New Roman"/>
+          <w:color w:val="000000"/>
+          <w:lang w:eastAsia="en-US"/>
+        </w:rPr>
+        <w:t>VARCHAR</w:t>
+      </w:r>
+      <w:proofErr w:type="spellEnd"/>
+      <w:r>
+        <w:rPr>
+          <w:rFonts w:ascii="Times New Roman" w:eastAsiaTheme="minorEastAsia" w:hAnsi="Times New Roman" w:cs="Times New Roman"/>
+          <w:color w:val="000000"/>
+          <w:lang w:eastAsia="en-US"/>
+        </w:rPr>
+        <w:t>)</w:t>
+      </w:r>
+    </w:p>
+    <w:p>
+      <w:pPr>
+        <w:spacing w:after="0" w:line="240" w:lineRule="auto"/>
+        <w:rPr>
+          <w:rFonts w:ascii="Times New Roman" w:eastAsiaTheme="minorEastAsia" w:hAnsi="Times New Roman" w:cs="Times New Roman"/>
+          <w:color w:val="000000"/>
+          <w:lang w:eastAsia="en-US"/>
+        </w:rPr>
+      </w:pPr>
+      <w:r>
+        <w:rPr>
+          <w:rFonts w:ascii="TimesNewRomanPS-BoldMT" w:eastAsiaTheme="minorEastAsia" w:hAnsi="TimesNewRomanPS-BoldMT" w:cs="Times New Roman"/>
+          <w:b/>
+          <w:bCs/>
+          <w:color w:val="000000"/>
+          <w:lang w:eastAsia="en-US"/>
+        </w:rPr>
+        <w:t>4. Patient Table</w:t>
+      </w:r>
+      <w:r>
+        <w:rPr>
+          <w:rFonts w:ascii="Times New Roman" w:eastAsiaTheme="minorEastAsia" w:hAnsi="Times New Roman" w:cs="Times New Roman"/>
+          <w:color w:val="000000"/>
+          <w:lang w:eastAsia="en-US"/>
+        </w:rPr>
+        <w:t xml:space="preserve"> - </w:t>
+      </w:r>
+      <w:r>
+        <w:rPr>
+          <w:rFonts w:ascii="Helvetica" w:eastAsiaTheme="minorEastAsia" w:hAnsi="Helvetica" w:cs="Times New Roman"/>
+          <w:color w:val="000000"/>
+          <w:lang w:eastAsia="en-US"/>
+        </w:rPr>
+        <w:t>PatientID</w:t>
+      </w:r>
+      <w:r>
+        <w:rPr>
+          <w:rFonts w:ascii="Times New Roman" w:eastAsiaTheme="minorEastAsia" w:hAnsi="Times New Roman" w:cs="Times New Roman"/>
+          <w:color w:val="000000"/>
+          <w:lang w:eastAsia="en-US"/>
+        </w:rPr>
+        <w:t xml:space="preserve"> (Primary Key, INT) - </w:t>
+      </w:r>
+      <w:r>
+        <w:rPr>
+          <w:rFonts w:ascii="Helvetica" w:eastAsiaTheme="minorEastAsia" w:hAnsi="Helvetica" w:cs="Times New Roman"/>
+          <w:color w:val="000000"/>
+          <w:lang w:eastAsia="en-US"/>
+        </w:rPr>
+        <w:t>Name</w:t>
+      </w:r>
+    </w:p>
+    <w:p>
+      <w:pPr>
+        <w:spacing w:after="0" w:line="240" w:lineRule="auto"/>
+        <w:rPr>
+          <w:rFonts w:ascii="Times New Roman" w:eastAsiaTheme="minorEastAsia" w:hAnsi="Times New Roman" w:cs="Times New Roman"/>
+          <w:color w:val="000000"/>
+          <w:lang w:eastAsia="en-US"/>
+        </w:rPr>
+      </w:pPr>
+      <w:r>
+        <w:rPr>
+          <w:rFonts w:ascii="Times New Roman" w:eastAsiaTheme="minorEastAsia" w:hAnsi="Times New Roman" w:cs="Times New Roman"/>
+          <w:color w:val="000000"/>
+          <w:lang w:eastAsia="en-US"/>
+        </w:rPr>
+        <w:t>(</w:t>
+      </w:r>
+      <w:proofErr w:type="spellStart"/>
+      <w:r>
+        <w:rPr>
+          <w:rFonts w:ascii="Times New Roman" w:eastAsiaTheme="minorEastAsia" w:hAnsi="Times New Roman" w:cs="Times New Roman"/>
+          <w:color w:val="000000"/>
+          <w:lang w:eastAsia="en-US"/>
+        </w:rPr>
+        <w:t>VARCHAR</w:t>
+      </w:r>
+      <w:proofErr w:type="spellEnd"/>
+      <w:r>
+        <w:rPr>
+          <w:rFonts w:ascii="Times New Roman" w:eastAsiaTheme="minorEastAsia" w:hAnsi="Times New Roman" w:cs="Times New Roman"/>
+          <w:color w:val="000000"/>
+          <w:lang w:eastAsia="en-US"/>
+        </w:rPr>
+        <w:t xml:space="preserve">) - </w:t>
+      </w:r>
+      <w:r>
+        <w:rPr>
+          <w:rFonts w:ascii="Helvetica" w:eastAsiaTheme="minorEastAsia" w:hAnsi="Helvetica" w:cs="Times New Roman"/>
+          <w:color w:val="000000"/>
+          <w:lang w:eastAsia="en-US"/>
+        </w:rPr>
+        <w:t>DateOfBirth</w:t>
+      </w:r>
+      <w:r>
+        <w:rPr>
+          <w:rFonts w:ascii="Times New Roman" w:eastAsiaTheme="minorEastAsia" w:hAnsi="Times New Roman" w:cs="Times New Roman"/>
+          <w:color w:val="000000"/>
+          <w:lang w:eastAsia="en-US"/>
+        </w:rPr>
+        <w:t xml:space="preserve"> (DATE) - </w:t>
+      </w:r>
+      <w:r>
+        <w:rPr>
+          <w:rFonts w:ascii="Helvetica" w:eastAsiaTheme="minorEastAsia" w:hAnsi="Helvetica" w:cs="Times New Roman"/>
+          <w:color w:val="000000"/>
+          <w:lang w:eastAsia="en-US"/>
+        </w:rPr>
+        <w:t>Gender</w:t>
+      </w:r>
+      <w:r>
+        <w:rPr>
+          <w:rFonts w:ascii="Times New Roman" w:eastAsiaTheme="minorEastAsia" w:hAnsi="Times New Roman" w:cs="Times New Roman"/>
+          <w:color w:val="000000"/>
+          <w:lang w:eastAsia="en-US"/>
+        </w:rPr>
+        <w:t xml:space="preserve"> (ENUM) -</w:t>
+      </w:r>
+    </w:p>
+    <w:p>
+      <w:pPr>
+        <w:spacing w:after="0" w:line="240" w:lineRule="auto"/>
+        <w:rPr>
+          <w:rFonts w:ascii="Times New Roman" w:eastAsiaTheme="minorEastAsia" w:hAnsi="Times New Roman" w:cs="Times New Roman"/>
+          <w:color w:val="000000"/>
+          <w:lang w:eastAsia="en-US"/>
+        </w:rPr>
+      </w:pPr>
+      <w:r>
+        <w:rPr>
+          <w:rFonts w:ascii="Helvetica" w:eastAsiaTheme="minorEastAsia" w:hAnsi="Helvetica" w:cs="Times New Roman"/>
+          <w:color w:val="000000"/>
+          <w:lang w:eastAsia="en-US"/>
+        </w:rPr>
+        <w:t>Address</w:t>
+      </w:r>
+      <w:r>
+        <w:rPr>
+          <w:rFonts w:ascii="Times New Roman" w:eastAsiaTheme="minorEastAsia" w:hAnsi="Times New Roman" w:cs="Times New Roman"/>
+          <w:color w:val="000000"/>
+          <w:lang w:eastAsia="en-US"/>
+        </w:rPr>
+        <w:t xml:space="preserve"> (TEXT) - </w:t>
+      </w:r>
+      <w:r>
+        <w:rPr>
+          <w:rFonts w:ascii="Helvetica" w:eastAsiaTheme="minorEastAsia" w:hAnsi="Helvetica" w:cs="Times New Roman"/>
+          <w:color w:val="000000"/>
+          <w:lang w:eastAsia="en-US"/>
+        </w:rPr>
+        <w:t>PhoneNumber</w:t>
+      </w:r>
+      <w:r>
+        <w:rPr>
+          <w:rFonts w:ascii="Times New Roman" w:eastAsiaTheme="minorEastAsia" w:hAnsi="Times New Roman" w:cs="Times New Roman"/>
+          <w:color w:val="000000"/>
+          <w:lang w:eastAsia="en-US"/>
+        </w:rPr>
+        <w:t xml:space="preserve"> (</w:t>
+      </w:r>
+      <w:proofErr w:type="spellStart"/>
+      <w:r>
+        <w:rPr>
+          <w:rFonts w:ascii="Times New Roman" w:eastAsiaTheme="minorEastAsia" w:hAnsi="Times New Roman" w:cs="Times New Roman"/>
+          <w:color w:val="000000"/>
+          <w:lang w:eastAsia="en-US"/>
+        </w:rPr>
+        <w:t>VARCHAR</w:t>
+      </w:r>
+      <w:proofErr w:type="spellEnd"/>
+      <w:r>
+        <w:rPr>
+          <w:rFonts w:ascii="Times New Roman" w:eastAsiaTheme="minorEastAsia" w:hAnsi="Times New Roman" w:cs="Times New Roman"/>
+          <w:color w:val="000000"/>
+          <w:lang w:eastAsia="en-US"/>
+        </w:rPr>
+        <w:t xml:space="preserve">, UNIQUE) - </w:t>
+      </w:r>
+      <w:r>
+        <w:rPr>
+          <w:rFonts w:ascii="Helvetica" w:eastAsiaTheme="minorEastAsia" w:hAnsi="Helvetica" w:cs="Times New Roman"/>
+          <w:color w:val="000000"/>
+          <w:lang w:eastAsia="en-US"/>
+        </w:rPr>
+        <w:t>Email</w:t>
+      </w:r>
+    </w:p>
+    <w:p>
+      <w:pPr>
+        <w:spacing w:after="0" w:line="240" w:lineRule="auto"/>
+        <w:rPr>
+          <w:rFonts w:ascii="Times New Roman" w:eastAsiaTheme="minorEastAsia" w:hAnsi="Times New Roman" w:cs="Times New Roman"/>
+          <w:color w:val="000000"/>
+          <w:lang w:eastAsia="en-US"/>
+        </w:rPr>
+      </w:pPr>
+      <w:r>
+        <w:rPr>
+          <w:rFonts w:ascii="Times New Roman" w:eastAsiaTheme="minorEastAsia" w:hAnsi="Times New Roman" w:cs="Times New Roman"/>
+          <w:color w:val="000000"/>
+          <w:lang w:eastAsia="en-US"/>
+        </w:rPr>
+        <w:t>(</w:t>
+      </w:r>
+      <w:proofErr w:type="spellStart"/>
+      <w:r>
+        <w:rPr>
+          <w:rFonts w:ascii="Times New Roman" w:eastAsiaTheme="minorEastAsia" w:hAnsi="Times New Roman" w:cs="Times New Roman"/>
+          <w:color w:val="000000"/>
+          <w:lang w:eastAsia="en-US"/>
+        </w:rPr>
+        <w:t>VARCHAR</w:t>
+      </w:r>
+      <w:proofErr w:type="spellEnd"/>
+      <w:r>
+        <w:rPr>
+          <w:rFonts w:ascii="Times New Roman" w:eastAsiaTheme="minorEastAsia" w:hAnsi="Times New Roman" w:cs="Times New Roman"/>
+          <w:color w:val="000000"/>
+          <w:lang w:eastAsia="en-US"/>
+        </w:rPr>
+        <w:t>, UNIQUE)</w:t>
+      </w:r>
+    </w:p>
+    <w:p>
+      <w:pPr>
+        <w:spacing w:after="0" w:line="240" w:lineRule="auto"/>
+        <w:rPr>
+          <w:rFonts w:ascii="Times New Roman" w:eastAsiaTheme="minorEastAsia" w:hAnsi="Times New Roman" w:cs="Times New Roman"/>
+          <w:color w:val="000000"/>
+          <w:lang w:eastAsia="en-US"/>
+        </w:rPr>
+      </w:pPr>
+      <w:r>
+        <w:rPr>
+          <w:rFonts w:ascii="TimesNewRomanPS-BoldMT" w:eastAsiaTheme="minorEastAsia" w:hAnsi="TimesNewRomanPS-BoldMT" w:cs="Times New Roman"/>
+          <w:b/>
+          <w:bCs/>
+          <w:color w:val="000000"/>
+          <w:lang w:eastAsia="en-US"/>
+        </w:rPr>
+        <w:t>5. Appointment Table</w:t>
+      </w:r>
+      <w:r>
+        <w:rPr>
+          <w:rFonts w:ascii="Times New Roman" w:eastAsiaTheme="minorEastAsia" w:hAnsi="Times New Roman" w:cs="Times New Roman"/>
+          <w:color w:val="000000"/>
+          <w:lang w:eastAsia="en-US"/>
+        </w:rPr>
+        <w:t xml:space="preserve"> - </w:t>
+      </w:r>
+      <w:r>
+        <w:rPr>
+          <w:rFonts w:ascii="Helvetica" w:eastAsiaTheme="minorEastAsia" w:hAnsi="Helvetica" w:cs="Times New Roman"/>
+          <w:color w:val="000000"/>
+          <w:lang w:eastAsia="en-US"/>
+        </w:rPr>
+        <w:t>AppointmentID</w:t>
+      </w:r>
+      <w:r>
+        <w:rPr>
+          <w:rFonts w:ascii="Times New Roman" w:eastAsiaTheme="minorEastAsia" w:hAnsi="Times New Roman" w:cs="Times New Roman"/>
+          <w:color w:val="000000"/>
+          <w:lang w:eastAsia="en-US"/>
+        </w:rPr>
+        <w:t xml:space="preserve"> (Primary Key, INT) -</w:t>
+      </w:r>
+    </w:p>
+    <w:p>
+      <w:pPr>
+        <w:spacing w:after="0" w:line="240" w:lineRule="auto"/>
+        <w:rPr>
+          <w:rFonts w:ascii="Times New Roman" w:eastAsiaTheme="minorEastAsia" w:hAnsi="Times New Roman" w:cs="Times New Roman"/>
+          <w:color w:val="000000"/>
+          <w:lang w:eastAsia="en-US"/>
+        </w:rPr>
+      </w:pPr>
+      <w:r>
+        <w:rPr>
+          <w:rFonts w:ascii="Helvetica" w:eastAsiaTheme="minorEastAsia" w:hAnsi="Helvetica" w:cs="Times New Roman"/>
+          <w:color w:val="000000"/>
+          <w:lang w:eastAsia="en-US"/>
+        </w:rPr>
+        <w:t>PatientID</w:t>
+      </w:r>
+      <w:r>
+        <w:rPr>
+          <w:rFonts w:ascii="Times New Roman" w:eastAsiaTheme="minorEastAsia" w:hAnsi="Times New Roman" w:cs="Times New Roman"/>
+          <w:color w:val="000000"/>
+          <w:lang w:eastAsia="en-US"/>
+        </w:rPr>
+        <w:t xml:space="preserve"> (Foreign Key referencing Patient.PatientID) - </w:t>
+      </w:r>
+      <w:r>
+        <w:rPr>
+          <w:rFonts w:ascii="Helvetica" w:eastAsiaTheme="minorEastAsia" w:hAnsi="Helvetica" w:cs="Times New Roman"/>
+          <w:color w:val="000000"/>
+          <w:lang w:eastAsia="en-US"/>
+        </w:rPr>
+        <w:t>DoctorID</w:t>
+      </w:r>
+    </w:p>
+    <w:p>
+      <w:pPr>
+        <w:spacing w:after="0" w:line="240" w:lineRule="auto"/>
+        <w:rPr>
+          <w:rFonts w:ascii="Times New Roman" w:eastAsiaTheme="minorEastAsia" w:hAnsi="Times New Roman" w:cs="Times New Roman"/>
+          <w:color w:val="000000"/>
+          <w:lang w:eastAsia="en-US"/>
+        </w:rPr>
+      </w:pPr>
+      <w:r>
+        <w:rPr>
+          <w:rFonts w:ascii="Times New Roman" w:eastAsiaTheme="minorEastAsia" w:hAnsi="Times New Roman" w:cs="Times New Roman"/>
+          <w:color w:val="000000"/>
+          <w:lang w:eastAsia="en-US"/>
+        </w:rPr>
+        <w:t>(Foreign Key referencing</w:t>
+      </w:r>
+    </w:p>
+    <w:p>
+      <w:pPr>
+        <w:spacing w:after="0" w:line="240" w:lineRule="auto"/>
+        <w:rPr>
+          <w:rFonts w:ascii="Helvetica" w:eastAsiaTheme="minorEastAsia" w:hAnsi="Helvetica" w:cs="Times New Roman"/>
+          <w:color w:val="000000"/>
+          <w:lang w:eastAsia="en-US"/>
+        </w:rPr>
+      </w:pPr>
+      <w:r>
+        <w:rPr>
+          <w:rFonts w:ascii="Times New Roman" w:eastAsiaTheme="minorEastAsia" w:hAnsi="Times New Roman" w:cs="Times New Roman"/>
+          <w:color w:val="000000"/>
+          <w:lang w:eastAsia="en-US"/>
+        </w:rPr>
+        <w:t xml:space="preserve">Doctor.StaffID) - </w:t>
+      </w:r>
+      <w:r>
+        <w:rPr>
+          <w:rFonts w:ascii="Helvetica" w:eastAsiaTheme="minorEastAsia" w:hAnsi="Helvetica" w:cs="Times New Roman"/>
+          <w:color w:val="000000"/>
+          <w:lang w:eastAsia="en-US"/>
+        </w:rPr>
+        <w:t>AppointmentDate</w:t>
+      </w:r>
+      <w:r>
+        <w:rPr>
+          <w:rFonts w:ascii="Times New Roman" w:eastAsiaTheme="minorEastAsia" w:hAnsi="Times New Roman" w:cs="Times New Roman"/>
+          <w:color w:val="000000"/>
+          <w:lang w:eastAsia="en-US"/>
+        </w:rPr>
+        <w:t xml:space="preserve"> (DATE) - </w:t>
+      </w:r>
+      <w:r>
+        <w:rPr>
+          <w:rFonts w:ascii="Helvetica" w:eastAsiaTheme="minorEastAsia" w:hAnsi="Helvetica" w:cs="Times New Roman"/>
+          <w:color w:val="000000"/>
+          <w:lang w:eastAsia="en-US"/>
+        </w:rPr>
+        <w:t>AppointmentTime</w:t>
+      </w:r>
+    </w:p>
+    <w:p>
+      <w:pPr>
+        <w:spacing w:after="0" w:line="240" w:lineRule="auto"/>
+        <w:rPr>
+          <w:rFonts w:ascii="Times New Roman" w:eastAsiaTheme="minorEastAsia" w:hAnsi="Times New Roman" w:cs="Times New Roman"/>
+          <w:color w:val="000000"/>
+          <w:lang w:eastAsia="en-US"/>
+        </w:rPr>
+      </w:pPr>
+      <w:r>
+        <w:rPr>
+          <w:rFonts w:ascii="Times New Roman" w:eastAsiaTheme="minorEastAsia" w:hAnsi="Times New Roman" w:cs="Times New Roman"/>
+          <w:color w:val="000000"/>
+          <w:lang w:eastAsia="en-US"/>
+        </w:rPr>
+        <w:t xml:space="preserve">(TIME) - </w:t>
+      </w:r>
+      <w:r>
+        <w:rPr>
+          <w:rFonts w:ascii="Helvetica" w:eastAsiaTheme="minorEastAsia" w:hAnsi="Helvetica" w:cs="Times New Roman"/>
+          <w:color w:val="000000"/>
+          <w:lang w:eastAsia="en-US"/>
+        </w:rPr>
+        <w:t>Status</w:t>
+      </w:r>
+      <w:r>
+        <w:rPr>
+          <w:rFonts w:ascii="Times New Roman" w:eastAsiaTheme="minorEastAsia" w:hAnsi="Times New Roman" w:cs="Times New Roman"/>
+          <w:color w:val="000000"/>
+          <w:lang w:eastAsia="en-US"/>
+        </w:rPr>
+        <w:t xml:space="preserve"> (ENUM)</w:t>
+      </w:r>
+    </w:p>
+    <w:p>
+      <w:pPr>
+        <w:spacing w:after="0" w:line="240" w:lineRule="auto"/>
+        <w:rPr>
+          <w:rFonts w:ascii="Times New Roman" w:eastAsiaTheme="minorEastAsia" w:hAnsi="Times New Roman" w:cs="Times New Roman"/>
+          <w:color w:val="000000"/>
+          <w:lang w:eastAsia="en-US"/>
+        </w:rPr>
+      </w:pPr>
+      <w:r>
+        <w:rPr>
+          <w:rFonts w:ascii="TimesNewRomanPS-BoldMT" w:eastAsiaTheme="minorEastAsia" w:hAnsi="TimesNewRomanPS-BoldMT" w:cs="Times New Roman"/>
+          <w:b/>
+          <w:bCs/>
+          <w:color w:val="000000"/>
+          <w:lang w:eastAsia="en-US"/>
+        </w:rPr>
+        <w:t>6. Treatment Table</w:t>
+      </w:r>
+      <w:r>
+        <w:rPr>
+          <w:rFonts w:ascii="Times New Roman" w:eastAsiaTheme="minorEastAsia" w:hAnsi="Times New Roman" w:cs="Times New Roman"/>
+          <w:color w:val="000000"/>
+          <w:lang w:eastAsia="en-US"/>
+        </w:rPr>
+        <w:t xml:space="preserve"> - </w:t>
+      </w:r>
+      <w:r>
+        <w:rPr>
+          <w:rFonts w:ascii="Helvetica" w:eastAsiaTheme="minorEastAsia" w:hAnsi="Helvetica" w:cs="Times New Roman"/>
+          <w:color w:val="000000"/>
+          <w:lang w:eastAsia="en-US"/>
+        </w:rPr>
+        <w:t>TreatmentID</w:t>
+      </w:r>
+      <w:r>
+        <w:rPr>
+          <w:rFonts w:ascii="Times New Roman" w:eastAsiaTheme="minorEastAsia" w:hAnsi="Times New Roman" w:cs="Times New Roman"/>
+          <w:color w:val="000000"/>
+          <w:lang w:eastAsia="en-US"/>
+        </w:rPr>
+        <w:t xml:space="preserve"> (Primary Key, INT) -</w:t>
+      </w:r>
+    </w:p>
+    <w:p>
+      <w:pPr>
+        <w:spacing w:after="0" w:line="240" w:lineRule="auto"/>
+        <w:rPr>
+          <w:rFonts w:ascii="Times New Roman" w:eastAsiaTheme="minorEastAsia" w:hAnsi="Times New Roman" w:cs="Times New Roman"/>
+          <w:color w:val="000000"/>
+          <w:lang w:eastAsia="en-US"/>
+        </w:rPr>
+      </w:pPr>
+      <w:r>
+        <w:rPr>
+          <w:rFonts w:ascii="Helvetica" w:eastAsiaTheme="minorEastAsia" w:hAnsi="Helvetica" w:cs="Times New Roman"/>
+          <w:color w:val="000000"/>
+          <w:lang w:eastAsia="en-US"/>
+        </w:rPr>
+        <w:t>PatientID</w:t>
+      </w:r>
+      <w:r>
+        <w:rPr>
+          <w:rFonts w:ascii="Times New Roman" w:eastAsiaTheme="minorEastAsia" w:hAnsi="Times New Roman" w:cs="Times New Roman"/>
+          <w:color w:val="000000"/>
+          <w:lang w:eastAsia="en-US"/>
+        </w:rPr>
+        <w:t xml:space="preserve"> (Foreign Key referencing Patient.PatientID) - </w:t>
+      </w:r>
+      <w:r>
+        <w:rPr>
+          <w:rFonts w:ascii="Helvetica" w:eastAsiaTheme="minorEastAsia" w:hAnsi="Helvetica" w:cs="Times New Roman"/>
+          <w:color w:val="000000"/>
+          <w:lang w:eastAsia="en-US"/>
+        </w:rPr>
+        <w:t>DoctorID</w:t>
+      </w:r>
+    </w:p>
+    <w:p>
+      <w:pPr>
+        <w:spacing w:after="0" w:line="240" w:lineRule="auto"/>
+        <w:rPr>
+          <w:rFonts w:ascii="Times New Roman" w:eastAsiaTheme="minorEastAsia" w:hAnsi="Times New Roman" w:cs="Times New Roman"/>
+          <w:color w:val="000000"/>
+          <w:lang w:eastAsia="en-US"/>
+        </w:rPr>
+      </w:pPr>
+      <w:r>
+        <w:rPr>
+          <w:rFonts w:ascii="Times New Roman" w:eastAsiaTheme="minorEastAsia" w:hAnsi="Times New Roman" w:cs="Times New Roman"/>
+          <w:color w:val="000000"/>
+          <w:lang w:eastAsia="en-US"/>
+        </w:rPr>
+        <w:t xml:space="preserve">(Foreign Key referencing Doctor.StaffID) - </w:t>
+      </w:r>
+      <w:r>
+        <w:rPr>
+          <w:rFonts w:ascii="Helvetica" w:eastAsiaTheme="minorEastAsia" w:hAnsi="Helvetica" w:cs="Times New Roman"/>
+          <w:color w:val="000000"/>
+          <w:lang w:eastAsia="en-US"/>
+        </w:rPr>
+        <w:t>TreatmentName</w:t>
+      </w:r>
+    </w:p>
+    <w:p>
+      <w:pPr>
+        <w:spacing w:after="0" w:line="240" w:lineRule="auto"/>
+        <w:rPr>
+          <w:rFonts w:ascii="Times New Roman" w:eastAsiaTheme="minorEastAsia" w:hAnsi="Times New Roman" w:cs="Times New Roman"/>
+          <w:color w:val="000000"/>
+          <w:lang w:eastAsia="en-US"/>
+        </w:rPr>
+      </w:pPr>
+      <w:r>
+        <w:rPr>
+          <w:rFonts w:ascii="Times New Roman" w:eastAsiaTheme="minorEastAsia" w:hAnsi="Times New Roman" w:cs="Times New Roman"/>
+          <w:color w:val="000000"/>
+          <w:lang w:eastAsia="en-US"/>
+        </w:rPr>
+        <w:t>(</w:t>
+      </w:r>
+      <w:proofErr w:type="spellStart"/>
+      <w:r>
+        <w:rPr>
+          <w:rFonts w:ascii="Times New Roman" w:eastAsiaTheme="minorEastAsia" w:hAnsi="Times New Roman" w:cs="Times New Roman"/>
+          <w:color w:val="000000"/>
+          <w:lang w:eastAsia="en-US"/>
+        </w:rPr>
+        <w:t>VARCHAR</w:t>
+      </w:r>
+      <w:proofErr w:type="spellEnd"/>
+      <w:r>
+        <w:rPr>
+          <w:rFonts w:ascii="Times New Roman" w:eastAsiaTheme="minorEastAsia" w:hAnsi="Times New Roman" w:cs="Times New Roman"/>
+          <w:color w:val="000000"/>
+          <w:lang w:eastAsia="en-US"/>
+        </w:rPr>
+        <w:t xml:space="preserve">) - </w:t>
+      </w:r>
+      <w:r>
+        <w:rPr>
+          <w:rFonts w:ascii="Helvetica" w:eastAsiaTheme="minorEastAsia" w:hAnsi="Helvetica" w:cs="Times New Roman"/>
+          <w:color w:val="000000"/>
+          <w:lang w:eastAsia="en-US"/>
+        </w:rPr>
+        <w:t>Description</w:t>
+      </w:r>
+      <w:r>
+        <w:rPr>
+          <w:rFonts w:ascii="Times New Roman" w:eastAsiaTheme="minorEastAsia" w:hAnsi="Times New Roman" w:cs="Times New Roman"/>
+          <w:color w:val="000000"/>
+          <w:lang w:eastAsia="en-US"/>
+        </w:rPr>
+        <w:t xml:space="preserve"> (TEXT) - </w:t>
+      </w:r>
+      <w:r>
+        <w:rPr>
+          <w:rFonts w:ascii="Helvetica" w:eastAsiaTheme="minorEastAsia" w:hAnsi="Helvetica" w:cs="Times New Roman"/>
+          <w:color w:val="000000"/>
+          <w:lang w:eastAsia="en-US"/>
+        </w:rPr>
+        <w:t>Cost</w:t>
+      </w:r>
+      <w:r>
+        <w:rPr>
+          <w:rFonts w:ascii="Times New Roman" w:eastAsiaTheme="minorEastAsia" w:hAnsi="Times New Roman" w:cs="Times New Roman"/>
+          <w:color w:val="000000"/>
+          <w:lang w:eastAsia="en-US"/>
+        </w:rPr>
+        <w:t xml:space="preserve"> (DECIMAL)</w:t>
+      </w:r>
+    </w:p>
+    <w:p>
+      <w:pPr>
+        <w:spacing w:after="0" w:line="240" w:lineRule="auto"/>
+        <w:rPr>
+          <w:rFonts w:ascii="Times New Roman" w:eastAsiaTheme="minorEastAsia" w:hAnsi="Times New Roman" w:cs="Times New Roman"/>
+          <w:color w:val="000000"/>
+          <w:lang w:eastAsia="en-US"/>
+        </w:rPr>
+      </w:pPr>
+      <w:r>
+        <w:rPr>
+          <w:rFonts w:ascii="TimesNewRomanPS-BoldMT" w:eastAsiaTheme="minorEastAsia" w:hAnsi="TimesNewRomanPS-BoldMT" w:cs="Times New Roman"/>
+          <w:b/>
+          <w:bCs/>
+          <w:color w:val="000000"/>
+          <w:lang w:eastAsia="en-US"/>
+        </w:rPr>
+        <w:t>7. Medicine Table</w:t>
+      </w:r>
+      <w:r>
+        <w:rPr>
+          <w:rFonts w:ascii="Times New Roman" w:eastAsiaTheme="minorEastAsia" w:hAnsi="Times New Roman" w:cs="Times New Roman"/>
+          <w:color w:val="000000"/>
+          <w:lang w:eastAsia="en-US"/>
+        </w:rPr>
+        <w:t xml:space="preserve"> - </w:t>
+      </w:r>
+      <w:r>
+        <w:rPr>
+          <w:rFonts w:ascii="Helvetica" w:eastAsiaTheme="minorEastAsia" w:hAnsi="Helvetica" w:cs="Times New Roman"/>
+          <w:color w:val="000000"/>
+          <w:lang w:eastAsia="en-US"/>
+        </w:rPr>
+        <w:t>MedicineID</w:t>
+      </w:r>
+      <w:r>
+        <w:rPr>
+          <w:rFonts w:ascii="Times New Roman" w:eastAsiaTheme="minorEastAsia" w:hAnsi="Times New Roman" w:cs="Times New Roman"/>
+          <w:color w:val="000000"/>
+          <w:lang w:eastAsia="en-US"/>
+        </w:rPr>
+        <w:t xml:space="preserve"> (Primary Key, INT) -</w:t>
+      </w:r>
+    </w:p>
+    <w:p>
+      <w:pPr>
+        <w:spacing w:after="0" w:line="240" w:lineRule="auto"/>
+        <w:rPr>
+          <w:rFonts w:ascii="Times New Roman" w:eastAsiaTheme="minorEastAsia" w:hAnsi="Times New Roman" w:cs="Times New Roman"/>
+          <w:color w:val="000000"/>
+          <w:lang w:eastAsia="en-US"/>
+        </w:rPr>
+      </w:pPr>
+      <w:r>
+        <w:rPr>
+          <w:rFonts w:ascii="Helvetica" w:eastAsiaTheme="minorEastAsia" w:hAnsi="Helvetica" w:cs="Times New Roman"/>
+          <w:color w:val="000000"/>
+          <w:lang w:eastAsia="en-US"/>
+        </w:rPr>
+        <w:t>MedicineName</w:t>
+      </w:r>
+      <w:r>
+        <w:rPr>
+          <w:rFonts w:ascii="Times New Roman" w:eastAsiaTheme="minorEastAsia" w:hAnsi="Times New Roman" w:cs="Times New Roman"/>
+          <w:color w:val="000000"/>
+          <w:lang w:eastAsia="en-US"/>
+        </w:rPr>
+        <w:t xml:space="preserve"> (</w:t>
+      </w:r>
+      <w:proofErr w:type="spellStart"/>
+      <w:r>
+        <w:rPr>
+          <w:rFonts w:ascii="Times New Roman" w:eastAsiaTheme="minorEastAsia" w:hAnsi="Times New Roman" w:cs="Times New Roman"/>
+          <w:color w:val="000000"/>
+          <w:lang w:eastAsia="en-US"/>
+        </w:rPr>
+        <w:t>VARCHAR</w:t>
+      </w:r>
+      <w:proofErr w:type="spellEnd"/>
+      <w:r>
+        <w:rPr>
+          <w:rFonts w:ascii="Times New Roman" w:eastAsiaTheme="minorEastAsia" w:hAnsi="Times New Roman" w:cs="Times New Roman"/>
+          <w:color w:val="000000"/>
+          <w:lang w:eastAsia="en-US"/>
+        </w:rPr>
+        <w:t xml:space="preserve">) - </w:t>
+      </w:r>
+      <w:r>
+        <w:rPr>
+          <w:rFonts w:ascii="Helvetica" w:eastAsiaTheme="minorEastAsia" w:hAnsi="Helvetica" w:cs="Times New Roman"/>
+          <w:color w:val="000000"/>
+          <w:lang w:eastAsia="en-US"/>
+        </w:rPr>
+        <w:t>Dosage</w:t>
+      </w:r>
+      <w:r>
+        <w:rPr>
+          <w:rFonts w:ascii="Times New Roman" w:eastAsiaTheme="minorEastAsia" w:hAnsi="Times New Roman" w:cs="Times New Roman"/>
+          <w:color w:val="000000"/>
+          <w:lang w:eastAsia="en-US"/>
+        </w:rPr>
+        <w:t xml:space="preserve"> (</w:t>
+      </w:r>
+      <w:proofErr w:type="spellStart"/>
+      <w:r>
+        <w:rPr>
+          <w:rFonts w:ascii="Times New Roman" w:eastAsiaTheme="minorEastAsia" w:hAnsi="Times New Roman" w:cs="Times New Roman"/>
+          <w:color w:val="000000"/>
+          <w:lang w:eastAsia="en-US"/>
+        </w:rPr>
+        <w:t>VARCHAR</w:t>
+      </w:r>
+      <w:proofErr w:type="spellEnd"/>
+      <w:r>
+        <w:rPr>
+          <w:rFonts w:ascii="Times New Roman" w:eastAsiaTheme="minorEastAsia" w:hAnsi="Times New Roman" w:cs="Times New Roman"/>
+          <w:color w:val="000000"/>
+          <w:lang w:eastAsia="en-US"/>
+        </w:rPr>
+        <w:t>) -</w:t>
+      </w:r>
+    </w:p>
+    <w:p>
+      <w:pPr>
+        <w:spacing w:after="0" w:line="240" w:lineRule="auto"/>
+        <w:rPr>
+          <w:rFonts w:ascii="Times New Roman" w:eastAsiaTheme="minorEastAsia" w:hAnsi="Times New Roman" w:cs="Times New Roman"/>
+          <w:color w:val="000000"/>
+          <w:lang w:eastAsia="en-US"/>
+        </w:rPr>
+      </w:pPr>
+      <w:r>
+        <w:rPr>
+          <w:rFonts w:ascii="Helvetica" w:eastAsiaTheme="minorEastAsia" w:hAnsi="Helvetica" w:cs="Times New Roman"/>
+          <w:color w:val="000000"/>
+          <w:lang w:eastAsia="en-US"/>
+        </w:rPr>
+        <w:t>StockQuantity</w:t>
+      </w:r>
+      <w:r>
+        <w:rPr>
+          <w:rFonts w:ascii="Times New Roman" w:eastAsiaTheme="minorEastAsia" w:hAnsi="Times New Roman" w:cs="Times New Roman"/>
+          <w:color w:val="000000"/>
+          <w:lang w:eastAsia="en-US"/>
+        </w:rPr>
+        <w:t xml:space="preserve"> (INT) - </w:t>
+      </w:r>
+      <w:r>
+        <w:rPr>
+          <w:rFonts w:ascii="Helvetica" w:eastAsiaTheme="minorEastAsia" w:hAnsi="Helvetica" w:cs="Times New Roman"/>
+          <w:color w:val="000000"/>
+          <w:lang w:eastAsia="en-US"/>
+        </w:rPr>
+        <w:t>Price</w:t>
+      </w:r>
+      <w:r>
+        <w:rPr>
+          <w:rFonts w:ascii="Times New Roman" w:eastAsiaTheme="minorEastAsia" w:hAnsi="Times New Roman" w:cs="Times New Roman"/>
+          <w:color w:val="000000"/>
+          <w:lang w:eastAsia="en-US"/>
+        </w:rPr>
+        <w:t xml:space="preserve"> (DECIMAL)</w:t>
+      </w:r>
+    </w:p>
+    <w:p>
+      <w:pPr>
+        <w:spacing w:after="0" w:line="240" w:lineRule="auto"/>
+        <w:rPr>
+          <w:rFonts w:ascii="Times New Roman" w:eastAsiaTheme="minorEastAsia" w:hAnsi="Times New Roman" w:cs="Times New Roman"/>
+          <w:color w:val="000000"/>
+          <w:lang w:eastAsia="en-US"/>
+        </w:rPr>
+      </w:pPr>
+      <w:r>
+        <w:rPr>
+          <w:rFonts w:ascii="TimesNewRomanPS-BoldMT" w:eastAsiaTheme="minorEastAsia" w:hAnsi="TimesNewRomanPS-BoldMT" w:cs="Times New Roman"/>
+          <w:b/>
+          <w:bCs/>
+          <w:color w:val="000000"/>
+          <w:lang w:eastAsia="en-US"/>
+        </w:rPr>
+        <w:t>8. TreatmentMedicine Table (Junction Table)</w:t>
+      </w:r>
+      <w:r>
+        <w:rPr>
+          <w:rFonts w:ascii="Times New Roman" w:eastAsiaTheme="minorEastAsia" w:hAnsi="Times New Roman" w:cs="Times New Roman"/>
+          <w:color w:val="000000"/>
+          <w:lang w:eastAsia="en-US"/>
+        </w:rPr>
+        <w:t xml:space="preserve"> - </w:t>
+      </w:r>
+      <w:r>
+        <w:rPr>
+          <w:rFonts w:ascii="Helvetica" w:eastAsiaTheme="minorEastAsia" w:hAnsi="Helvetica" w:cs="Times New Roman"/>
+          <w:color w:val="000000"/>
+          <w:lang w:eastAsia="en-US"/>
+        </w:rPr>
+        <w:t>TreatmentID</w:t>
+      </w:r>
+    </w:p>
+    <w:p>
+      <w:pPr>
+        <w:spacing w:after="0" w:line="240" w:lineRule="auto"/>
+        <w:rPr>
+          <w:rFonts w:ascii="Times New Roman" w:eastAsiaTheme="minorEastAsia" w:hAnsi="Times New Roman" w:cs="Times New Roman"/>
+          <w:color w:val="000000"/>
+          <w:lang w:eastAsia="en-US"/>
+        </w:rPr>
+      </w:pPr>
+      <w:r>
+        <w:rPr>
+          <w:rFonts w:ascii="Times New Roman" w:eastAsiaTheme="minorEastAsia" w:hAnsi="Times New Roman" w:cs="Times New Roman"/>
+          <w:color w:val="000000"/>
+          <w:lang w:eastAsia="en-US"/>
+        </w:rPr>
+        <w:t xml:space="preserve">(Foreign Key referencing Treatment.TreatmentID) - </w:t>
+      </w:r>
+      <w:r>
+        <w:rPr>
+          <w:rFonts w:ascii="Helvetica" w:eastAsiaTheme="minorEastAsia" w:hAnsi="Helvetica" w:cs="Times New Roman"/>
+          <w:color w:val="000000"/>
+          <w:lang w:eastAsia="en-US"/>
+        </w:rPr>
+        <w:t>MedicineID</w:t>
+      </w:r>
+    </w:p>
+    <w:p>
+      <w:pPr>
+        <w:spacing w:after="0" w:line="240" w:lineRule="auto"/>
+        <w:rPr>
+          <w:rFonts w:ascii="Times New Roman" w:eastAsiaTheme="minorEastAsia" w:hAnsi="Times New Roman" w:cs="Times New Roman"/>
+          <w:color w:val="000000"/>
+          <w:lang w:eastAsia="en-US"/>
+        </w:rPr>
+      </w:pPr>
+      <w:r>
+        <w:rPr>
+          <w:rFonts w:ascii="Times New Roman" w:eastAsiaTheme="minorEastAsia" w:hAnsi="Times New Roman" w:cs="Times New Roman"/>
+          <w:color w:val="000000"/>
+          <w:lang w:eastAsia="en-US"/>
+        </w:rPr>
+        <w:t xml:space="preserve">(Foreign Key referencing Medicine.MedicineID) - </w:t>
+      </w:r>
+      <w:r>
+        <w:rPr>
+          <w:rFonts w:ascii="Helvetica" w:eastAsiaTheme="minorEastAsia" w:hAnsi="Helvetica" w:cs="Times New Roman"/>
+          <w:color w:val="000000"/>
+          <w:lang w:eastAsia="en-US"/>
+        </w:rPr>
+        <w:t>Quantity</w:t>
+      </w:r>
+      <w:r>
+        <w:rPr>
+          <w:rFonts w:ascii="Times New Roman" w:eastAsiaTheme="minorEastAsia" w:hAnsi="Times New Roman" w:cs="Times New Roman"/>
+          <w:color w:val="000000"/>
+          <w:lang w:eastAsia="en-US"/>
+        </w:rPr>
+        <w:t xml:space="preserve"> (INT) -</w:t>
+      </w:r>
+    </w:p>
+    <w:p>
+      <w:pPr>
+        <w:spacing w:after="0" w:line="240" w:lineRule="auto"/>
+        <w:rPr>
+          <w:rFonts w:ascii="Times New Roman" w:eastAsiaTheme="minorEastAsia" w:hAnsi="Times New Roman" w:cs="Times New Roman"/>
+          <w:color w:val="000000"/>
+          <w:lang w:eastAsia="en-US"/>
+        </w:rPr>
+      </w:pPr>
+      <w:r>
+        <w:rPr>
+          <w:rFonts w:ascii="Times New Roman" w:eastAsiaTheme="minorEastAsia" w:hAnsi="Times New Roman" w:cs="Times New Roman"/>
+          <w:color w:val="000000"/>
+          <w:lang w:eastAsia="en-US"/>
+        </w:rPr>
+        <w:t>Primary Key is composite (</w:t>
+      </w:r>
+      <w:r>
+        <w:rPr>
+          <w:rFonts w:ascii="Helvetica" w:eastAsiaTheme="minorEastAsia" w:hAnsi="Helvetica" w:cs="Times New Roman"/>
+          <w:color w:val="000000"/>
+          <w:lang w:eastAsia="en-US"/>
+        </w:rPr>
+        <w:t>TreatmentID</w:t>
+      </w:r>
+      <w:r>
+        <w:rPr>
+          <w:rFonts w:ascii="Times New Roman" w:eastAsiaTheme="minorEastAsia" w:hAnsi="Times New Roman" w:cs="Times New Roman"/>
+          <w:color w:val="000000"/>
+          <w:lang w:eastAsia="en-US"/>
+        </w:rPr>
+        <w:t xml:space="preserve">, </w:t>
+      </w:r>
+      <w:r>
+        <w:rPr>
+          <w:rFonts w:ascii="Helvetica" w:eastAsiaTheme="minorEastAsia" w:hAnsi="Helvetica" w:cs="Times New Roman"/>
+          <w:color w:val="000000"/>
+          <w:lang w:eastAsia="en-US"/>
+        </w:rPr>
+        <w:t>MedicineID</w:t>
+      </w:r>
+      <w:r>
+        <w:rPr>
+          <w:rFonts w:ascii="Times New Roman" w:eastAsiaTheme="minorEastAsia" w:hAnsi="Times New Roman" w:cs="Times New Roman"/>
+          <w:color w:val="000000"/>
+          <w:lang w:eastAsia="en-US"/>
+        </w:rPr>
+        <w:t>)</w:t>
+      </w:r>
+    </w:p>
+    <w:p>
+      <w:pPr>
+        <w:spacing w:after="0" w:line="240" w:lineRule="auto"/>
+        <w:rPr>
+          <w:rFonts w:ascii="Times New Roman" w:eastAsiaTheme="minorEastAsia" w:hAnsi="Times New Roman" w:cs="Times New Roman"/>
+          <w:color w:val="000000"/>
+          <w:lang w:eastAsia="en-US"/>
+        </w:rPr>
+      </w:pPr>
+      <w:r>
+        <w:rPr>
+          <w:rFonts w:ascii="TimesNewRomanPS-BoldMT" w:eastAsiaTheme="minorEastAsia" w:hAnsi="TimesNewRomanPS-BoldMT" w:cs="Times New Roman"/>
+          <w:b/>
+          <w:bCs/>
+          <w:color w:val="000000"/>
+          <w:lang w:eastAsia="en-US"/>
+        </w:rPr>
+        <w:t>9. Payment Table</w:t>
+      </w:r>
+      <w:r>
+        <w:rPr>
+          <w:rFonts w:ascii="Times New Roman" w:eastAsiaTheme="minorEastAsia" w:hAnsi="Times New Roman" w:cs="Times New Roman"/>
+          <w:color w:val="000000"/>
+          <w:lang w:eastAsia="en-US"/>
+        </w:rPr>
+        <w:t xml:space="preserve"> - </w:t>
+      </w:r>
+      <w:r>
+        <w:rPr>
+          <w:rFonts w:ascii="Helvetica" w:eastAsiaTheme="minorEastAsia" w:hAnsi="Helvetica" w:cs="Times New Roman"/>
+          <w:color w:val="000000"/>
+          <w:lang w:eastAsia="en-US"/>
+        </w:rPr>
+        <w:t>PaymentID</w:t>
+      </w:r>
+      <w:r>
+        <w:rPr>
+          <w:rFonts w:ascii="Times New Roman" w:eastAsiaTheme="minorEastAsia" w:hAnsi="Times New Roman" w:cs="Times New Roman"/>
+          <w:color w:val="000000"/>
+          <w:lang w:eastAsia="en-US"/>
+        </w:rPr>
+        <w:t xml:space="preserve"> (Primary Key, INT) - </w:t>
+      </w:r>
+      <w:r>
+        <w:rPr>
+          <w:rFonts w:ascii="Helvetica" w:eastAsiaTheme="minorEastAsia" w:hAnsi="Helvetica" w:cs="Times New Roman"/>
+          <w:color w:val="000000"/>
+          <w:lang w:eastAsia="en-US"/>
+        </w:rPr>
+        <w:t>PatientID</w:t>
+      </w:r>
+    </w:p>
+    <w:p>
+      <w:pPr>
+        <w:spacing w:after="0" w:line="240" w:lineRule="auto"/>
+        <w:rPr>
+          <w:rFonts w:ascii="Times New Roman" w:eastAsiaTheme="minorEastAsia" w:hAnsi="Times New Roman" w:cs="Times New Roman"/>
+          <w:color w:val="000000"/>
+          <w:lang w:eastAsia="en-US"/>
+        </w:rPr>
+      </w:pPr>
+      <w:r>
+        <w:rPr>
+          <w:rFonts w:ascii="Times New Roman" w:eastAsiaTheme="minorEastAsia" w:hAnsi="Times New Roman" w:cs="Times New Roman"/>
+          <w:color w:val="000000"/>
+          <w:lang w:eastAsia="en-US"/>
+        </w:rPr>
+        <w:t xml:space="preserve">(Foreign Key referencing Patient.PatientID) - </w:t>
+      </w:r>
+      <w:r>
+        <w:rPr>
+          <w:rFonts w:ascii="Helvetica" w:eastAsiaTheme="minorEastAsia" w:hAnsi="Helvetica" w:cs="Times New Roman"/>
+          <w:color w:val="000000"/>
+          <w:lang w:eastAsia="en-US"/>
+        </w:rPr>
+        <w:t>AppointmentID</w:t>
+      </w:r>
+    </w:p>
+    <w:p>
+      <w:pPr>
+        <w:spacing w:after="0" w:line="240" w:lineRule="auto"/>
+        <w:rPr>
+          <w:rFonts w:ascii="Times New Roman" w:eastAsiaTheme="minorEastAsia" w:hAnsi="Times New Roman" w:cs="Times New Roman"/>
+          <w:color w:val="000000"/>
+          <w:lang w:eastAsia="en-US"/>
+        </w:rPr>
+      </w:pPr>
+      <w:r>
+        <w:rPr>
+          <w:rFonts w:ascii="Times New Roman" w:eastAsiaTheme="minorEastAsia" w:hAnsi="Times New Roman" w:cs="Times New Roman"/>
+          <w:color w:val="000000"/>
+          <w:lang w:eastAsia="en-US"/>
+        </w:rPr>
+        <w:t xml:space="preserve">(Foreign Key referencing Appointment.AppointmentID) - </w:t>
+      </w:r>
+      <w:r>
+        <w:rPr>
+          <w:rFonts w:ascii="Helvetica" w:eastAsiaTheme="minorEastAsia" w:hAnsi="Helvetica" w:cs="Times New Roman"/>
+          <w:color w:val="000000"/>
+          <w:lang w:eastAsia="en-US"/>
+        </w:rPr>
+        <w:t>Amount</w:t>
+      </w:r>
+    </w:p>
+    <w:p>
+      <w:pPr>
+        <w:spacing w:after="0" w:line="240" w:lineRule="auto"/>
+        <w:rPr>
+          <w:rFonts w:ascii="Times New Roman" w:eastAsiaTheme="minorEastAsia" w:hAnsi="Times New Roman" w:cs="Times New Roman"/>
+          <w:color w:val="000000"/>
+          <w:lang w:eastAsia="en-US"/>
+        </w:rPr>
+      </w:pPr>
+      <w:r>
+        <w:rPr>
+          <w:rFonts w:ascii="Times New Roman" w:eastAsiaTheme="minorEastAsia" w:hAnsi="Times New Roman" w:cs="Times New Roman"/>
+          <w:color w:val="000000"/>
+          <w:lang w:eastAsia="en-US"/>
+        </w:rPr>
+        <w:t xml:space="preserve">(DECIMAL) - </w:t>
+      </w:r>
+      <w:r>
+        <w:rPr>
+          <w:rFonts w:ascii="Helvetica" w:eastAsiaTheme="minorEastAsia" w:hAnsi="Helvetica" w:cs="Times New Roman"/>
+          <w:color w:val="000000"/>
+          <w:lang w:eastAsia="en-US"/>
+        </w:rPr>
+        <w:t>PaymentDate</w:t>
+      </w:r>
+      <w:r>
+        <w:rPr>
+          <w:rFonts w:ascii="Times New Roman" w:eastAsiaTheme="minorEastAsia" w:hAnsi="Times New Roman" w:cs="Times New Roman"/>
+          <w:color w:val="000000"/>
+          <w:lang w:eastAsia="en-US"/>
+        </w:rPr>
+        <w:t xml:space="preserve"> (DATE) - </w:t>
+      </w:r>
+      <w:r>
+        <w:rPr>
+          <w:rFonts w:ascii="Helvetica" w:eastAsiaTheme="minorEastAsia" w:hAnsi="Helvetica" w:cs="Times New Roman"/>
+          <w:color w:val="000000"/>
+          <w:lang w:eastAsia="en-US"/>
+        </w:rPr>
+        <w:t>PaymentMethod</w:t>
+      </w:r>
+      <w:r>
+        <w:rPr>
+          <w:rFonts w:ascii="Times New Roman" w:eastAsiaTheme="minorEastAsia" w:hAnsi="Times New Roman" w:cs="Times New Roman"/>
+          <w:color w:val="000000"/>
+          <w:lang w:eastAsia="en-US"/>
+        </w:rPr>
+        <w:t xml:space="preserve"> (ENUM) -</w:t>
+      </w:r>
+    </w:p>
+    <w:p>
+      <w:pPr>
+        <w:spacing w:after="0" w:line="240" w:lineRule="auto"/>
+        <w:rPr>
+          <w:rFonts w:ascii="Times New Roman" w:eastAsiaTheme="minorEastAsia" w:hAnsi="Times New Roman" w:cs="Times New Roman"/>
+          <w:color w:val="000000"/>
+          <w:lang w:eastAsia="en-US"/>
+        </w:rPr>
+      </w:pPr>
+      <w:r>
+        <w:rPr>
+          <w:rFonts w:ascii="Helvetica" w:eastAsiaTheme="minorEastAsia" w:hAnsi="Helvetica" w:cs="Times New Roman"/>
+          <w:color w:val="000000"/>
+          <w:lang w:eastAsia="en-US"/>
+        </w:rPr>
+        <w:t>Status</w:t>
+      </w:r>
+      <w:r>
+        <w:rPr>
+          <w:rFonts w:ascii="Times New Roman" w:eastAsiaTheme="minorEastAsia" w:hAnsi="Times New Roman" w:cs="Times New Roman"/>
+          <w:color w:val="000000"/>
+          <w:lang w:eastAsia="en-US"/>
+        </w:rPr>
+        <w:t xml:space="preserve"> (ENUM)</w:t>
+      </w:r>
+    </w:p>
+    <w:p>
+      <w:pPr>
+        <w:pStyle w:val="a"/>
+        <w:numPr>
+          <w:ilvl w:val="0"/>
+          <w:numId w:val="0"/>
+        </w:numPr>
+        <w:ind w:left="576" w:hanging="288"/>
+        <w:rPr>
+          <w:rFonts w:ascii="Times New Roman" w:hAnsi="Times New Roman" w:cs="Times New Roman"/>
+          <w:sz w:val="24"/>
+          <w:szCs w:val="24"/>
+        </w:rPr>
+      </w:pPr>
     </w:p>
     <w:p>
       <w:pPr>
@@ -5607,7 +7475,25 @@
           <w:sz w:val="24"/>
           <w:szCs w:val="24"/>
         </w:rPr>
-        <w:t>Google Colab notebook (if applicable): [link]</w:t>
+        <w:t xml:space="preserve">Google </w:t>
+      </w:r>
+      <w:proofErr w:type="spellStart"/>
+      <w:r>
+        <w:rPr>
+          <w:rFonts w:ascii="Times New Roman" w:hAnsi="Times New Roman" w:cs="Times New Roman"/>
+          <w:sz w:val="24"/>
+          <w:szCs w:val="24"/>
+        </w:rPr>
+        <w:t>Colab</w:t>
+      </w:r>
+      <w:proofErr w:type="spellEnd"/>
+      <w:r>
+        <w:rPr>
+          <w:rFonts w:ascii="Times New Roman" w:hAnsi="Times New Roman" w:cs="Times New Roman"/>
+          <w:sz w:val="24"/>
+          <w:szCs w:val="24"/>
+        </w:rPr>
+        <w:t xml:space="preserve"> notebook (if applicable): [link]</w:t>
       </w:r>
     </w:p>
     <w:p>
@@ -5640,7 +7526,7 @@
       </w:pPr>
     </w:p>
     <w:sectPr>
-      <w:headerReference w:type="default" r:id="rId15"/>
+      <w:headerReference w:type="default" r:id="rId16"/>
       <w:pgSz w:w="12240" w:h="15840" w:code="1"/>
       <w:pgMar w:top="1080" w:right="720" w:bottom="1800" w:left="3096" w:header="1080" w:footer="720" w:gutter="0"/>
       <w:pgNumType w:start="1"/>
@@ -5652,7 +7538,7 @@
 </file>
 
 <file path=word/endnotes.xml><?xml version="1.0" encoding="utf-8"?>
-<w:endnotes xmlns:wpc="http://schemas.microsoft.com/office/word/2010/wordprocessingCanvas" xmlns:cx="http://schemas.microsoft.com/office/drawing/2014/chartex" xmlns:cx1="http://schemas.microsoft.com/office/drawing/2015/9/8/chartex" xmlns:cx2="http://schemas.microsoft.com/office/drawing/2015/10/21/chartex" xmlns:cx3="http://schemas.microsoft.com/office/drawing/2016/5/9/chartex" xmlns:cx4="http://schemas.microsoft.com/office/drawing/2016/5/10/chartex" xmlns:cx5="http://schemas.microsoft.com/office/drawing/2016/5/11/chartex" xmlns:cx6="http://schemas.microsoft.com/office/drawing/2016/5/12/chartex" xmlns:cx7="http://schemas.microsoft.com/office/drawing/2016/5/13/chartex" xmlns:cx8="http://schemas.microsoft.com/office/drawing/2016/5/14/chartex" xmlns:mc="http://schemas.openxmlformats.org/markup-compatibility/2006" xmlns:aink="http://schemas.microsoft.com/office/drawing/2016/ink" xmlns:am3d="http://schemas.microsoft.com/office/drawing/2017/model3d" xmlns:o="urn:schemas-microsoft-com:office:office" xmlns:oel="http://schemas.microsoft.com/office/2019/extlst" xmlns:r="http://schemas.openxmlformats.org/officeDocument/2006/relationships" xmlns:m="http://schemas.openxmlformats.org/officeDocument/2006/math" xmlns:v="urn:schemas-microsoft-com:vml" xmlns:wp14="http://schemas.microsoft.com/office/word/2010/wordprocessingDrawing" xmlns:wp="http://schemas.openxmlformats.org/drawingml/2006/wordprocessingDrawing" xmlns:w10="urn:schemas-microsoft-com:office:word" xmlns:w="http://schemas.openxmlformats.org/wordprocessingml/2006/main" xmlns:w14="http://schemas.microsoft.com/office/word/2010/wordml" xmlns:w15="http://schemas.microsoft.com/office/word/2012/wordml" xmlns:w16cei="http://schemas.microsoft.com/office/word/2026/wordml/cei" xmlns:w16cex="http://schemas.microsoft.com/office/word/2018/wordml/cex" xmlns:w16cid="http://schemas.microsoft.com/office/word/2016/wordml/cid" xmlns:w16="http://schemas.microsoft.com/office/word/2018/wordml" xmlns:w16du="http://schemas.microsoft.com/office/word/2023/wordml/word16du" xmlns:w16sdtdh="http://schemas.microsoft.com/office/word/2020/wordml/sdtdatahash" xmlns:w16sdtfl="http://schemas.microsoft.com/office/word/2024/wordml/sdtformatlock" xmlns:w16se="http://schemas.microsoft.com/office/word/2015/wordml/symex" xmlns:wpg="http://schemas.microsoft.com/office/word/2010/wordprocessingGroup" xmlns:wpi="http://schemas.microsoft.com/office/word/2010/wordprocessingInk" xmlns:wne="http://schemas.microsoft.com/office/word/2006/wordml" xmlns:wps="http://schemas.microsoft.com/office/word/2010/wordprocessingShape" mc:Ignorable="w14 w15 w16se w16cid w16 w16cex w16sdtdh w16sdtfl w16du wp14">
+<w:endnotes xmlns:wpc="http://schemas.microsoft.com/office/word/2010/wordprocessingCanvas" xmlns:cx="http://schemas.microsoft.com/office/drawing/2014/chartex" xmlns:cx1="http://schemas.microsoft.com/office/drawing/2015/9/8/chartex" xmlns:cx2="http://schemas.microsoft.com/office/drawing/2015/10/21/chartex" xmlns:cx3="http://schemas.microsoft.com/office/drawing/2016/5/9/chartex" xmlns:cx4="http://schemas.microsoft.com/office/drawing/2016/5/10/chartex" xmlns:cx5="http://schemas.microsoft.com/office/drawing/2016/5/11/chartex" xmlns:cx6="http://schemas.microsoft.com/office/drawing/2016/5/12/chartex" xmlns:cx7="http://schemas.microsoft.com/office/drawing/2016/5/13/chartex" xmlns:cx8="http://schemas.microsoft.com/office/drawing/2016/5/14/chartex" xmlns:mc="http://schemas.openxmlformats.org/markup-compatibility/2006" xmlns:m="http://schemas.openxmlformats.org/officeDocument/2006/math" xmlns:aink="http://schemas.microsoft.com/office/drawing/2016/ink" xmlns:am3d="http://schemas.microsoft.com/office/drawing/2017/model3d" xmlns:oel="http://schemas.microsoft.com/office/2019/extlst" xmlns:r="http://schemas.openxmlformats.org/officeDocument/2006/relationships" xmlns:wp14="http://schemas.microsoft.com/office/word/2010/wordprocessingDrawing" xmlns:wp="http://schemas.openxmlformats.org/drawingml/2006/wordprocessingDrawing" xmlns:wpg="http://schemas.microsoft.com/office/word/2010/wordprocessingGroup" xmlns:wpi="http://schemas.microsoft.com/office/word/2010/wordprocessingInk" xmlns:wps="http://schemas.microsoft.com/office/word/2010/wordprocessingShape" xmlns:o="urn:schemas-microsoft-com:office:office" xmlns:v="urn:schemas-microsoft-com:vml" xmlns:w10="urn:schemas-microsoft-com:office:word" xmlns:w="http://schemas.openxmlformats.org/wordprocessingml/2006/main" xmlns:w14="http://schemas.microsoft.com/office/word/2010/wordml" xmlns:w15="http://schemas.microsoft.com/office/word/2012/wordml" xmlns:w16cex="http://schemas.microsoft.com/office/word/2018/wordml/cex" xmlns:w16cid="http://schemas.microsoft.com/office/word/2016/wordml/cid" xmlns:w16="http://schemas.microsoft.com/office/word/2018/wordml" xmlns:w16sdtdh="http://schemas.microsoft.com/office/word/2020/wordml/sdtdatahash" xmlns:w16sdtfl="http://schemas.microsoft.com/office/word/2024/wordml/sdtformatlock" xmlns:w16se="http://schemas.microsoft.com/office/word/2015/wordml/symex" xmlns:w16du="http://schemas.microsoft.com/office/word/2023/wordml/word16du" xmlns:wne="http://schemas.microsoft.com/office/word/2006/wordml" mc:Ignorable="w14 w15 w16se w16cid w16 w16cex w16sdtdh w16sdtfl w16du wp14">
   <w:endnote w:type="separator" w:id="-1">
     <w:p>
       <w:pPr>
@@ -5681,7 +7567,7 @@
 </file>
 
 <file path=word/footer1.xml><?xml version="1.0" encoding="utf-8"?>
-<w:ftr xmlns:wpc="http://schemas.microsoft.com/office/word/2010/wordprocessingCanvas" xmlns:cx="http://schemas.microsoft.com/office/drawing/2014/chartex" xmlns:cx1="http://schemas.microsoft.com/office/drawing/2015/9/8/chartex" xmlns:cx2="http://schemas.microsoft.com/office/drawing/2015/10/21/chartex" xmlns:cx3="http://schemas.microsoft.com/office/drawing/2016/5/9/chartex" xmlns:cx4="http://schemas.microsoft.com/office/drawing/2016/5/10/chartex" xmlns:cx5="http://schemas.microsoft.com/office/drawing/2016/5/11/chartex" xmlns:cx6="http://schemas.microsoft.com/office/drawing/2016/5/12/chartex" xmlns:cx7="http://schemas.microsoft.com/office/drawing/2016/5/13/chartex" xmlns:cx8="http://schemas.microsoft.com/office/drawing/2016/5/14/chartex" xmlns:mc="http://schemas.openxmlformats.org/markup-compatibility/2006" xmlns:aink="http://schemas.microsoft.com/office/drawing/2016/ink" xmlns:am3d="http://schemas.microsoft.com/office/drawing/2017/model3d" xmlns:o="urn:schemas-microsoft-com:office:office" xmlns:oel="http://schemas.microsoft.com/office/2019/extlst" xmlns:r="http://schemas.openxmlformats.org/officeDocument/2006/relationships" xmlns:m="http://schemas.openxmlformats.org/officeDocument/2006/math" xmlns:v="urn:schemas-microsoft-com:vml" xmlns:wp14="http://schemas.microsoft.com/office/word/2010/wordprocessingDrawing" xmlns:wp="http://schemas.openxmlformats.org/drawingml/2006/wordprocessingDrawing" xmlns:w10="urn:schemas-microsoft-com:office:word" xmlns:w="http://schemas.openxmlformats.org/wordprocessingml/2006/main" xmlns:w14="http://schemas.microsoft.com/office/word/2010/wordml" xmlns:w15="http://schemas.microsoft.com/office/word/2012/wordml" xmlns:w16cei="http://schemas.microsoft.com/office/word/2026/wordml/cei" xmlns:w16cex="http://schemas.microsoft.com/office/word/2018/wordml/cex" xmlns:w16cid="http://schemas.microsoft.com/office/word/2016/wordml/cid" xmlns:w16="http://schemas.microsoft.com/office/word/2018/wordml" xmlns:w16du="http://schemas.microsoft.com/office/word/2023/wordml/word16du" xmlns:w16sdtdh="http://schemas.microsoft.com/office/word/2020/wordml/sdtdatahash" xmlns:w16sdtfl="http://schemas.microsoft.com/office/word/2024/wordml/sdtformatlock" xmlns:w16se="http://schemas.microsoft.com/office/word/2015/wordml/symex" xmlns:wpg="http://schemas.microsoft.com/office/word/2010/wordprocessingGroup" xmlns:wpi="http://schemas.microsoft.com/office/word/2010/wordprocessingInk" xmlns:wne="http://schemas.microsoft.com/office/word/2006/wordml" xmlns:wps="http://schemas.microsoft.com/office/word/2010/wordprocessingShape" mc:Ignorable="w14 w15 w16se w16cid w16 w16cex w16sdtdh w16sdtfl w16du wp14">
+<w:ftr xmlns:wpc="http://schemas.microsoft.com/office/word/2010/wordprocessingCanvas" xmlns:cx="http://schemas.microsoft.com/office/drawing/2014/chartex" xmlns:cx1="http://schemas.microsoft.com/office/drawing/2015/9/8/chartex" xmlns:cx2="http://schemas.microsoft.com/office/drawing/2015/10/21/chartex" xmlns:cx3="http://schemas.microsoft.com/office/drawing/2016/5/9/chartex" xmlns:cx4="http://schemas.microsoft.com/office/drawing/2016/5/10/chartex" xmlns:cx5="http://schemas.microsoft.com/office/drawing/2016/5/11/chartex" xmlns:cx6="http://schemas.microsoft.com/office/drawing/2016/5/12/chartex" xmlns:cx7="http://schemas.microsoft.com/office/drawing/2016/5/13/chartex" xmlns:cx8="http://schemas.microsoft.com/office/drawing/2016/5/14/chartex" xmlns:mc="http://schemas.openxmlformats.org/markup-compatibility/2006" xmlns:m="http://schemas.openxmlformats.org/officeDocument/2006/math" xmlns:aink="http://schemas.microsoft.com/office/drawing/2016/ink" xmlns:am3d="http://schemas.microsoft.com/office/drawing/2017/model3d" xmlns:oel="http://schemas.microsoft.com/office/2019/extlst" xmlns:r="http://schemas.openxmlformats.org/officeDocument/2006/relationships" xmlns:wp14="http://schemas.microsoft.com/office/word/2010/wordprocessingDrawing" xmlns:wp="http://schemas.openxmlformats.org/drawingml/2006/wordprocessingDrawing" xmlns:wpg="http://schemas.microsoft.com/office/word/2010/wordprocessingGroup" xmlns:wpi="http://schemas.microsoft.com/office/word/2010/wordprocessingInk" xmlns:wps="http://schemas.microsoft.com/office/word/2010/wordprocessingShape" xmlns:o="urn:schemas-microsoft-com:office:office" xmlns:v="urn:schemas-microsoft-com:vml" xmlns:w10="urn:schemas-microsoft-com:office:word" xmlns:w="http://schemas.openxmlformats.org/wordprocessingml/2006/main" xmlns:w14="http://schemas.microsoft.com/office/word/2010/wordml" xmlns:w15="http://schemas.microsoft.com/office/word/2012/wordml" xmlns:w16cex="http://schemas.microsoft.com/office/word/2018/wordml/cex" xmlns:w16cid="http://schemas.microsoft.com/office/word/2016/wordml/cid" xmlns:w16="http://schemas.microsoft.com/office/word/2018/wordml" xmlns:w16sdtdh="http://schemas.microsoft.com/office/word/2020/wordml/sdtdatahash" xmlns:w16sdtfl="http://schemas.microsoft.com/office/word/2024/wordml/sdtformatlock" xmlns:w16se="http://schemas.microsoft.com/office/word/2015/wordml/symex" xmlns:w16du="http://schemas.microsoft.com/office/word/2023/wordml/word16du" xmlns:wne="http://schemas.microsoft.com/office/word/2006/wordml" mc:Ignorable="w14 w15 w16se w16cid w16 w16cex w16sdtdh w16sdtfl w16du wp14">
   <w:p>
     <w:pPr>
       <w:pStyle w:val="a5"/>
@@ -5787,7 +7673,7 @@
               <v:stroke joinstyle="miter"/>
               <v:path gradientshapeok="t" o:connecttype="rect"/>
             </v:shapetype>
-            <v:shape id="Text Box 9" o:spid="_x0000_s1033" type="#_x0000_t202" alt="Restricted - مقيد " style="position:absolute;left:0;text-align:left;margin-left:0;margin-top:0;width:84.4pt;height:32.1pt;z-index:251663360;visibility:visible;mso-wrap-style:none;mso-wrap-distance-left:0;mso-wrap-distance-top:0;mso-wrap-distance-right:0;mso-wrap-distance-bottom:0;mso-position-horizontal:left;mso-position-horizontal-relative:page;mso-position-vertical:bottom;mso-position-vertical-relative:page;v-text-anchor:bottom" o:gfxdata="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" filled="f" stroked="f">
+            <v:shape id="Text Box 9" o:spid="_x0000_s1033" type="#_x0000_t202" alt="Restricted - مقيد " style="position:absolute;left:0;text-align:left;margin-left:0;margin-top:0;width:84.4pt;height:32.1pt;z-index:251663360;visibility:visible;mso-wrap-style:none;mso-wrap-distance-left:0;mso-wrap-distance-top:0;mso-wrap-distance-right:0;mso-wrap-distance-bottom:0;mso-position-horizontal:left;mso-position-horizontal-relative:page;mso-position-vertical:bottom;mso-position-vertical-relative:page;v-text-anchor:bottom" o:gfxdata="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" filled="f" stroked="f">
               <v:textbox style="mso-fit-shape-to-text:t" inset="20pt,0,0,15pt">
                 <w:txbxContent>
                   <w:p>
@@ -5838,7 +7724,7 @@
 </file>
 
 <file path=word/footer2.xml><?xml version="1.0" encoding="utf-8"?>
-<w:ftr xmlns:wpc="http://schemas.microsoft.com/office/word/2010/wordprocessingCanvas" xmlns:cx="http://schemas.microsoft.com/office/drawing/2014/chartex" xmlns:cx1="http://schemas.microsoft.com/office/drawing/2015/9/8/chartex" xmlns:cx2="http://schemas.microsoft.com/office/drawing/2015/10/21/chartex" xmlns:cx3="http://schemas.microsoft.com/office/drawing/2016/5/9/chartex" xmlns:cx4="http://schemas.microsoft.com/office/drawing/2016/5/10/chartex" xmlns:cx5="http://schemas.microsoft.com/office/drawing/2016/5/11/chartex" xmlns:cx6="http://schemas.microsoft.com/office/drawing/2016/5/12/chartex" xmlns:cx7="http://schemas.microsoft.com/office/drawing/2016/5/13/chartex" xmlns:cx8="http://schemas.microsoft.com/office/drawing/2016/5/14/chartex" xmlns:mc="http://schemas.openxmlformats.org/markup-compatibility/2006" xmlns:aink="http://schemas.microsoft.com/office/drawing/2016/ink" xmlns:am3d="http://schemas.microsoft.com/office/drawing/2017/model3d" xmlns:o="urn:schemas-microsoft-com:office:office" xmlns:oel="http://schemas.microsoft.com/office/2019/extlst" xmlns:r="http://schemas.openxmlformats.org/officeDocument/2006/relationships" xmlns:m="http://schemas.openxmlformats.org/officeDocument/2006/math" xmlns:v="urn:schemas-microsoft-com:vml" xmlns:wp14="http://schemas.microsoft.com/office/word/2010/wordprocessingDrawing" xmlns:wp="http://schemas.openxmlformats.org/drawingml/2006/wordprocessingDrawing" xmlns:w10="urn:schemas-microsoft-com:office:word" xmlns:w="http://schemas.openxmlformats.org/wordprocessingml/2006/main" xmlns:w14="http://schemas.microsoft.com/office/word/2010/wordml" xmlns:w15="http://schemas.microsoft.com/office/word/2012/wordml" xmlns:w16cei="http://schemas.microsoft.com/office/word/2026/wordml/cei" xmlns:w16cex="http://schemas.microsoft.com/office/word/2018/wordml/cex" xmlns:w16cid="http://schemas.microsoft.com/office/word/2016/wordml/cid" xmlns:w16="http://schemas.microsoft.com/office/word/2018/wordml" xmlns:w16du="http://schemas.microsoft.com/office/word/2023/wordml/word16du" xmlns:w16sdtdh="http://schemas.microsoft.com/office/word/2020/wordml/sdtdatahash" xmlns:w16sdtfl="http://schemas.microsoft.com/office/word/2024/wordml/sdtformatlock" xmlns:w16se="http://schemas.microsoft.com/office/word/2015/wordml/symex" xmlns:wpg="http://schemas.microsoft.com/office/word/2010/wordprocessingGroup" xmlns:wpi="http://schemas.microsoft.com/office/word/2010/wordprocessingInk" xmlns:wne="http://schemas.microsoft.com/office/word/2006/wordml" xmlns:wps="http://schemas.microsoft.com/office/word/2010/wordprocessingShape" mc:Ignorable="w14 w15 w16se w16cid w16 w16cex w16sdtdh w16sdtfl w16du wp14">
+<w:ftr xmlns:wpc="http://schemas.microsoft.com/office/word/2010/wordprocessingCanvas" xmlns:cx="http://schemas.microsoft.com/office/drawing/2014/chartex" xmlns:cx1="http://schemas.microsoft.com/office/drawing/2015/9/8/chartex" xmlns:cx2="http://schemas.microsoft.com/office/drawing/2015/10/21/chartex" xmlns:cx3="http://schemas.microsoft.com/office/drawing/2016/5/9/chartex" xmlns:cx4="http://schemas.microsoft.com/office/drawing/2016/5/10/chartex" xmlns:cx5="http://schemas.microsoft.com/office/drawing/2016/5/11/chartex" xmlns:cx6="http://schemas.microsoft.com/office/drawing/2016/5/12/chartex" xmlns:cx7="http://schemas.microsoft.com/office/drawing/2016/5/13/chartex" xmlns:cx8="http://schemas.microsoft.com/office/drawing/2016/5/14/chartex" xmlns:mc="http://schemas.openxmlformats.org/markup-compatibility/2006" xmlns:m="http://schemas.openxmlformats.org/officeDocument/2006/math" xmlns:aink="http://schemas.microsoft.com/office/drawing/2016/ink" xmlns:am3d="http://schemas.microsoft.com/office/drawing/2017/model3d" xmlns:oel="http://schemas.microsoft.com/office/2019/extlst" xmlns:r="http://schemas.openxmlformats.org/officeDocument/2006/relationships" xmlns:wp14="http://schemas.microsoft.com/office/word/2010/wordprocessingDrawing" xmlns:wp="http://schemas.openxmlformats.org/drawingml/2006/wordprocessingDrawing" xmlns:wpg="http://schemas.microsoft.com/office/word/2010/wordprocessingGroup" xmlns:wpi="http://schemas.microsoft.com/office/word/2010/wordprocessingInk" xmlns:wps="http://schemas.microsoft.com/office/word/2010/wordprocessingShape" xmlns:o="urn:schemas-microsoft-com:office:office" xmlns:v="urn:schemas-microsoft-com:vml" xmlns:w10="urn:schemas-microsoft-com:office:word" xmlns:w="http://schemas.openxmlformats.org/wordprocessingml/2006/main" xmlns:w14="http://schemas.microsoft.com/office/word/2010/wordml" xmlns:w15="http://schemas.microsoft.com/office/word/2012/wordml" xmlns:w16cex="http://schemas.microsoft.com/office/word/2018/wordml/cex" xmlns:w16cid="http://schemas.microsoft.com/office/word/2016/wordml/cid" xmlns:w16="http://schemas.microsoft.com/office/word/2018/wordml" xmlns:w16sdtdh="http://schemas.microsoft.com/office/word/2020/wordml/sdtdatahash" xmlns:w16sdtfl="http://schemas.microsoft.com/office/word/2024/wordml/sdtformatlock" xmlns:w16se="http://schemas.microsoft.com/office/word/2015/wordml/symex" xmlns:w16du="http://schemas.microsoft.com/office/word/2023/wordml/word16du" xmlns:wne="http://schemas.microsoft.com/office/word/2006/wordml" mc:Ignorable="w14 w15 w16se w16cid w16 w16cex w16sdtdh w16sdtfl w16du wp14">
   <w:p>
     <w:pPr>
       <w:pStyle w:val="a5"/>
@@ -5944,7 +7830,7 @@
               <v:stroke joinstyle="miter"/>
               <v:path gradientshapeok="t" o:connecttype="rect"/>
             </v:shapetype>
-            <v:shape id="Text Box 10" o:spid="_x0000_s1034" type="#_x0000_t202" alt="Restricted - مقيد " style="position:absolute;left:0;text-align:left;margin-left:0;margin-top:0;width:84.4pt;height:32.1pt;z-index:251664384;visibility:visible;mso-wrap-style:none;mso-wrap-distance-left:0;mso-wrap-distance-top:0;mso-wrap-distance-right:0;mso-wrap-distance-bottom:0;mso-position-horizontal:left;mso-position-horizontal-relative:page;mso-position-vertical:bottom;mso-position-vertical-relative:page;v-text-anchor:bottom" o:gfxdata="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" filled="f" stroked="f">
+            <v:shape id="Text Box 10" o:spid="_x0000_s1034" type="#_x0000_t202" alt="Restricted - مقيد " style="position:absolute;left:0;text-align:left;margin-left:0;margin-top:0;width:84.4pt;height:32.1pt;z-index:251664384;visibility:visible;mso-wrap-style:none;mso-wrap-distance-left:0;mso-wrap-distance-top:0;mso-wrap-distance-right:0;mso-wrap-distance-bottom:0;mso-position-horizontal:left;mso-position-horizontal-relative:page;mso-position-vertical:bottom;mso-position-vertical-relative:page;v-text-anchor:bottom" o:gfxdata="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" filled="f" stroked="f">
               <v:textbox style="mso-fit-shape-to-text:t" inset="20pt,0,0,15pt">
                 <w:txbxContent>
                   <w:p>
@@ -5995,7 +7881,7 @@
 </file>
 
 <file path=word/footer3.xml><?xml version="1.0" encoding="utf-8"?>
-<w:ftr xmlns:wpc="http://schemas.microsoft.com/office/word/2010/wordprocessingCanvas" xmlns:cx="http://schemas.microsoft.com/office/drawing/2014/chartex" xmlns:cx1="http://schemas.microsoft.com/office/drawing/2015/9/8/chartex" xmlns:cx2="http://schemas.microsoft.com/office/drawing/2015/10/21/chartex" xmlns:cx3="http://schemas.microsoft.com/office/drawing/2016/5/9/chartex" xmlns:cx4="http://schemas.microsoft.com/office/drawing/2016/5/10/chartex" xmlns:cx5="http://schemas.microsoft.com/office/drawing/2016/5/11/chartex" xmlns:cx6="http://schemas.microsoft.com/office/drawing/2016/5/12/chartex" xmlns:cx7="http://schemas.microsoft.com/office/drawing/2016/5/13/chartex" xmlns:cx8="http://schemas.microsoft.com/office/drawing/2016/5/14/chartex" xmlns:mc="http://schemas.openxmlformats.org/markup-compatibility/2006" xmlns:aink="http://schemas.microsoft.com/office/drawing/2016/ink" xmlns:am3d="http://schemas.microsoft.com/office/drawing/2017/model3d" xmlns:o="urn:schemas-microsoft-com:office:office" xmlns:oel="http://schemas.microsoft.com/office/2019/extlst" xmlns:r="http://schemas.openxmlformats.org/officeDocument/2006/relationships" xmlns:m="http://schemas.openxmlformats.org/officeDocument/2006/math" xmlns:v="urn:schemas-microsoft-com:vml" xmlns:wp14="http://schemas.microsoft.com/office/word/2010/wordprocessingDrawing" xmlns:wp="http://schemas.openxmlformats.org/drawingml/2006/wordprocessingDrawing" xmlns:w10="urn:schemas-microsoft-com:office:word" xmlns:w="http://schemas.openxmlformats.org/wordprocessingml/2006/main" xmlns:w14="http://schemas.microsoft.com/office/word/2010/wordml" xmlns:w15="http://schemas.microsoft.com/office/word/2012/wordml" xmlns:w16cei="http://schemas.microsoft.com/office/word/2026/wordml/cei" xmlns:w16cex="http://schemas.microsoft.com/office/word/2018/wordml/cex" xmlns:w16cid="http://schemas.microsoft.com/office/word/2016/wordml/cid" xmlns:w16="http://schemas.microsoft.com/office/word/2018/wordml" xmlns:w16du="http://schemas.microsoft.com/office/word/2023/wordml/word16du" xmlns:w16sdtdh="http://schemas.microsoft.com/office/word/2020/wordml/sdtdatahash" xmlns:w16sdtfl="http://schemas.microsoft.com/office/word/2024/wordml/sdtformatlock" xmlns:w16se="http://schemas.microsoft.com/office/word/2015/wordml/symex" xmlns:wpg="http://schemas.microsoft.com/office/word/2010/wordprocessingGroup" xmlns:wpi="http://schemas.microsoft.com/office/word/2010/wordprocessingInk" xmlns:wne="http://schemas.microsoft.com/office/word/2006/wordml" xmlns:wps="http://schemas.microsoft.com/office/word/2010/wordprocessingShape" mc:Ignorable="w14 w15 w16se w16cid w16 w16cex w16sdtdh w16sdtfl w16du wp14">
+<w:ftr xmlns:wpc="http://schemas.microsoft.com/office/word/2010/wordprocessingCanvas" xmlns:cx="http://schemas.microsoft.com/office/drawing/2014/chartex" xmlns:cx1="http://schemas.microsoft.com/office/drawing/2015/9/8/chartex" xmlns:cx2="http://schemas.microsoft.com/office/drawing/2015/10/21/chartex" xmlns:cx3="http://schemas.microsoft.com/office/drawing/2016/5/9/chartex" xmlns:cx4="http://schemas.microsoft.com/office/drawing/2016/5/10/chartex" xmlns:cx5="http://schemas.microsoft.com/office/drawing/2016/5/11/chartex" xmlns:cx6="http://schemas.microsoft.com/office/drawing/2016/5/12/chartex" xmlns:cx7="http://schemas.microsoft.com/office/drawing/2016/5/13/chartex" xmlns:cx8="http://schemas.microsoft.com/office/drawing/2016/5/14/chartex" xmlns:mc="http://schemas.openxmlformats.org/markup-compatibility/2006" xmlns:m="http://schemas.openxmlformats.org/officeDocument/2006/math" xmlns:aink="http://schemas.microsoft.com/office/drawing/2016/ink" xmlns:am3d="http://schemas.microsoft.com/office/drawing/2017/model3d" xmlns:oel="http://schemas.microsoft.com/office/2019/extlst" xmlns:r="http://schemas.openxmlformats.org/officeDocument/2006/relationships" xmlns:wp14="http://schemas.microsoft.com/office/word/2010/wordprocessingDrawing" xmlns:wp="http://schemas.openxmlformats.org/drawingml/2006/wordprocessingDrawing" xmlns:wpg="http://schemas.microsoft.com/office/word/2010/wordprocessingGroup" xmlns:wpi="http://schemas.microsoft.com/office/word/2010/wordprocessingInk" xmlns:wps="http://schemas.microsoft.com/office/word/2010/wordprocessingShape" xmlns:o="urn:schemas-microsoft-com:office:office" xmlns:v="urn:schemas-microsoft-com:vml" xmlns:w10="urn:schemas-microsoft-com:office:word" xmlns:w="http://schemas.openxmlformats.org/wordprocessingml/2006/main" xmlns:w14="http://schemas.microsoft.com/office/word/2010/wordml" xmlns:w15="http://schemas.microsoft.com/office/word/2012/wordml" xmlns:w16cex="http://schemas.microsoft.com/office/word/2018/wordml/cex" xmlns:w16cid="http://schemas.microsoft.com/office/word/2016/wordml/cid" xmlns:w16="http://schemas.microsoft.com/office/word/2018/wordml" xmlns:w16sdtdh="http://schemas.microsoft.com/office/word/2020/wordml/sdtdatahash" xmlns:w16sdtfl="http://schemas.microsoft.com/office/word/2024/wordml/sdtformatlock" xmlns:w16se="http://schemas.microsoft.com/office/word/2015/wordml/symex" xmlns:w16du="http://schemas.microsoft.com/office/word/2023/wordml/word16du" xmlns:wne="http://schemas.microsoft.com/office/word/2006/wordml" mc:Ignorable="w14 w15 w16se w16cid w16 w16cex w16sdtdh w16sdtfl w16du wp14">
   <w:p>
     <w:pPr>
       <w:pStyle w:val="a5"/>
@@ -6101,7 +7987,7 @@
               <v:stroke joinstyle="miter"/>
               <v:path gradientshapeok="t" o:connecttype="rect"/>
             </v:shapetype>
-            <v:shape id="Text Box 8" o:spid="_x0000_s1035" type="#_x0000_t202" alt="Restricted - مقيد " style="position:absolute;left:0;text-align:left;margin-left:0;margin-top:0;width:84.4pt;height:32.1pt;z-index:251662336;visibility:visible;mso-wrap-style:none;mso-wrap-distance-left:0;mso-wrap-distance-top:0;mso-wrap-distance-right:0;mso-wrap-distance-bottom:0;mso-position-horizontal:left;mso-position-horizontal-relative:page;mso-position-vertical:bottom;mso-position-vertical-relative:page;v-text-anchor:bottom" o:gfxdata="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" filled="f" stroked="f">
+            <v:shape id="Text Box 8" o:spid="_x0000_s1035" type="#_x0000_t202" alt="Restricted - مقيد " style="position:absolute;left:0;text-align:left;margin-left:0;margin-top:0;width:84.4pt;height:32.1pt;z-index:251662336;visibility:visible;mso-wrap-style:none;mso-wrap-distance-left:0;mso-wrap-distance-top:0;mso-wrap-distance-right:0;mso-wrap-distance-bottom:0;mso-position-horizontal:left;mso-position-horizontal-relative:page;mso-position-vertical:bottom;mso-position-vertical-relative:page;v-text-anchor:bottom" o:gfxdata="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" filled="f" stroked="f">
               <v:textbox style="mso-fit-shape-to-text:t" inset="20pt,0,0,15pt">
                 <w:txbxContent>
                   <w:p>
@@ -6152,7 +8038,7 @@
 </file>
 
 <file path=word/footnotes.xml><?xml version="1.0" encoding="utf-8"?>
-<w:footnotes xmlns:wpc="http://schemas.microsoft.com/office/word/2010/wordprocessingCanvas" xmlns:cx="http://schemas.microsoft.com/office/drawing/2014/chartex" xmlns:cx1="http://schemas.microsoft.com/office/drawing/2015/9/8/chartex" xmlns:cx2="http://schemas.microsoft.com/office/drawing/2015/10/21/chartex" xmlns:cx3="http://schemas.microsoft.com/office/drawing/2016/5/9/chartex" xmlns:cx4="http://schemas.microsoft.com/office/drawing/2016/5/10/chartex" xmlns:cx5="http://schemas.microsoft.com/office/drawing/2016/5/11/chartex" xmlns:cx6="http://schemas.microsoft.com/office/drawing/2016/5/12/chartex" xmlns:cx7="http://schemas.microsoft.com/office/drawing/2016/5/13/chartex" xmlns:cx8="http://schemas.microsoft.com/office/drawing/2016/5/14/chartex" xmlns:mc="http://schemas.openxmlformats.org/markup-compatibility/2006" xmlns:aink="http://schemas.microsoft.com/office/drawing/2016/ink" xmlns:am3d="http://schemas.microsoft.com/office/drawing/2017/model3d" xmlns:o="urn:schemas-microsoft-com:office:office" xmlns:oel="http://schemas.microsoft.com/office/2019/extlst" xmlns:r="http://schemas.openxmlformats.org/officeDocument/2006/relationships" xmlns:m="http://schemas.openxmlformats.org/officeDocument/2006/math" xmlns:v="urn:schemas-microsoft-com:vml" xmlns:wp14="http://schemas.microsoft.com/office/word/2010/wordprocessingDrawing" xmlns:wp="http://schemas.openxmlformats.org/drawingml/2006/wordprocessingDrawing" xmlns:w10="urn:schemas-microsoft-com:office:word" xmlns:w="http://schemas.openxmlformats.org/wordprocessingml/2006/main" xmlns:w14="http://schemas.microsoft.com/office/word/2010/wordml" xmlns:w15="http://schemas.microsoft.com/office/word/2012/wordml" xmlns:w16cei="http://schemas.microsoft.com/office/word/2026/wordml/cei" xmlns:w16cex="http://schemas.microsoft.com/office/word/2018/wordml/cex" xmlns:w16cid="http://schemas.microsoft.com/office/word/2016/wordml/cid" xmlns:w16="http://schemas.microsoft.com/office/word/2018/wordml" xmlns:w16du="http://schemas.microsoft.com/office/word/2023/wordml/word16du" xmlns:w16sdtdh="http://schemas.microsoft.com/office/word/2020/wordml/sdtdatahash" xmlns:w16sdtfl="http://schemas.microsoft.com/office/word/2024/wordml/sdtformatlock" xmlns:w16se="http://schemas.microsoft.com/office/word/2015/wordml/symex" xmlns:wpg="http://schemas.microsoft.com/office/word/2010/wordprocessingGroup" xmlns:wpi="http://schemas.microsoft.com/office/word/2010/wordprocessingInk" xmlns:wne="http://schemas.microsoft.com/office/word/2006/wordml" xmlns:wps="http://schemas.microsoft.com/office/word/2010/wordprocessingShape" mc:Ignorable="w14 w15 w16se w16cid w16 w16cex w16sdtdh w16sdtfl w16du wp14">
+<w:footnotes xmlns:wpc="http://schemas.microsoft.com/office/word/2010/wordprocessingCanvas" xmlns:cx="http://schemas.microsoft.com/office/drawing/2014/chartex" xmlns:cx1="http://schemas.microsoft.com/office/drawing/2015/9/8/chartex" xmlns:cx2="http://schemas.microsoft.com/office/drawing/2015/10/21/chartex" xmlns:cx3="http://schemas.microsoft.com/office/drawing/2016/5/9/chartex" xmlns:cx4="http://schemas.microsoft.com/office/drawing/2016/5/10/chartex" xmlns:cx5="http://schemas.microsoft.com/office/drawing/2016/5/11/chartex" xmlns:cx6="http://schemas.microsoft.com/office/drawing/2016/5/12/chartex" xmlns:cx7="http://schemas.microsoft.com/office/drawing/2016/5/13/chartex" xmlns:cx8="http://schemas.microsoft.com/office/drawing/2016/5/14/chartex" xmlns:mc="http://schemas.openxmlformats.org/markup-compatibility/2006" xmlns:m="http://schemas.openxmlformats.org/officeDocument/2006/math" xmlns:aink="http://schemas.microsoft.com/office/drawing/2016/ink" xmlns:am3d="http://schemas.microsoft.com/office/drawing/2017/model3d" xmlns:oel="http://schemas.microsoft.com/office/2019/extlst" xmlns:r="http://schemas.openxmlformats.org/officeDocument/2006/relationships" xmlns:wp14="http://schemas.microsoft.com/office/word/2010/wordprocessingDrawing" xmlns:wp="http://schemas.openxmlformats.org/drawingml/2006/wordprocessingDrawing" xmlns:wpg="http://schemas.microsoft.com/office/word/2010/wordprocessingGroup" xmlns:wpi="http://schemas.microsoft.com/office/word/2010/wordprocessingInk" xmlns:wps="http://schemas.microsoft.com/office/word/2010/wordprocessingShape" xmlns:o="urn:schemas-microsoft-com:office:office" xmlns:v="urn:schemas-microsoft-com:vml" xmlns:w10="urn:schemas-microsoft-com:office:word" xmlns:w="http://schemas.openxmlformats.org/wordprocessingml/2006/main" xmlns:w14="http://schemas.microsoft.com/office/word/2010/wordml" xmlns:w15="http://schemas.microsoft.com/office/word/2012/wordml" xmlns:w16cex="http://schemas.microsoft.com/office/word/2018/wordml/cex" xmlns:w16cid="http://schemas.microsoft.com/office/word/2016/wordml/cid" xmlns:w16="http://schemas.microsoft.com/office/word/2018/wordml" xmlns:w16sdtdh="http://schemas.microsoft.com/office/word/2020/wordml/sdtdatahash" xmlns:w16sdtfl="http://schemas.microsoft.com/office/word/2024/wordml/sdtformatlock" xmlns:w16se="http://schemas.microsoft.com/office/word/2015/wordml/symex" xmlns:w16du="http://schemas.microsoft.com/office/word/2023/wordml/word16du" xmlns:wne="http://schemas.microsoft.com/office/word/2006/wordml" mc:Ignorable="w14 w15 w16se w16cid w16 w16cex w16sdtdh w16sdtfl w16du wp14">
   <w:footnote w:type="separator" w:id="-1">
     <w:p>
       <w:pPr>
@@ -6181,7 +8067,7 @@
 </file>
 
 <file path=word/header1.xml><?xml version="1.0" encoding="utf-8"?>
-<w:hdr xmlns:wpc="http://schemas.microsoft.com/office/word/2010/wordprocessingCanvas" xmlns:cx="http://schemas.microsoft.com/office/drawing/2014/chartex" xmlns:cx1="http://schemas.microsoft.com/office/drawing/2015/9/8/chartex" xmlns:cx2="http://schemas.microsoft.com/office/drawing/2015/10/21/chartex" xmlns:cx3="http://schemas.microsoft.com/office/drawing/2016/5/9/chartex" xmlns:cx4="http://schemas.microsoft.com/office/drawing/2016/5/10/chartex" xmlns:cx5="http://schemas.microsoft.com/office/drawing/2016/5/11/chartex" xmlns:cx6="http://schemas.microsoft.com/office/drawing/2016/5/12/chartex" xmlns:cx7="http://schemas.microsoft.com/office/drawing/2016/5/13/chartex" xmlns:cx8="http://schemas.microsoft.com/office/drawing/2016/5/14/chartex" xmlns:mc="http://schemas.openxmlformats.org/markup-compatibility/2006" xmlns:aink="http://schemas.microsoft.com/office/drawing/2016/ink" xmlns:am3d="http://schemas.microsoft.com/office/drawing/2017/model3d" xmlns:o="urn:schemas-microsoft-com:office:office" xmlns:oel="http://schemas.microsoft.com/office/2019/extlst" xmlns:r="http://schemas.openxmlformats.org/officeDocument/2006/relationships" xmlns:m="http://schemas.openxmlformats.org/officeDocument/2006/math" xmlns:v="urn:schemas-microsoft-com:vml" xmlns:wp14="http://schemas.microsoft.com/office/word/2010/wordprocessingDrawing" xmlns:wp="http://schemas.openxmlformats.org/drawingml/2006/wordprocessingDrawing" xmlns:w10="urn:schemas-microsoft-com:office:word" xmlns:w="http://schemas.openxmlformats.org/wordprocessingml/2006/main" xmlns:w14="http://schemas.microsoft.com/office/word/2010/wordml" xmlns:w15="http://schemas.microsoft.com/office/word/2012/wordml" xmlns:w16cei="http://schemas.microsoft.com/office/word/2026/wordml/cei" xmlns:w16cex="http://schemas.microsoft.com/office/word/2018/wordml/cex" xmlns:w16cid="http://schemas.microsoft.com/office/word/2016/wordml/cid" xmlns:w16="http://schemas.microsoft.com/office/word/2018/wordml" xmlns:w16du="http://schemas.microsoft.com/office/word/2023/wordml/word16du" xmlns:w16sdtdh="http://schemas.microsoft.com/office/word/2020/wordml/sdtdatahash" xmlns:w16sdtfl="http://schemas.microsoft.com/office/word/2024/wordml/sdtformatlock" xmlns:w16se="http://schemas.microsoft.com/office/word/2015/wordml/symex" xmlns:wpg="http://schemas.microsoft.com/office/word/2010/wordprocessingGroup" xmlns:wpi="http://schemas.microsoft.com/office/word/2010/wordprocessingInk" xmlns:wne="http://schemas.microsoft.com/office/word/2006/wordml" xmlns:wps="http://schemas.microsoft.com/office/word/2010/wordprocessingShape" mc:Ignorable="w14 w15 w16se w16cid w16 w16cex w16sdtdh w16sdtfl w16du wp14">
+<w:hdr xmlns:wpc="http://schemas.microsoft.com/office/word/2010/wordprocessingCanvas" xmlns:cx="http://schemas.microsoft.com/office/drawing/2014/chartex" xmlns:cx1="http://schemas.microsoft.com/office/drawing/2015/9/8/chartex" xmlns:cx2="http://schemas.microsoft.com/office/drawing/2015/10/21/chartex" xmlns:cx3="http://schemas.microsoft.com/office/drawing/2016/5/9/chartex" xmlns:cx4="http://schemas.microsoft.com/office/drawing/2016/5/10/chartex" xmlns:cx5="http://schemas.microsoft.com/office/drawing/2016/5/11/chartex" xmlns:cx6="http://schemas.microsoft.com/office/drawing/2016/5/12/chartex" xmlns:cx7="http://schemas.microsoft.com/office/drawing/2016/5/13/chartex" xmlns:cx8="http://schemas.microsoft.com/office/drawing/2016/5/14/chartex" xmlns:mc="http://schemas.openxmlformats.org/markup-compatibility/2006" xmlns:m="http://schemas.openxmlformats.org/officeDocument/2006/math" xmlns:aink="http://schemas.microsoft.com/office/drawing/2016/ink" xmlns:am3d="http://schemas.microsoft.com/office/drawing/2017/model3d" xmlns:oel="http://schemas.microsoft.com/office/2019/extlst" xmlns:r="http://schemas.openxmlformats.org/officeDocument/2006/relationships" xmlns:wp14="http://schemas.microsoft.com/office/word/2010/wordprocessingDrawing" xmlns:wp="http://schemas.openxmlformats.org/drawingml/2006/wordprocessingDrawing" xmlns:wpg="http://schemas.microsoft.com/office/word/2010/wordprocessingGroup" xmlns:wpi="http://schemas.microsoft.com/office/word/2010/wordprocessingInk" xmlns:wps="http://schemas.microsoft.com/office/word/2010/wordprocessingShape" xmlns:o="urn:schemas-microsoft-com:office:office" xmlns:v="urn:schemas-microsoft-com:vml" xmlns:w10="urn:schemas-microsoft-com:office:word" xmlns:w="http://schemas.openxmlformats.org/wordprocessingml/2006/main" xmlns:w14="http://schemas.microsoft.com/office/word/2010/wordml" xmlns:w15="http://schemas.microsoft.com/office/word/2012/wordml" xmlns:w16cex="http://schemas.microsoft.com/office/word/2018/wordml/cex" xmlns:w16cid="http://schemas.microsoft.com/office/word/2016/wordml/cid" xmlns:w16="http://schemas.microsoft.com/office/word/2018/wordml" xmlns:w16sdtdh="http://schemas.microsoft.com/office/word/2020/wordml/sdtdatahash" xmlns:w16sdtfl="http://schemas.microsoft.com/office/word/2024/wordml/sdtformatlock" xmlns:w16se="http://schemas.microsoft.com/office/word/2015/wordml/symex" xmlns:w16du="http://schemas.microsoft.com/office/word/2023/wordml/word16du" xmlns:wne="http://schemas.microsoft.com/office/word/2006/wordml" mc:Ignorable="w14 w15 w16se w16cid w16 w16cex w16sdtdh w16sdtfl w16du wp14">
   <w:tbl>
     <w:tblPr>
       <w:tblW w:w="6410" w:type="pct"/>
@@ -6281,7 +8167,7 @@
 </file>
 
 <file path=word/header2.xml><?xml version="1.0" encoding="utf-8"?>
-<w:hdr xmlns:wpc="http://schemas.microsoft.com/office/word/2010/wordprocessingCanvas" xmlns:cx="http://schemas.microsoft.com/office/drawing/2014/chartex" xmlns:cx1="http://schemas.microsoft.com/office/drawing/2015/9/8/chartex" xmlns:cx2="http://schemas.microsoft.com/office/drawing/2015/10/21/chartex" xmlns:cx3="http://schemas.microsoft.com/office/drawing/2016/5/9/chartex" xmlns:cx4="http://schemas.microsoft.com/office/drawing/2016/5/10/chartex" xmlns:cx5="http://schemas.microsoft.com/office/drawing/2016/5/11/chartex" xmlns:cx6="http://schemas.microsoft.com/office/drawing/2016/5/12/chartex" xmlns:cx7="http://schemas.microsoft.com/office/drawing/2016/5/13/chartex" xmlns:cx8="http://schemas.microsoft.com/office/drawing/2016/5/14/chartex" xmlns:mc="http://schemas.openxmlformats.org/markup-compatibility/2006" xmlns:aink="http://schemas.microsoft.com/office/drawing/2016/ink" xmlns:am3d="http://schemas.microsoft.com/office/drawing/2017/model3d" xmlns:o="urn:schemas-microsoft-com:office:office" xmlns:oel="http://schemas.microsoft.com/office/2019/extlst" xmlns:r="http://schemas.openxmlformats.org/officeDocument/2006/relationships" xmlns:m="http://schemas.openxmlformats.org/officeDocument/2006/math" xmlns:v="urn:schemas-microsoft-com:vml" xmlns:wp14="http://schemas.microsoft.com/office/word/2010/wordprocessingDrawing" xmlns:wp="http://schemas.openxmlformats.org/drawingml/2006/wordprocessingDrawing" xmlns:w10="urn:schemas-microsoft-com:office:word" xmlns:w="http://schemas.openxmlformats.org/wordprocessingml/2006/main" xmlns:w14="http://schemas.microsoft.com/office/word/2010/wordml" xmlns:w15="http://schemas.microsoft.com/office/word/2012/wordml" xmlns:w16cei="http://schemas.microsoft.com/office/word/2026/wordml/cei" xmlns:w16cex="http://schemas.microsoft.com/office/word/2018/wordml/cex" xmlns:w16cid="http://schemas.microsoft.com/office/word/2016/wordml/cid" xmlns:w16="http://schemas.microsoft.com/office/word/2018/wordml" xmlns:w16du="http://schemas.microsoft.com/office/word/2023/wordml/word16du" xmlns:w16sdtdh="http://schemas.microsoft.com/office/word/2020/wordml/sdtdatahash" xmlns:w16sdtfl="http://schemas.microsoft.com/office/word/2024/wordml/sdtformatlock" xmlns:w16se="http://schemas.microsoft.com/office/word/2015/wordml/symex" xmlns:wpg="http://schemas.microsoft.com/office/word/2010/wordprocessingGroup" xmlns:wpi="http://schemas.microsoft.com/office/word/2010/wordprocessingInk" xmlns:wne="http://schemas.microsoft.com/office/word/2006/wordml" xmlns:wps="http://schemas.microsoft.com/office/word/2010/wordprocessingShape" mc:Ignorable="w14 w15 w16se w16cid w16 w16cex w16sdtdh w16sdtfl w16du wp14">
+<w:hdr xmlns:wpc="http://schemas.microsoft.com/office/word/2010/wordprocessingCanvas" xmlns:cx="http://schemas.microsoft.com/office/drawing/2014/chartex" xmlns:cx1="http://schemas.microsoft.com/office/drawing/2015/9/8/chartex" xmlns:cx2="http://schemas.microsoft.com/office/drawing/2015/10/21/chartex" xmlns:cx3="http://schemas.microsoft.com/office/drawing/2016/5/9/chartex" xmlns:cx4="http://schemas.microsoft.com/office/drawing/2016/5/10/chartex" xmlns:cx5="http://schemas.microsoft.com/office/drawing/2016/5/11/chartex" xmlns:cx6="http://schemas.microsoft.com/office/drawing/2016/5/12/chartex" xmlns:cx7="http://schemas.microsoft.com/office/drawing/2016/5/13/chartex" xmlns:cx8="http://schemas.microsoft.com/office/drawing/2016/5/14/chartex" xmlns:mc="http://schemas.openxmlformats.org/markup-compatibility/2006" xmlns:m="http://schemas.openxmlformats.org/officeDocument/2006/math" xmlns:aink="http://schemas.microsoft.com/office/drawing/2016/ink" xmlns:am3d="http://schemas.microsoft.com/office/drawing/2017/model3d" xmlns:oel="http://schemas.microsoft.com/office/2019/extlst" xmlns:r="http://schemas.openxmlformats.org/officeDocument/2006/relationships" xmlns:wp14="http://schemas.microsoft.com/office/word/2010/wordprocessingDrawing" xmlns:wp="http://schemas.openxmlformats.org/drawingml/2006/wordprocessingDrawing" xmlns:wpg="http://schemas.microsoft.com/office/word/2010/wordprocessingGroup" xmlns:wpi="http://schemas.microsoft.com/office/word/2010/wordprocessingInk" xmlns:wps="http://schemas.microsoft.com/office/word/2010/wordprocessingShape" xmlns:o="urn:schemas-microsoft-com:office:office" xmlns:v="urn:schemas-microsoft-com:vml" xmlns:w10="urn:schemas-microsoft-com:office:word" xmlns:w="http://schemas.openxmlformats.org/wordprocessingml/2006/main" xmlns:w14="http://schemas.microsoft.com/office/word/2010/wordml" xmlns:w15="http://schemas.microsoft.com/office/word/2012/wordml" xmlns:w16cex="http://schemas.microsoft.com/office/word/2018/wordml/cex" xmlns:w16cid="http://schemas.microsoft.com/office/word/2016/wordml/cid" xmlns:w16="http://schemas.microsoft.com/office/word/2018/wordml" xmlns:w16sdtdh="http://schemas.microsoft.com/office/word/2020/wordml/sdtdatahash" xmlns:w16sdtfl="http://schemas.microsoft.com/office/word/2024/wordml/sdtformatlock" xmlns:w16se="http://schemas.microsoft.com/office/word/2015/wordml/symex" xmlns:w16du="http://schemas.microsoft.com/office/word/2023/wordml/word16du" xmlns:wne="http://schemas.microsoft.com/office/word/2006/wordml" mc:Ignorable="w14 w15 w16se w16cid w16 w16cex w16sdtdh w16sdtfl w16du wp14">
   <w:p>
     <w:pPr>
       <w:ind w:left="-2340"/>
@@ -6451,7 +8337,7 @@
             </wp:anchor>
           </w:drawing>
         </mc:Choice>
-        <mc:Fallback>
+        <mc:Fallback xmlns:w16cei="http://schemas.microsoft.com/office/word/2026/wordml/cei">
           <w:pict>
             <v:line w14:anchorId="04400D3D" id="Straight Connector 6" o:spid="_x0000_s1026" style="position:absolute;z-index:251660288;visibility:visible;mso-wrap-style:square;mso-width-percent:0;mso-height-percent:0;mso-wrap-distance-left:9pt;mso-wrap-distance-top:-3e-5mm;mso-wrap-distance-right:9pt;mso-wrap-distance-bottom:-3e-5mm;mso-position-horizontal:absolute;mso-position-horizontal-relative:text;mso-position-vertical:absolute;mso-position-vertical-relative:text;mso-width-percent:0;mso-height-percent:0;mso-width-relative:page;mso-height-relative:page" from="-68.95pt,-666.45pt" to="489.05pt,-666.45pt" o:gfxdata="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" strokecolor="#4f81bd" strokeweight="2pt">
               <v:shadow on="t" opacity="24903f" origin=",.5" offset="0,.55556mm"/>
@@ -6466,7 +8352,7 @@
 </file>
 
 <file path=word/header3.xml><?xml version="1.0" encoding="utf-8"?>
-<w:hdr xmlns:wpc="http://schemas.microsoft.com/office/word/2010/wordprocessingCanvas" xmlns:cx="http://schemas.microsoft.com/office/drawing/2014/chartex" xmlns:cx1="http://schemas.microsoft.com/office/drawing/2015/9/8/chartex" xmlns:cx2="http://schemas.microsoft.com/office/drawing/2015/10/21/chartex" xmlns:cx3="http://schemas.microsoft.com/office/drawing/2016/5/9/chartex" xmlns:cx4="http://schemas.microsoft.com/office/drawing/2016/5/10/chartex" xmlns:cx5="http://schemas.microsoft.com/office/drawing/2016/5/11/chartex" xmlns:cx6="http://schemas.microsoft.com/office/drawing/2016/5/12/chartex" xmlns:cx7="http://schemas.microsoft.com/office/drawing/2016/5/13/chartex" xmlns:cx8="http://schemas.microsoft.com/office/drawing/2016/5/14/chartex" xmlns:mc="http://schemas.openxmlformats.org/markup-compatibility/2006" xmlns:aink="http://schemas.microsoft.com/office/drawing/2016/ink" xmlns:am3d="http://schemas.microsoft.com/office/drawing/2017/model3d" xmlns:o="urn:schemas-microsoft-com:office:office" xmlns:oel="http://schemas.microsoft.com/office/2019/extlst" xmlns:r="http://schemas.openxmlformats.org/officeDocument/2006/relationships" xmlns:m="http://schemas.openxmlformats.org/officeDocument/2006/math" xmlns:v="urn:schemas-microsoft-com:vml" xmlns:wp14="http://schemas.microsoft.com/office/word/2010/wordprocessingDrawing" xmlns:wp="http://schemas.openxmlformats.org/drawingml/2006/wordprocessingDrawing" xmlns:w10="urn:schemas-microsoft-com:office:word" xmlns:w="http://schemas.openxmlformats.org/wordprocessingml/2006/main" xmlns:w14="http://schemas.microsoft.com/office/word/2010/wordml" xmlns:w15="http://schemas.microsoft.com/office/word/2012/wordml" xmlns:w16cei="http://schemas.microsoft.com/office/word/2026/wordml/cei" xmlns:w16cex="http://schemas.microsoft.com/office/word/2018/wordml/cex" xmlns:w16cid="http://schemas.microsoft.com/office/word/2016/wordml/cid" xmlns:w16="http://schemas.microsoft.com/office/word/2018/wordml" xmlns:w16du="http://schemas.microsoft.com/office/word/2023/wordml/word16du" xmlns:w16sdtdh="http://schemas.microsoft.com/office/word/2020/wordml/sdtdatahash" xmlns:w16sdtfl="http://schemas.microsoft.com/office/word/2024/wordml/sdtformatlock" xmlns:w16se="http://schemas.microsoft.com/office/word/2015/wordml/symex" xmlns:wpg="http://schemas.microsoft.com/office/word/2010/wordprocessingGroup" xmlns:wpi="http://schemas.microsoft.com/office/word/2010/wordprocessingInk" xmlns:wne="http://schemas.microsoft.com/office/word/2006/wordml" xmlns:wps="http://schemas.microsoft.com/office/word/2010/wordprocessingShape" mc:Ignorable="w14 w15 w16se w16cid w16 w16cex w16sdtdh w16sdtfl w16du wp14">
+<w:hdr xmlns:wpc="http://schemas.microsoft.com/office/word/2010/wordprocessingCanvas" xmlns:cx="http://schemas.microsoft.com/office/drawing/2014/chartex" xmlns:cx1="http://schemas.microsoft.com/office/drawing/2015/9/8/chartex" xmlns:cx2="http://schemas.microsoft.com/office/drawing/2015/10/21/chartex" xmlns:cx3="http://schemas.microsoft.com/office/drawing/2016/5/9/chartex" xmlns:cx4="http://schemas.microsoft.com/office/drawing/2016/5/10/chartex" xmlns:cx5="http://schemas.microsoft.com/office/drawing/2016/5/11/chartex" xmlns:cx6="http://schemas.microsoft.com/office/drawing/2016/5/12/chartex" xmlns:cx7="http://schemas.microsoft.com/office/drawing/2016/5/13/chartex" xmlns:cx8="http://schemas.microsoft.com/office/drawing/2016/5/14/chartex" xmlns:mc="http://schemas.openxmlformats.org/markup-compatibility/2006" xmlns:m="http://schemas.openxmlformats.org/officeDocument/2006/math" xmlns:aink="http://schemas.microsoft.com/office/drawing/2016/ink" xmlns:am3d="http://schemas.microsoft.com/office/drawing/2017/model3d" xmlns:oel="http://schemas.microsoft.com/office/2019/extlst" xmlns:r="http://schemas.openxmlformats.org/officeDocument/2006/relationships" xmlns:wp14="http://schemas.microsoft.com/office/word/2010/wordprocessingDrawing" xmlns:wp="http://schemas.openxmlformats.org/drawingml/2006/wordprocessingDrawing" xmlns:wpg="http://schemas.microsoft.com/office/word/2010/wordprocessingGroup" xmlns:wpi="http://schemas.microsoft.com/office/word/2010/wordprocessingInk" xmlns:wps="http://schemas.microsoft.com/office/word/2010/wordprocessingShape" xmlns:o="urn:schemas-microsoft-com:office:office" xmlns:v="urn:schemas-microsoft-com:vml" xmlns:w10="urn:schemas-microsoft-com:office:word" xmlns:w="http://schemas.openxmlformats.org/wordprocessingml/2006/main" xmlns:w14="http://schemas.microsoft.com/office/word/2010/wordml" xmlns:w15="http://schemas.microsoft.com/office/word/2012/wordml" xmlns:w16cex="http://schemas.microsoft.com/office/word/2018/wordml/cex" xmlns:w16cid="http://schemas.microsoft.com/office/word/2016/wordml/cid" xmlns:w16="http://schemas.microsoft.com/office/word/2018/wordml" xmlns:w16sdtdh="http://schemas.microsoft.com/office/word/2020/wordml/sdtdatahash" xmlns:w16sdtfl="http://schemas.microsoft.com/office/word/2024/wordml/sdtformatlock" xmlns:w16se="http://schemas.microsoft.com/office/word/2015/wordml/symex" xmlns:w16du="http://schemas.microsoft.com/office/word/2023/wordml/word16du" xmlns:wne="http://schemas.microsoft.com/office/word/2006/wordml" mc:Ignorable="w14 w15 w16se w16cid w16 w16cex w16sdtdh w16sdtfl w16du wp14">
   <w:tbl>
     <w:tblPr>
       <w:tblW w:w="6410" w:type="pct"/>
@@ -6746,7 +8632,7 @@
 </file>
 
 <file path=word/numbering.xml><?xml version="1.0" encoding="utf-8"?>
-<w:numbering xmlns:wpc="http://schemas.microsoft.com/office/word/2010/wordprocessingCanvas" xmlns:cx="http://schemas.microsoft.com/office/drawing/2014/chartex" xmlns:cx1="http://schemas.microsoft.com/office/drawing/2015/9/8/chartex" xmlns:cx2="http://schemas.microsoft.com/office/drawing/2015/10/21/chartex" xmlns:cx3="http://schemas.microsoft.com/office/drawing/2016/5/9/chartex" xmlns:cx4="http://schemas.microsoft.com/office/drawing/2016/5/10/chartex" xmlns:cx5="http://schemas.microsoft.com/office/drawing/2016/5/11/chartex" xmlns:cx6="http://schemas.microsoft.com/office/drawing/2016/5/12/chartex" xmlns:cx7="http://schemas.microsoft.com/office/drawing/2016/5/13/chartex" xmlns:cx8="http://schemas.microsoft.com/office/drawing/2016/5/14/chartex" xmlns:mc="http://schemas.openxmlformats.org/markup-compatibility/2006" xmlns:aink="http://schemas.microsoft.com/office/drawing/2016/ink" xmlns:am3d="http://schemas.microsoft.com/office/drawing/2017/model3d" xmlns:o="urn:schemas-microsoft-com:office:office" xmlns:oel="http://schemas.microsoft.com/office/2019/extlst" xmlns:r="http://schemas.openxmlformats.org/officeDocument/2006/relationships" xmlns:m="http://schemas.openxmlformats.org/officeDocument/2006/math" xmlns:v="urn:schemas-microsoft-com:vml" xmlns:wp14="http://schemas.microsoft.com/office/word/2010/wordprocessingDrawing" xmlns:wp="http://schemas.openxmlformats.org/drawingml/2006/wordprocessingDrawing" xmlns:w10="urn:schemas-microsoft-com:office:word" xmlns:w="http://schemas.openxmlformats.org/wordprocessingml/2006/main" xmlns:w14="http://schemas.microsoft.com/office/word/2010/wordml" xmlns:w15="http://schemas.microsoft.com/office/word/2012/wordml" xmlns:w16cei="http://schemas.microsoft.com/office/word/2026/wordml/cei" xmlns:w16cex="http://schemas.microsoft.com/office/word/2018/wordml/cex" xmlns:w16cid="http://schemas.microsoft.com/office/word/2016/wordml/cid" xmlns:w16="http://schemas.microsoft.com/office/word/2018/wordml" xmlns:w16du="http://schemas.microsoft.com/office/word/2023/wordml/word16du" xmlns:w16sdtdh="http://schemas.microsoft.com/office/word/2020/wordml/sdtdatahash" xmlns:w16sdtfl="http://schemas.microsoft.com/office/word/2024/wordml/sdtformatlock" xmlns:w16se="http://schemas.microsoft.com/office/word/2015/wordml/symex" xmlns:wpg="http://schemas.microsoft.com/office/word/2010/wordprocessingGroup" xmlns:wpi="http://schemas.microsoft.com/office/word/2010/wordprocessingInk" xmlns:wne="http://schemas.microsoft.com/office/word/2006/wordml" xmlns:wps="http://schemas.microsoft.com/office/word/2010/wordprocessingShape" mc:Ignorable="w14 w15 w16se w16cid w16 w16cex w16sdtdh w16sdtfl w16du wp14">
+<w:numbering xmlns:wpc="http://schemas.microsoft.com/office/word/2010/wordprocessingCanvas" xmlns:cx="http://schemas.microsoft.com/office/drawing/2014/chartex" xmlns:cx1="http://schemas.microsoft.com/office/drawing/2015/9/8/chartex" xmlns:cx2="http://schemas.microsoft.com/office/drawing/2015/10/21/chartex" xmlns:cx3="http://schemas.microsoft.com/office/drawing/2016/5/9/chartex" xmlns:cx4="http://schemas.microsoft.com/office/drawing/2016/5/10/chartex" xmlns:cx5="http://schemas.microsoft.com/office/drawing/2016/5/11/chartex" xmlns:cx6="http://schemas.microsoft.com/office/drawing/2016/5/12/chartex" xmlns:cx7="http://schemas.microsoft.com/office/drawing/2016/5/13/chartex" xmlns:cx8="http://schemas.microsoft.com/office/drawing/2016/5/14/chartex" xmlns:mc="http://schemas.openxmlformats.org/markup-compatibility/2006" xmlns:m="http://schemas.openxmlformats.org/officeDocument/2006/math" xmlns:aink="http://schemas.microsoft.com/office/drawing/2016/ink" xmlns:am3d="http://schemas.microsoft.com/office/drawing/2017/model3d" xmlns:oel="http://schemas.microsoft.com/office/2019/extlst" xmlns:r="http://schemas.openxmlformats.org/officeDocument/2006/relationships" xmlns:wp14="http://schemas.microsoft.com/office/word/2010/wordprocessingDrawing" xmlns:wp="http://schemas.openxmlformats.org/drawingml/2006/wordprocessingDrawing" xmlns:wpg="http://schemas.microsoft.com/office/word/2010/wordprocessingGroup" xmlns:wpi="http://schemas.microsoft.com/office/word/2010/wordprocessingInk" xmlns:wps="http://schemas.microsoft.com/office/word/2010/wordprocessingShape" xmlns:o="urn:schemas-microsoft-com:office:office" xmlns:v="urn:schemas-microsoft-com:vml" xmlns:w10="urn:schemas-microsoft-com:office:word" xmlns:w="http://schemas.openxmlformats.org/wordprocessingml/2006/main" xmlns:w14="http://schemas.microsoft.com/office/word/2010/wordml" xmlns:w15="http://schemas.microsoft.com/office/word/2012/wordml" xmlns:w16cex="http://schemas.microsoft.com/office/word/2018/wordml/cex" xmlns:w16cid="http://schemas.microsoft.com/office/word/2016/wordml/cid" xmlns:w16="http://schemas.microsoft.com/office/word/2018/wordml" xmlns:w16sdtdh="http://schemas.microsoft.com/office/word/2020/wordml/sdtdatahash" xmlns:w16sdtfl="http://schemas.microsoft.com/office/word/2024/wordml/sdtformatlock" xmlns:w16se="http://schemas.microsoft.com/office/word/2015/wordml/symex" xmlns:w16du="http://schemas.microsoft.com/office/word/2023/wordml/word16du" xmlns:wne="http://schemas.microsoft.com/office/word/2006/wordml" mc:Ignorable="w14 w15 w16se w16cid w16 w16cex w16sdtdh w16sdtfl w16du wp14">
   <w:abstractNum w:abstractNumId="0" w15:restartNumberingAfterBreak="0">
     <w:nsid w:val="FFFFFF89"/>
     <w:multiLevelType w:val="singleLevel"/>
@@ -9100,7 +10986,7 @@
 </file>
 
 <file path=word/styles.xml><?xml version="1.0" encoding="utf-8"?>
-<w:styles xmlns:mc="http://schemas.openxmlformats.org/markup-compatibility/2006" xmlns:r="http://schemas.openxmlformats.org/officeDocument/2006/relationships" xmlns:w="http://schemas.openxmlformats.org/wordprocessingml/2006/main" xmlns:w14="http://schemas.microsoft.com/office/word/2010/wordml" xmlns:w15="http://schemas.microsoft.com/office/word/2012/wordml" xmlns:w16cex="http://schemas.microsoft.com/office/word/2018/wordml/cex" xmlns:w16cid="http://schemas.microsoft.com/office/word/2016/wordml/cid" xmlns:w16="http://schemas.microsoft.com/office/word/2018/wordml" xmlns:w16du="http://schemas.microsoft.com/office/word/2023/wordml/word16du" xmlns:w16sdtdh="http://schemas.microsoft.com/office/word/2020/wordml/sdtdatahash" xmlns:w16sdtfl="http://schemas.microsoft.com/office/word/2024/wordml/sdtformatlock" xmlns:w16se="http://schemas.microsoft.com/office/word/2015/wordml/symex" mc:Ignorable="w14 w15 w16se w16cid w16 w16cex w16sdtdh w16sdtfl w16du">
+<w:styles xmlns:mc="http://schemas.openxmlformats.org/markup-compatibility/2006" xmlns:r="http://schemas.openxmlformats.org/officeDocument/2006/relationships" xmlns:w="http://schemas.openxmlformats.org/wordprocessingml/2006/main" xmlns:w14="http://schemas.microsoft.com/office/word/2010/wordml" xmlns:w15="http://schemas.microsoft.com/office/word/2012/wordml" xmlns:w16cex="http://schemas.microsoft.com/office/word/2018/wordml/cex" xmlns:w16cid="http://schemas.microsoft.com/office/word/2016/wordml/cid" xmlns:w16="http://schemas.microsoft.com/office/word/2018/wordml" xmlns:w16sdtdh="http://schemas.microsoft.com/office/word/2020/wordml/sdtdatahash" xmlns:w16sdtfl="http://schemas.microsoft.com/office/word/2024/wordml/sdtformatlock" xmlns:w16se="http://schemas.microsoft.com/office/word/2015/wordml/symex" xmlns:w16du="http://schemas.microsoft.com/office/word/2023/wordml/word16du" mc:Ignorable="w14 w15 w16se w16cid w16 w16cex w16sdtdh w16sdtfl w16du">
   <w:docDefaults>
     <w:rPrDefault>
       <w:rPr>
@@ -10393,11 +12279,137 @@
       <w:lang w:eastAsia="en-US"/>
     </w:rPr>
   </w:style>
+  <w:style w:type="paragraph" w:customStyle="1" w:styleId="p1">
+    <w:name w:val="p1"/>
+    <w:basedOn w:val="a1"/>
+    <w:rsid w:val="0071712B"/>
+    <w:pPr>
+      <w:spacing w:after="0" w:line="240" w:lineRule="auto"/>
+    </w:pPr>
+    <w:rPr>
+      <w:rFonts w:ascii="Helvetica" w:eastAsiaTheme="minorEastAsia" w:hAnsi="Helvetica" w:cs="Times New Roman"/>
+      <w:color w:val="FF0000"/>
+      <w:sz w:val="23"/>
+      <w:szCs w:val="23"/>
+      <w:lang w:eastAsia="en-US"/>
+    </w:rPr>
+  </w:style>
+  <w:style w:type="paragraph" w:customStyle="1" w:styleId="p2">
+    <w:name w:val="p2"/>
+    <w:basedOn w:val="a1"/>
+    <w:rsid w:val="0071712B"/>
+    <w:pPr>
+      <w:spacing w:after="0" w:line="240" w:lineRule="auto"/>
+    </w:pPr>
+    <w:rPr>
+      <w:rFonts w:ascii="Helvetica" w:eastAsiaTheme="minorEastAsia" w:hAnsi="Helvetica" w:cs="Times New Roman"/>
+      <w:color w:val="00B0F0"/>
+      <w:sz w:val="23"/>
+      <w:szCs w:val="23"/>
+      <w:lang w:eastAsia="en-US"/>
+    </w:rPr>
+  </w:style>
+  <w:style w:type="paragraph" w:customStyle="1" w:styleId="p3">
+    <w:name w:val="p3"/>
+    <w:basedOn w:val="a1"/>
+    <w:rsid w:val="0071712B"/>
+    <w:pPr>
+      <w:spacing w:after="0" w:line="240" w:lineRule="auto"/>
+    </w:pPr>
+    <w:rPr>
+      <w:rFonts w:ascii="Times New Roman" w:eastAsiaTheme="minorEastAsia" w:hAnsi="Times New Roman" w:cs="Times New Roman"/>
+      <w:color w:val="000000"/>
+      <w:lang w:eastAsia="en-US"/>
+    </w:rPr>
+  </w:style>
+  <w:style w:type="character" w:customStyle="1" w:styleId="s1">
+    <w:name w:val="s1"/>
+    <w:basedOn w:val="a2"/>
+    <w:rsid w:val="0071712B"/>
+    <w:rPr>
+      <w:rFonts w:ascii="Helvetica" w:hAnsi="Helvetica" w:hint="default"/>
+      <w:b w:val="0"/>
+      <w:bCs w:val="0"/>
+      <w:i w:val="0"/>
+      <w:iCs w:val="0"/>
+      <w:sz w:val="23"/>
+      <w:szCs w:val="23"/>
+    </w:rPr>
+  </w:style>
+  <w:style w:type="character" w:customStyle="1" w:styleId="s2">
+    <w:name w:val="s2"/>
+    <w:basedOn w:val="a2"/>
+    <w:rsid w:val="0071712B"/>
+    <w:rPr>
+      <w:rFonts w:ascii="Times New Roman" w:hAnsi="Times New Roman" w:cs="Times New Roman" w:hint="default"/>
+      <w:b w:val="0"/>
+      <w:bCs w:val="0"/>
+      <w:i w:val="0"/>
+      <w:iCs w:val="0"/>
+      <w:sz w:val="20"/>
+      <w:szCs w:val="20"/>
+    </w:rPr>
+  </w:style>
+  <w:style w:type="paragraph" w:customStyle="1" w:styleId="p4">
+    <w:name w:val="p4"/>
+    <w:basedOn w:val="a1"/>
+    <w:rsid w:val="00153A56"/>
+    <w:pPr>
+      <w:spacing w:after="0" w:line="240" w:lineRule="auto"/>
+    </w:pPr>
+    <w:rPr>
+      <w:rFonts w:ascii="Times New Roman" w:eastAsiaTheme="minorEastAsia" w:hAnsi="Times New Roman" w:cs="Times New Roman"/>
+      <w:color w:val="000000"/>
+      <w:lang w:eastAsia="en-US"/>
+    </w:rPr>
+  </w:style>
+  <w:style w:type="character" w:customStyle="1" w:styleId="s3">
+    <w:name w:val="s3"/>
+    <w:basedOn w:val="a2"/>
+    <w:rsid w:val="00153A56"/>
+    <w:rPr>
+      <w:rFonts w:ascii="Helvetica" w:hAnsi="Helvetica" w:hint="default"/>
+      <w:b w:val="0"/>
+      <w:bCs w:val="0"/>
+      <w:i w:val="0"/>
+      <w:iCs w:val="0"/>
+      <w:sz w:val="20"/>
+      <w:szCs w:val="20"/>
+    </w:rPr>
+  </w:style>
+  <w:style w:type="character" w:customStyle="1" w:styleId="s4">
+    <w:name w:val="s4"/>
+    <w:basedOn w:val="a2"/>
+    <w:rsid w:val="00153A56"/>
+    <w:rPr>
+      <w:rFonts w:ascii="TimesNewRomanPS-BoldMT" w:hAnsi="TimesNewRomanPS-BoldMT" w:hint="default"/>
+      <w:b/>
+      <w:bCs/>
+      <w:i w:val="0"/>
+      <w:iCs w:val="0"/>
+      <w:sz w:val="20"/>
+      <w:szCs w:val="20"/>
+    </w:rPr>
+  </w:style>
+  <w:style w:type="character" w:customStyle="1" w:styleId="s5">
+    <w:name w:val="s5"/>
+    <w:basedOn w:val="a2"/>
+    <w:rsid w:val="00153A56"/>
+    <w:rPr>
+      <w:rFonts w:ascii="Times New Roman" w:hAnsi="Times New Roman" w:cs="Times New Roman" w:hint="default"/>
+      <w:b w:val="0"/>
+      <w:bCs w:val="0"/>
+      <w:i w:val="0"/>
+      <w:iCs w:val="0"/>
+      <w:sz w:val="20"/>
+      <w:szCs w:val="20"/>
+    </w:rPr>
+  </w:style>
 </w:styles>
 </file>
 
 <file path=word/glossary/document.xml><?xml version="1.0" encoding="utf-8"?>
-<w:glossaryDocument xmlns:wpc="http://schemas.microsoft.com/office/word/2010/wordprocessingCanvas" xmlns:cx="http://schemas.microsoft.com/office/drawing/2014/chartex" xmlns:cx1="http://schemas.microsoft.com/office/drawing/2015/9/8/chartex" xmlns:cx2="http://schemas.microsoft.com/office/drawing/2015/10/21/chartex" xmlns:cx3="http://schemas.microsoft.com/office/drawing/2016/5/9/chartex" xmlns:cx4="http://schemas.microsoft.com/office/drawing/2016/5/10/chartex" xmlns:cx5="http://schemas.microsoft.com/office/drawing/2016/5/11/chartex" xmlns:cx6="http://schemas.microsoft.com/office/drawing/2016/5/12/chartex" xmlns:cx7="http://schemas.microsoft.com/office/drawing/2016/5/13/chartex" xmlns:cx8="http://schemas.microsoft.com/office/drawing/2016/5/14/chartex" xmlns:mc="http://schemas.openxmlformats.org/markup-compatibility/2006" xmlns:aink="http://schemas.microsoft.com/office/drawing/2016/ink" xmlns:am3d="http://schemas.microsoft.com/office/drawing/2017/model3d" xmlns:o="urn:schemas-microsoft-com:office:office" xmlns:oel="http://schemas.microsoft.com/office/2019/extlst" xmlns:r="http://schemas.openxmlformats.org/officeDocument/2006/relationships" xmlns:m="http://schemas.openxmlformats.org/officeDocument/2006/math" xmlns:v="urn:schemas-microsoft-com:vml" xmlns:wp14="http://schemas.microsoft.com/office/word/2010/wordprocessingDrawing" xmlns:wp="http://schemas.openxmlformats.org/drawingml/2006/wordprocessingDrawing" xmlns:w10="urn:schemas-microsoft-com:office:word" xmlns:w="http://schemas.openxmlformats.org/wordprocessingml/2006/main" xmlns:w14="http://schemas.microsoft.com/office/word/2010/wordml" xmlns:w15="http://schemas.microsoft.com/office/word/2012/wordml" xmlns:w16cei="http://schemas.microsoft.com/office/word/2026/wordml/cei" xmlns:w16cex="http://schemas.microsoft.com/office/word/2018/wordml/cex" xmlns:w16cid="http://schemas.microsoft.com/office/word/2016/wordml/cid" xmlns:w16="http://schemas.microsoft.com/office/word/2018/wordml" xmlns:w16du="http://schemas.microsoft.com/office/word/2023/wordml/word16du" xmlns:w16sdtdh="http://schemas.microsoft.com/office/word/2020/wordml/sdtdatahash" xmlns:w16sdtfl="http://schemas.microsoft.com/office/word/2024/wordml/sdtformatlock" xmlns:w16se="http://schemas.microsoft.com/office/word/2015/wordml/symex" xmlns:wpg="http://schemas.microsoft.com/office/word/2010/wordprocessingGroup" xmlns:wpi="http://schemas.microsoft.com/office/word/2010/wordprocessingInk" xmlns:wne="http://schemas.microsoft.com/office/word/2006/wordml" xmlns:wps="http://schemas.microsoft.com/office/word/2010/wordprocessingShape" mc:Ignorable="w14 w15 w16se w16cid w16 w16cex w16sdtdh w16sdtfl w16du wp14">
+<w:glossaryDocument xmlns:wpc="http://schemas.microsoft.com/office/word/2010/wordprocessingCanvas" xmlns:cx="http://schemas.microsoft.com/office/drawing/2014/chartex" xmlns:cx1="http://schemas.microsoft.com/office/drawing/2015/9/8/chartex" xmlns:cx2="http://schemas.microsoft.com/office/drawing/2015/10/21/chartex" xmlns:cx3="http://schemas.microsoft.com/office/drawing/2016/5/9/chartex" xmlns:cx4="http://schemas.microsoft.com/office/drawing/2016/5/10/chartex" xmlns:cx5="http://schemas.microsoft.com/office/drawing/2016/5/11/chartex" xmlns:cx6="http://schemas.microsoft.com/office/drawing/2016/5/12/chartex" xmlns:cx7="http://schemas.microsoft.com/office/drawing/2016/5/13/chartex" xmlns:cx8="http://schemas.microsoft.com/office/drawing/2016/5/14/chartex" xmlns:mc="http://schemas.openxmlformats.org/markup-compatibility/2006" xmlns:m="http://schemas.openxmlformats.org/officeDocument/2006/math" xmlns:aink="http://schemas.microsoft.com/office/drawing/2016/ink" xmlns:am3d="http://schemas.microsoft.com/office/drawing/2017/model3d" xmlns:oel="http://schemas.microsoft.com/office/2019/extlst" xmlns:r="http://schemas.openxmlformats.org/officeDocument/2006/relationships" xmlns:wp14="http://schemas.microsoft.com/office/word/2010/wordprocessingDrawing" xmlns:wp="http://schemas.openxmlformats.org/drawingml/2006/wordprocessingDrawing" xmlns:wpg="http://schemas.microsoft.com/office/word/2010/wordprocessingGroup" xmlns:wpi="http://schemas.microsoft.com/office/word/2010/wordprocessingInk" xmlns:wps="http://schemas.microsoft.com/office/word/2010/wordprocessingShape" xmlns:o="urn:schemas-microsoft-com:office:office" xmlns:v="urn:schemas-microsoft-com:vml" xmlns:w10="urn:schemas-microsoft-com:office:word" xmlns:w="http://schemas.openxmlformats.org/wordprocessingml/2006/main" xmlns:w14="http://schemas.microsoft.com/office/word/2010/wordml" xmlns:w15="http://schemas.microsoft.com/office/word/2012/wordml" xmlns:w16cex="http://schemas.microsoft.com/office/word/2018/wordml/cex" xmlns:w16cid="http://schemas.microsoft.com/office/word/2016/wordml/cid" xmlns:w16="http://schemas.microsoft.com/office/word/2018/wordml" xmlns:w16sdtdh="http://schemas.microsoft.com/office/word/2020/wordml/sdtdatahash" xmlns:w16sdtfl="http://schemas.microsoft.com/office/word/2024/wordml/sdtformatlock" xmlns:w16se="http://schemas.microsoft.com/office/word/2015/wordml/symex" xmlns:w16du="http://schemas.microsoft.com/office/word/2023/wordml/word16du" xmlns:wne="http://schemas.microsoft.com/office/word/2006/wordml" mc:Ignorable="w14 w15 w16se w16cid w16 w16cex w16sdtdh w16sdtfl w16du wp14">
   <w:docParts>
     <w:docPart>
       <w:docPartPr>
@@ -10482,7 +12494,7 @@
 </file>
 
 <file path=word/glossary/fontTable.xml><?xml version="1.0" encoding="utf-8"?>
-<w:fonts xmlns:mc="http://schemas.openxmlformats.org/markup-compatibility/2006" xmlns:r="http://schemas.openxmlformats.org/officeDocument/2006/relationships" xmlns:w="http://schemas.openxmlformats.org/wordprocessingml/2006/main" xmlns:w14="http://schemas.microsoft.com/office/word/2010/wordml" xmlns:w15="http://schemas.microsoft.com/office/word/2012/wordml" xmlns:w16cex="http://schemas.microsoft.com/office/word/2018/wordml/cex" xmlns:w16cid="http://schemas.microsoft.com/office/word/2016/wordml/cid" xmlns:w16="http://schemas.microsoft.com/office/word/2018/wordml" xmlns:w16du="http://schemas.microsoft.com/office/word/2023/wordml/word16du" xmlns:w16sdtdh="http://schemas.microsoft.com/office/word/2020/wordml/sdtdatahash" xmlns:w16sdtfl="http://schemas.microsoft.com/office/word/2024/wordml/sdtformatlock" xmlns:w16se="http://schemas.microsoft.com/office/word/2015/wordml/symex" mc:Ignorable="w14 w15 w16se w16cid w16 w16cex w16sdtdh w16sdtfl w16du">
+<w:fonts xmlns:mc="http://schemas.openxmlformats.org/markup-compatibility/2006" xmlns:r="http://schemas.openxmlformats.org/officeDocument/2006/relationships" xmlns:w="http://schemas.openxmlformats.org/wordprocessingml/2006/main" xmlns:w14="http://schemas.microsoft.com/office/word/2010/wordml" xmlns:w15="http://schemas.microsoft.com/office/word/2012/wordml" xmlns:w16cex="http://schemas.microsoft.com/office/word/2018/wordml/cex" xmlns:w16cid="http://schemas.microsoft.com/office/word/2016/wordml/cid" xmlns:w16="http://schemas.microsoft.com/office/word/2018/wordml" xmlns:w16sdtdh="http://schemas.microsoft.com/office/word/2020/wordml/sdtdatahash" xmlns:w16sdtfl="http://schemas.microsoft.com/office/word/2024/wordml/sdtformatlock" xmlns:w16se="http://schemas.microsoft.com/office/word/2015/wordml/symex" xmlns:w16du="http://schemas.microsoft.com/office/word/2023/wordml/word16du" mc:Ignorable="w14 w15 w16se w16cid w16 w16cex w16sdtdh w16sdtfl w16du">
   <w:font w:name="Cambria">
     <w:panose1 w:val="02040503050406030204"/>
     <w:charset w:val="00"/>
@@ -10500,14 +12512,14 @@
   <w:font w:name="Symbol">
     <w:panose1 w:val="05050102010706020507"/>
     <w:charset w:val="02"/>
-    <w:family w:val="roman"/>
+    <w:family w:val="decorative"/>
     <w:pitch w:val="variable"/>
     <w:sig w:usb0="00000000" w:usb1="10000000" w:usb2="00000000" w:usb3="00000000" w:csb0="80000000" w:csb1="00000000"/>
   </w:font>
   <w:font w:name="Wingdings">
     <w:panose1 w:val="05000000000000000000"/>
     <w:charset w:val="02"/>
-    <w:family w:val="auto"/>
+    <w:family w:val="decorative"/>
     <w:pitch w:val="variable"/>
     <w:sig w:usb0="00000000" w:usb1="10000000" w:usb2="00000000" w:usb3="00000000" w:csb0="80000000" w:csb1="00000000"/>
   </w:font>
@@ -10523,7 +12535,7 @@
     <w:charset w:val="00"/>
     <w:family w:val="swiss"/>
     <w:pitch w:val="variable"/>
-    <w:sig w:usb0="E0002EFF" w:usb1="C000785B" w:usb2="00000009" w:usb3="00000000" w:csb0="000001FF" w:csb1="00000000"/>
+    <w:sig w:usb0="E0002AFF" w:usb1="C0007843" w:usb2="00000009" w:usb3="00000000" w:csb0="000001FF" w:csb1="00000000"/>
   </w:font>
   <w:font w:name="MS PGothic">
     <w:panose1 w:val="020B0600070205080204"/>
@@ -10539,13 +12551,29 @@
     <w:pitch w:val="variable"/>
     <w:sig w:usb0="E1002EFF" w:usb1="C000605B" w:usb2="00000029" w:usb3="00000000" w:csb0="000101FF" w:csb1="00000000"/>
   </w:font>
+  <w:font w:name="Helvetica">
+    <w:panose1 w:val="00000000000000000000"/>
+    <w:charset w:val="00"/>
+    <w:family w:val="auto"/>
+    <w:pitch w:val="variable"/>
+    <w:sig w:usb0="E00002FF" w:usb1="5000785B" w:usb2="00000000" w:usb3="00000000" w:csb0="0000019F" w:csb1="00000000"/>
+  </w:font>
+  <w:font w:name="TimesNewRomanPS-BoldMT">
+    <w:altName w:val="Times New Roman"/>
+    <w:panose1 w:val="020B0604020202020204"/>
+    <w:charset w:val="00"/>
+    <w:family w:val="roman"/>
+    <w:pitch w:val="default"/>
+  </w:font>
   <w:font w:name="Aptos">
+    <w:panose1 w:val="020B0004020202020204"/>
     <w:charset w:val="00"/>
     <w:family w:val="swiss"/>
     <w:pitch w:val="variable"/>
     <w:sig w:usb0="20000287" w:usb1="00000003" w:usb2="00000000" w:usb3="00000000" w:csb0="0000019F" w:csb1="00000000"/>
   </w:font>
   <w:font w:name="Yu Mincho">
+    <w:panose1 w:val="02020400000000000000"/>
     <w:charset w:val="80"/>
     <w:family w:val="roman"/>
     <w:pitch w:val="variable"/>
@@ -10559,6 +12587,7 @@
     <w:sig w:usb0="E00002FF" w:usb1="2AC7FDFF" w:usb2="00000016" w:usb3="00000000" w:csb0="0002009F" w:csb1="00000000"/>
   </w:font>
   <w:font w:name="Aptos Display">
+    <w:panose1 w:val="020B0004020202020204"/>
     <w:charset w:val="00"/>
     <w:family w:val="swiss"/>
     <w:pitch w:val="variable"/>
@@ -10568,7 +12597,7 @@
 </file>
 
 <file path=word/glossary/numbering.xml><?xml version="1.0" encoding="utf-8"?>
-<w:numbering xmlns:wpc="http://schemas.microsoft.com/office/word/2010/wordprocessingCanvas" xmlns:cx="http://schemas.microsoft.com/office/drawing/2014/chartex" xmlns:cx1="http://schemas.microsoft.com/office/drawing/2015/9/8/chartex" xmlns:cx2="http://schemas.microsoft.com/office/drawing/2015/10/21/chartex" xmlns:cx3="http://schemas.microsoft.com/office/drawing/2016/5/9/chartex" xmlns:cx4="http://schemas.microsoft.com/office/drawing/2016/5/10/chartex" xmlns:cx5="http://schemas.microsoft.com/office/drawing/2016/5/11/chartex" xmlns:cx6="http://schemas.microsoft.com/office/drawing/2016/5/12/chartex" xmlns:cx7="http://schemas.microsoft.com/office/drawing/2016/5/13/chartex" xmlns:cx8="http://schemas.microsoft.com/office/drawing/2016/5/14/chartex" xmlns:mc="http://schemas.openxmlformats.org/markup-compatibility/2006" xmlns:aink="http://schemas.microsoft.com/office/drawing/2016/ink" xmlns:am3d="http://schemas.microsoft.com/office/drawing/2017/model3d" xmlns:o="urn:schemas-microsoft-com:office:office" xmlns:oel="http://schemas.microsoft.com/office/2019/extlst" xmlns:r="http://schemas.openxmlformats.org/officeDocument/2006/relationships" xmlns:m="http://schemas.openxmlformats.org/officeDocument/2006/math" xmlns:v="urn:schemas-microsoft-com:vml" xmlns:wp14="http://schemas.microsoft.com/office/word/2010/wordprocessingDrawing" xmlns:wp="http://schemas.openxmlformats.org/drawingml/2006/wordprocessingDrawing" xmlns:w10="urn:schemas-microsoft-com:office:word" xmlns:w="http://schemas.openxmlformats.org/wordprocessingml/2006/main" xmlns:w14="http://schemas.microsoft.com/office/word/2010/wordml" xmlns:w15="http://schemas.microsoft.com/office/word/2012/wordml" xmlns:w16cei="http://schemas.microsoft.com/office/word/2026/wordml/cei" xmlns:w16cex="http://schemas.microsoft.com/office/word/2018/wordml/cex" xmlns:w16cid="http://schemas.microsoft.com/office/word/2016/wordml/cid" xmlns:w16="http://schemas.microsoft.com/office/word/2018/wordml" xmlns:w16du="http://schemas.microsoft.com/office/word/2023/wordml/word16du" xmlns:w16sdtdh="http://schemas.microsoft.com/office/word/2020/wordml/sdtdatahash" xmlns:w16sdtfl="http://schemas.microsoft.com/office/word/2024/wordml/sdtformatlock" xmlns:w16se="http://schemas.microsoft.com/office/word/2015/wordml/symex" xmlns:wpg="http://schemas.microsoft.com/office/word/2010/wordprocessingGroup" xmlns:wpi="http://schemas.microsoft.com/office/word/2010/wordprocessingInk" xmlns:wne="http://schemas.microsoft.com/office/word/2006/wordml" xmlns:wps="http://schemas.microsoft.com/office/word/2010/wordprocessingShape" mc:Ignorable="w14 w15 w16se w16cid w16 w16cex w16sdtdh w16sdtfl w16du wp14">
+<w:numbering xmlns:wpc="http://schemas.microsoft.com/office/word/2010/wordprocessingCanvas" xmlns:cx="http://schemas.microsoft.com/office/drawing/2014/chartex" xmlns:cx1="http://schemas.microsoft.com/office/drawing/2015/9/8/chartex" xmlns:cx2="http://schemas.microsoft.com/office/drawing/2015/10/21/chartex" xmlns:cx3="http://schemas.microsoft.com/office/drawing/2016/5/9/chartex" xmlns:cx4="http://schemas.microsoft.com/office/drawing/2016/5/10/chartex" xmlns:cx5="http://schemas.microsoft.com/office/drawing/2016/5/11/chartex" xmlns:cx6="http://schemas.microsoft.com/office/drawing/2016/5/12/chartex" xmlns:cx7="http://schemas.microsoft.com/office/drawing/2016/5/13/chartex" xmlns:cx8="http://schemas.microsoft.com/office/drawing/2016/5/14/chartex" xmlns:mc="http://schemas.openxmlformats.org/markup-compatibility/2006" xmlns:m="http://schemas.openxmlformats.org/officeDocument/2006/math" xmlns:aink="http://schemas.microsoft.com/office/drawing/2016/ink" xmlns:am3d="http://schemas.microsoft.com/office/drawing/2017/model3d" xmlns:oel="http://schemas.microsoft.com/office/2019/extlst" xmlns:r="http://schemas.openxmlformats.org/officeDocument/2006/relationships" xmlns:wp14="http://schemas.microsoft.com/office/word/2010/wordprocessingDrawing" xmlns:wp="http://schemas.openxmlformats.org/drawingml/2006/wordprocessingDrawing" xmlns:wpg="http://schemas.microsoft.com/office/word/2010/wordprocessingGroup" xmlns:wpi="http://schemas.microsoft.com/office/word/2010/wordprocessingInk" xmlns:wps="http://schemas.microsoft.com/office/word/2010/wordprocessingShape" xmlns:o="urn:schemas-microsoft-com:office:office" xmlns:v="urn:schemas-microsoft-com:vml" xmlns:w10="urn:schemas-microsoft-com:office:word" xmlns:w="http://schemas.openxmlformats.org/wordprocessingml/2006/main" xmlns:w14="http://schemas.microsoft.com/office/word/2010/wordml" xmlns:w15="http://schemas.microsoft.com/office/word/2012/wordml" xmlns:w16cex="http://schemas.microsoft.com/office/word/2018/wordml/cex" xmlns:w16cid="http://schemas.microsoft.com/office/word/2016/wordml/cid" xmlns:w16="http://schemas.microsoft.com/office/word/2018/wordml" xmlns:w16sdtdh="http://schemas.microsoft.com/office/word/2020/wordml/sdtdatahash" xmlns:w16sdtfl="http://schemas.microsoft.com/office/word/2024/wordml/sdtformatlock" xmlns:w16se="http://schemas.microsoft.com/office/word/2015/wordml/symex" xmlns:w16du="http://schemas.microsoft.com/office/word/2023/wordml/word16du" xmlns:wne="http://schemas.microsoft.com/office/word/2006/wordml" mc:Ignorable="w14 w15 w16se w16cid w16 w16cex w16sdtdh w16sdtfl w16du wp14">
   <w:abstractNum w:abstractNumId="0" w15:restartNumberingAfterBreak="0">
     <w:nsid w:val="FFFFFF89"/>
     <w:multiLevelType w:val="singleLevel"/>
@@ -10595,7 +12624,7 @@
 </file>
 
 <file path=word/glossary/settings.xml><?xml version="1.0" encoding="utf-8"?>
-<w:settings xmlns:mc="http://schemas.openxmlformats.org/markup-compatibility/2006" xmlns:o="urn:schemas-microsoft-com:office:office" xmlns:r="http://schemas.openxmlformats.org/officeDocument/2006/relationships" xmlns:m="http://schemas.openxmlformats.org/officeDocument/2006/math" xmlns:v="urn:schemas-microsoft-com:vml" xmlns:w10="urn:schemas-microsoft-com:office:word" xmlns:w="http://schemas.openxmlformats.org/wordprocessingml/2006/main" xmlns:w14="http://schemas.microsoft.com/office/word/2010/wordml" xmlns:w15="http://schemas.microsoft.com/office/word/2012/wordml" xmlns:w16cex="http://schemas.microsoft.com/office/word/2018/wordml/cex" xmlns:w16cid="http://schemas.microsoft.com/office/word/2016/wordml/cid" xmlns:w16="http://schemas.microsoft.com/office/word/2018/wordml" xmlns:w16du="http://schemas.microsoft.com/office/word/2023/wordml/word16du" xmlns:w16sdtdh="http://schemas.microsoft.com/office/word/2020/wordml/sdtdatahash" xmlns:w16sdtfl="http://schemas.microsoft.com/office/word/2024/wordml/sdtformatlock" xmlns:w16se="http://schemas.microsoft.com/office/word/2015/wordml/symex" xmlns:sl="http://schemas.openxmlformats.org/schemaLibrary/2006/main" mc:Ignorable="w14 w15 w16se w16cid w16 w16cex w16sdtdh w16sdtfl w16du">
+<w:settings xmlns:mc="http://schemas.openxmlformats.org/markup-compatibility/2006" xmlns:m="http://schemas.openxmlformats.org/officeDocument/2006/math" xmlns:r="http://schemas.openxmlformats.org/officeDocument/2006/relationships" xmlns:sl="http://schemas.openxmlformats.org/schemaLibrary/2006/main" xmlns:o="urn:schemas-microsoft-com:office:office" xmlns:v="urn:schemas-microsoft-com:vml" xmlns:w10="urn:schemas-microsoft-com:office:word" xmlns:w="http://schemas.openxmlformats.org/wordprocessingml/2006/main" xmlns:w14="http://schemas.microsoft.com/office/word/2010/wordml" xmlns:w15="http://schemas.microsoft.com/office/word/2012/wordml" xmlns:w16cex="http://schemas.microsoft.com/office/word/2018/wordml/cex" xmlns:w16cid="http://schemas.microsoft.com/office/word/2016/wordml/cid" xmlns:w16="http://schemas.microsoft.com/office/word/2018/wordml" xmlns:w16sdtdh="http://schemas.microsoft.com/office/word/2020/wordml/sdtdatahash" xmlns:w16sdtfl="http://schemas.microsoft.com/office/word/2024/wordml/sdtformatlock" xmlns:w16se="http://schemas.microsoft.com/office/word/2015/wordml/symex" xmlns:w16du="http://schemas.microsoft.com/office/word/2023/wordml/word16du" mc:Ignorable="w14 w15 w16se w16cid w16 w16cex w16sdtdh w16sdtfl w16du">
   <w:view w:val="normal"/>
   <w:defaultTabStop w:val="720"/>
   <w:characterSpacingControl w:val="doNotCompress"/>
@@ -10638,6 +12667,7 @@
     <w:rsid w:val="008A4AE7"/>
     <w:rsid w:val="00900C2A"/>
     <w:rsid w:val="00902777"/>
+    <w:rsid w:val="0091667D"/>
     <w:rsid w:val="00977680"/>
     <w:rsid w:val="009955B4"/>
     <w:rsid w:val="009A2761"/>
@@ -10683,14 +12713,14 @@
   </m:mathPr>
   <w:themeFontLang w:val="en-GB" w:eastAsia="ja-JP" w:bidi="ar-SA"/>
   <w:clrSchemeMapping w:bg1="light1" w:t1="dark1" w:bg2="light2" w:t2="dark2" w:accent1="accent1" w:accent2="accent2" w:accent3="accent3" w:accent4="accent4" w:accent5="accent5" w:accent6="accent6" w:hyperlink="hyperlink" w:followedHyperlink="followedHyperlink"/>
-  <w:decimalSymbol w:val="."/>
-  <w:listSeparator w:val=","/>
+  <w:decimalSymbol w:val="٫"/>
+  <w:listSeparator w:val=";"/>
   <w15:chartTrackingRefBased/>
 </w:settings>
 </file>
 
 <file path=word/glossary/styles.xml><?xml version="1.0" encoding="utf-8"?>
-<w:styles xmlns:mc="http://schemas.openxmlformats.org/markup-compatibility/2006" xmlns:r="http://schemas.openxmlformats.org/officeDocument/2006/relationships" xmlns:w="http://schemas.openxmlformats.org/wordprocessingml/2006/main" xmlns:w14="http://schemas.microsoft.com/office/word/2010/wordml" xmlns:w15="http://schemas.microsoft.com/office/word/2012/wordml" xmlns:w16cex="http://schemas.microsoft.com/office/word/2018/wordml/cex" xmlns:w16cid="http://schemas.microsoft.com/office/word/2016/wordml/cid" xmlns:w16="http://schemas.microsoft.com/office/word/2018/wordml" xmlns:w16du="http://schemas.microsoft.com/office/word/2023/wordml/word16du" xmlns:w16sdtdh="http://schemas.microsoft.com/office/word/2020/wordml/sdtdatahash" xmlns:w16sdtfl="http://schemas.microsoft.com/office/word/2024/wordml/sdtformatlock" xmlns:w16se="http://schemas.microsoft.com/office/word/2015/wordml/symex" mc:Ignorable="w14 w15 w16se w16cid w16 w16cex w16sdtdh w16sdtfl w16du">
+<w:styles xmlns:mc="http://schemas.openxmlformats.org/markup-compatibility/2006" xmlns:r="http://schemas.openxmlformats.org/officeDocument/2006/relationships" xmlns:w="http://schemas.openxmlformats.org/wordprocessingml/2006/main" xmlns:w14="http://schemas.microsoft.com/office/word/2010/wordml" xmlns:w15="http://schemas.microsoft.com/office/word/2012/wordml" xmlns:w16cex="http://schemas.microsoft.com/office/word/2018/wordml/cex" xmlns:w16cid="http://schemas.microsoft.com/office/word/2016/wordml/cid" xmlns:w16="http://schemas.microsoft.com/office/word/2018/wordml" xmlns:w16sdtdh="http://schemas.microsoft.com/office/word/2020/wordml/sdtdatahash" xmlns:w16sdtfl="http://schemas.microsoft.com/office/word/2024/wordml/sdtformatlock" xmlns:w16se="http://schemas.microsoft.com/office/word/2015/wordml/symex" xmlns:w16du="http://schemas.microsoft.com/office/word/2023/wordml/word16du" mc:Ignorable="w14 w15 w16se w16cid w16 w16cex w16sdtdh w16sdtfl w16du">
   <w:docDefaults>
     <w:rPrDefault>
       <w:rPr>
@@ -11157,7 +13187,7 @@
 </file>
 
 <file path=word/glossary/webSettings.xml><?xml version="1.0" encoding="utf-8"?>
-<w:webSettings xmlns:mc="http://schemas.openxmlformats.org/markup-compatibility/2006" xmlns:r="http://schemas.openxmlformats.org/officeDocument/2006/relationships" xmlns:w="http://schemas.openxmlformats.org/wordprocessingml/2006/main" xmlns:w14="http://schemas.microsoft.com/office/word/2010/wordml" xmlns:w15="http://schemas.microsoft.com/office/word/2012/wordml" xmlns:w16cex="http://schemas.microsoft.com/office/word/2018/wordml/cex" xmlns:w16cid="http://schemas.microsoft.com/office/word/2016/wordml/cid" xmlns:w16="http://schemas.microsoft.com/office/word/2018/wordml" xmlns:w16du="http://schemas.microsoft.com/office/word/2023/wordml/word16du" xmlns:w16sdtdh="http://schemas.microsoft.com/office/word/2020/wordml/sdtdatahash" xmlns:w16sdtfl="http://schemas.microsoft.com/office/word/2024/wordml/sdtformatlock" xmlns:w16se="http://schemas.microsoft.com/office/word/2015/wordml/symex" mc:Ignorable="w14 w15 w16se w16cid w16 w16cex w16sdtdh w16sdtfl w16du">
+<w:webSettings xmlns:mc="http://schemas.openxmlformats.org/markup-compatibility/2006" xmlns:r="http://schemas.openxmlformats.org/officeDocument/2006/relationships" xmlns:w="http://schemas.openxmlformats.org/wordprocessingml/2006/main" xmlns:w14="http://schemas.microsoft.com/office/word/2010/wordml" xmlns:w15="http://schemas.microsoft.com/office/word/2012/wordml" xmlns:w16cex="http://schemas.microsoft.com/office/word/2018/wordml/cex" xmlns:w16cid="http://schemas.microsoft.com/office/word/2016/wordml/cid" xmlns:w16="http://schemas.microsoft.com/office/word/2018/wordml" xmlns:w16sdtdh="http://schemas.microsoft.com/office/word/2020/wordml/sdtdatahash" xmlns:w16sdtfl="http://schemas.microsoft.com/office/word/2024/wordml/sdtformatlock" xmlns:w16se="http://schemas.microsoft.com/office/word/2015/wordml/symex" xmlns:w16du="http://schemas.microsoft.com/office/word/2023/wordml/word16du" mc:Ignorable="w14 w15 w16se w16cid w16 w16cex w16sdtdh w16sdtfl w16du">
   <w:optimizeForBrowser/>
   <w:allowPNG/>
 </w:webSettings>
@@ -11491,16 +13521,16 @@
 </file>
 
 <file path=customXml/item2.xml><?xml version="1.0" encoding="utf-8"?>
+<b:Sources xmlns:b="http://schemas.openxmlformats.org/officeDocument/2006/bibliography" SelectedStyle="\APA.XSL" StyleName="APA"/>
+</file>
+
+<file path=customXml/item3.xml><?xml version="1.0" encoding="utf-8"?>
 <?mso-contentType ?>
 <FormTemplates xmlns="http://schemas.microsoft.com/sharepoint/v3/contenttype/forms">
   <Display>DocumentLibraryForm</Display>
   <Edit>AssetEditForm</Edit>
   <New>DocumentLibraryForm</New>
 </FormTemplates>
-</file>
-
-<file path=customXml/item3.xml><?xml version="1.0" encoding="utf-8"?>
-<b:Sources xmlns:b="http://schemas.openxmlformats.org/officeDocument/2006/bibliography" SelectedStyle="\APA.XSL" StyleName="APA"/>
 </file>
 
 <file path=customXml/itemProps1.xml><?xml version="1.0" encoding="utf-8"?>
@@ -11512,17 +13542,18 @@
 </file>
 
 <file path=customXml/itemProps2.xml><?xml version="1.0" encoding="utf-8"?>
+<ds:datastoreItem xmlns:ds="http://schemas.openxmlformats.org/officeDocument/2006/customXml" ds:itemID="{355C5113-D031-41DB-A6D8-43CE1A0E6695}">
+  <ds:schemaRefs>
+    <ds:schemaRef ds:uri="http://schemas.openxmlformats.org/officeDocument/2006/bibliography"/>
+    <ds:schemaRef ds:uri="http://www.w3.org/2000/xmlns/"/>
+  </ds:schemaRefs>
+</ds:datastoreItem>
+</file>
+
+<file path=customXml/itemProps3.xml><?xml version="1.0" encoding="utf-8"?>
 <ds:datastoreItem xmlns:ds="http://schemas.openxmlformats.org/officeDocument/2006/customXml" ds:itemID="{E34C63B7-A026-4A37-9535-4FBB4C03A11D}">
   <ds:schemaRefs>
     <ds:schemaRef ds:uri="http://schemas.microsoft.com/sharepoint/v3/contenttype/forms"/>
   </ds:schemaRefs>
 </ds:datastoreItem>
-</file>
-
-<file path=customXml/itemProps3.xml><?xml version="1.0" encoding="utf-8"?>
-<ds:datastoreItem xmlns:ds="http://schemas.openxmlformats.org/officeDocument/2006/customXml" ds:itemID="{355C5113-D031-41DB-A6D8-43CE1A0E6695}">
-  <ds:schemaRefs>
-    <ds:schemaRef ds:uri="http://schemas.openxmlformats.org/officeDocument/2006/bibliography"/>
-  </ds:schemaRefs>
-</ds:datastoreItem>
 </file>
</xml_diff>